<commit_message>
Added Introduction and Problem Definition
Described the business context and defined the core problem of unpredictable resolution times.
</commit_message>
<xml_diff>
--- a/New Microsoft Word Document.docx
+++ b/New Microsoft Word Document.docx
@@ -90,7 +90,6 @@
           <w:bCs/>
           <w:sz w:val="28"/>
           <w:szCs w:val="28"/>
-          <w:lang w:val="ru-RU"/>
         </w:rPr>
       </w:pPr>
       <w:r>
@@ -104,26 +103,15 @@
       </w:r>
     </w:p>
     <w:p>
-      <w:pPr>
-        <w:rPr>
-          <w:lang w:val="ru-RU"/>
-        </w:rPr>
-      </w:pPr>
       <w:r>
         <w:t>The main business problem is that the IT service desk cannot accurately estimate the total time required to resolve a support ticket. This lack of predictability has a negative business impact. It leads to Service Level Agreement (SLA) breaches and poor resource allocation. It also causes lower customer satisfaction. Data analytics and predictive modelling can solve this problem. A regression model can analyse historical ticket data to find meaningful patterns. The model will predict the exact resolution time for new tickets. This will allow the organisation to allocate staff better and manage customer expectations.</w:t>
       </w:r>
     </w:p>
+    <w:p/>
     <w:p>
       <w:pPr>
         <w:rPr>
-          <w:lang w:val="ru-RU"/>
-        </w:rPr>
-      </w:pPr>
-    </w:p>
-    <w:p>
-      <w:pPr>
-        <w:rPr>
-          <w:lang w:val="ru-RU"/>
+          <w:lang w:val="en-GB"/>
         </w:rPr>
       </w:pPr>
     </w:p>

</xml_diff>

<commit_message>
Added Aim, Objectives, and Scope
Defined 5 clear project objectives and specified project inclusions and exclusions
</commit_message>
<xml_diff>
--- a/New Microsoft Word Document.docx
+++ b/New Microsoft Word Document.docx
@@ -111,6 +111,153 @@
     <w:p>
       <w:pPr>
         <w:rPr>
+          <w:b/>
+          <w:bCs/>
+          <w:sz w:val="28"/>
+          <w:szCs w:val="28"/>
+        </w:rPr>
+      </w:pPr>
+      <w:r>
+        <w:rPr>
+          <w:b/>
+          <w:bCs/>
+          <w:sz w:val="28"/>
+          <w:szCs w:val="28"/>
+        </w:rPr>
+        <w:t>Aim and Objectives</w:t>
+      </w:r>
+    </w:p>
+    <w:p>
+      <w:r>
+        <w:t>The overall aim of this project is to build a predictive model to estimate the total resolution time for IT incidents.</w:t>
+      </w:r>
+    </w:p>
+    <w:p>
+      <w:r>
+        <w:t>The project has the following objectives:</w:t>
+      </w:r>
+    </w:p>
+    <w:p>
+      <w:pPr>
+        <w:numPr>
+          <w:ilvl w:val="0"/>
+          <w:numId w:val="1"/>
+        </w:numPr>
+      </w:pPr>
+      <w:r>
+        <w:t>To perform Exploratory Data Analysis (EDA) to understand the historical ticket data.</w:t>
+      </w:r>
+    </w:p>
+    <w:p>
+      <w:pPr>
+        <w:numPr>
+          <w:ilvl w:val="0"/>
+          <w:numId w:val="1"/>
+        </w:numPr>
+      </w:pPr>
+      <w:r>
+        <w:lastRenderedPageBreak/>
+        <w:t>To prepare the data by cleaning missing values and formatting features.</w:t>
+      </w:r>
+    </w:p>
+    <w:p>
+      <w:pPr>
+        <w:numPr>
+          <w:ilvl w:val="0"/>
+          <w:numId w:val="1"/>
+        </w:numPr>
+      </w:pPr>
+      <w:r>
+        <w:t>To train a simple supervised machine learning model, such as Linear Regression.</w:t>
+      </w:r>
+    </w:p>
+    <w:p>
+      <w:pPr>
+        <w:numPr>
+          <w:ilvl w:val="0"/>
+          <w:numId w:val="1"/>
+        </w:numPr>
+      </w:pPr>
+      <w:r>
+        <w:t>To train a complex ensemble model, such as a Random Forest Regressor.</w:t>
+      </w:r>
+    </w:p>
+    <w:p>
+      <w:pPr>
+        <w:numPr>
+          <w:ilvl w:val="0"/>
+          <w:numId w:val="1"/>
+        </w:numPr>
+      </w:pPr>
+      <w:r>
+        <w:t>To evaluate and compare the performance of the models to find the best predictor.</w:t>
+      </w:r>
+    </w:p>
+    <w:p/>
+    <w:p>
+      <w:pPr>
+        <w:rPr>
+          <w:b/>
+          <w:bCs/>
+          <w:sz w:val="28"/>
+          <w:szCs w:val="28"/>
+        </w:rPr>
+      </w:pPr>
+      <w:r>
+        <w:rPr>
+          <w:b/>
+          <w:bCs/>
+          <w:sz w:val="28"/>
+          <w:szCs w:val="28"/>
+        </w:rPr>
+        <w:t>Scope</w:t>
+      </w:r>
+    </w:p>
+    <w:p>
+      <w:r>
+        <w:t>The project scope is clearly defined to ensure it can be completed in two semesters.</w:t>
+      </w:r>
+    </w:p>
+    <w:p>
+      <w:pPr>
+        <w:numPr>
+          <w:ilvl w:val="0"/>
+          <w:numId w:val="2"/>
+        </w:numPr>
+      </w:pPr>
+      <w:r>
+        <w:rPr>
+          <w:b/>
+          <w:bCs/>
+        </w:rPr>
+        <w:t>Included:</w:t>
+      </w:r>
+      <w:r>
+        <w:t xml:space="preserve"> The project will include the analysis of historical, structured data (such as issue type and priority). It will focus only on predicting the target variable, which is the total workflow time (wf_total_time).</w:t>
+      </w:r>
+    </w:p>
+    <w:p>
+      <w:pPr>
+        <w:numPr>
+          <w:ilvl w:val="0"/>
+          <w:numId w:val="2"/>
+        </w:numPr>
+      </w:pPr>
+      <w:r>
+        <w:rPr>
+          <w:b/>
+          <w:bCs/>
+        </w:rPr>
+        <w:t>Excluded:</w:t>
+      </w:r>
+      <w:r>
+        <w:t xml:space="preserve"> The project will exclude the analysis of unstructured text data, such as user comments. It will also exclude the live deployment of the model into a production environment.</w:t>
+      </w:r>
+    </w:p>
+    <w:p/>
+    <w:p>
+      <w:pPr>
+        <w:rPr>
           <w:lang w:val="en-GB"/>
         </w:rPr>
       </w:pPr>
@@ -123,6 +270,315 @@
     </w:sectPr>
   </w:body>
 </w:document>
+</file>
+
+<file path=word/numbering.xml><?xml version="1.0" encoding="utf-8"?>
+<w:numbering xmlns:wpc="http://schemas.microsoft.com/office/word/2010/wordprocessingCanvas" xmlns:cx="http://schemas.microsoft.com/office/drawing/2014/chartex" xmlns:cx1="http://schemas.microsoft.com/office/drawing/2015/9/8/chartex" xmlns:cx2="http://schemas.microsoft.com/office/drawing/2015/10/21/chartex" xmlns:cx3="http://schemas.microsoft.com/office/drawing/2016/5/9/chartex" xmlns:cx4="http://schemas.microsoft.com/office/drawing/2016/5/10/chartex" xmlns:cx5="http://schemas.microsoft.com/office/drawing/2016/5/11/chartex" xmlns:cx6="http://schemas.microsoft.com/office/drawing/2016/5/12/chartex" xmlns:cx7="http://schemas.microsoft.com/office/drawing/2016/5/13/chartex" xmlns:cx8="http://schemas.microsoft.com/office/drawing/2016/5/14/chartex" xmlns:mc="http://schemas.openxmlformats.org/markup-compatibility/2006" xmlns:aink="http://schemas.microsoft.com/office/drawing/2016/ink" xmlns:am3d="http://schemas.microsoft.com/office/drawing/2017/model3d" xmlns:o="urn:schemas-microsoft-com:office:office" xmlns:oel="http://schemas.microsoft.com/office/2019/extlst" xmlns:r="http://schemas.openxmlformats.org/officeDocument/2006/relationships" xmlns:m="http://schemas.openxmlformats.org/officeDocument/2006/math" xmlns:v="urn:schemas-microsoft-com:vml" xmlns:wp14="http://schemas.microsoft.com/office/word/2010/wordprocessingDrawing" xmlns:wp="http://schemas.openxmlformats.org/drawingml/2006/wordprocessingDrawing" xmlns:w10="urn:schemas-microsoft-com:office:word" xmlns:w="http://schemas.openxmlformats.org/wordprocessingml/2006/main" xmlns:w14="http://schemas.microsoft.com/office/word/2010/wordml" xmlns:w15="http://schemas.microsoft.com/office/word/2012/wordml" xmlns:w16cex="http://schemas.microsoft.com/office/word/2018/wordml/cex" xmlns:w16cid="http://schemas.microsoft.com/office/word/2016/wordml/cid" xmlns:w16="http://schemas.microsoft.com/office/word/2018/wordml" xmlns:w16du="http://schemas.microsoft.com/office/word/2023/wordml/word16du" xmlns:w16sdtdh="http://schemas.microsoft.com/office/word/2020/wordml/sdtdatahash" xmlns:w16sdtfl="http://schemas.microsoft.com/office/word/2024/wordml/sdtformatlock" xmlns:w16se="http://schemas.microsoft.com/office/word/2015/wordml/symex" xmlns:wpg="http://schemas.microsoft.com/office/word/2010/wordprocessingGroup" xmlns:wpi="http://schemas.microsoft.com/office/word/2010/wordprocessingInk" xmlns:wne="http://schemas.microsoft.com/office/word/2006/wordml" xmlns:wps="http://schemas.microsoft.com/office/word/2010/wordprocessingShape" mc:Ignorable="w14 w15 w16se w16cid w16 w16cex w16sdtdh w16sdtfl w16du wp14">
+  <w:abstractNum w:abstractNumId="0" w15:restartNumberingAfterBreak="0">
+    <w:nsid w:val="09535846"/>
+    <w:multiLevelType w:val="multilevel"/>
+    <w:tmpl w:val="74F4163E"/>
+    <w:lvl w:ilvl="0">
+      <w:start w:val="1"/>
+      <w:numFmt w:val="bullet"/>
+      <w:lvlText w:val=""/>
+      <w:lvlJc w:val="left"/>
+      <w:pPr>
+        <w:tabs>
+          <w:tab w:val="num" w:pos="720"/>
+        </w:tabs>
+        <w:ind w:left="720" w:hanging="360"/>
+      </w:pPr>
+      <w:rPr>
+        <w:rFonts w:ascii="Symbol" w:hAnsi="Symbol" w:hint="default"/>
+        <w:sz w:val="20"/>
+      </w:rPr>
+    </w:lvl>
+    <w:lvl w:ilvl="1" w:tentative="1">
+      <w:start w:val="1"/>
+      <w:numFmt w:val="bullet"/>
+      <w:lvlText w:val="o"/>
+      <w:lvlJc w:val="left"/>
+      <w:pPr>
+        <w:tabs>
+          <w:tab w:val="num" w:pos="1440"/>
+        </w:tabs>
+        <w:ind w:left="1440" w:hanging="360"/>
+      </w:pPr>
+      <w:rPr>
+        <w:rFonts w:ascii="Courier New" w:hAnsi="Courier New" w:hint="default"/>
+        <w:sz w:val="20"/>
+      </w:rPr>
+    </w:lvl>
+    <w:lvl w:ilvl="2" w:tentative="1">
+      <w:start w:val="1"/>
+      <w:numFmt w:val="bullet"/>
+      <w:lvlText w:val=""/>
+      <w:lvlJc w:val="left"/>
+      <w:pPr>
+        <w:tabs>
+          <w:tab w:val="num" w:pos="2160"/>
+        </w:tabs>
+        <w:ind w:left="2160" w:hanging="360"/>
+      </w:pPr>
+      <w:rPr>
+        <w:rFonts w:ascii="Wingdings" w:hAnsi="Wingdings" w:hint="default"/>
+        <w:sz w:val="20"/>
+      </w:rPr>
+    </w:lvl>
+    <w:lvl w:ilvl="3" w:tentative="1">
+      <w:start w:val="1"/>
+      <w:numFmt w:val="bullet"/>
+      <w:lvlText w:val=""/>
+      <w:lvlJc w:val="left"/>
+      <w:pPr>
+        <w:tabs>
+          <w:tab w:val="num" w:pos="2880"/>
+        </w:tabs>
+        <w:ind w:left="2880" w:hanging="360"/>
+      </w:pPr>
+      <w:rPr>
+        <w:rFonts w:ascii="Wingdings" w:hAnsi="Wingdings" w:hint="default"/>
+        <w:sz w:val="20"/>
+      </w:rPr>
+    </w:lvl>
+    <w:lvl w:ilvl="4" w:tentative="1">
+      <w:start w:val="1"/>
+      <w:numFmt w:val="bullet"/>
+      <w:lvlText w:val=""/>
+      <w:lvlJc w:val="left"/>
+      <w:pPr>
+        <w:tabs>
+          <w:tab w:val="num" w:pos="3600"/>
+        </w:tabs>
+        <w:ind w:left="3600" w:hanging="360"/>
+      </w:pPr>
+      <w:rPr>
+        <w:rFonts w:ascii="Wingdings" w:hAnsi="Wingdings" w:hint="default"/>
+        <w:sz w:val="20"/>
+      </w:rPr>
+    </w:lvl>
+    <w:lvl w:ilvl="5" w:tentative="1">
+      <w:start w:val="1"/>
+      <w:numFmt w:val="bullet"/>
+      <w:lvlText w:val=""/>
+      <w:lvlJc w:val="left"/>
+      <w:pPr>
+        <w:tabs>
+          <w:tab w:val="num" w:pos="4320"/>
+        </w:tabs>
+        <w:ind w:left="4320" w:hanging="360"/>
+      </w:pPr>
+      <w:rPr>
+        <w:rFonts w:ascii="Wingdings" w:hAnsi="Wingdings" w:hint="default"/>
+        <w:sz w:val="20"/>
+      </w:rPr>
+    </w:lvl>
+    <w:lvl w:ilvl="6" w:tentative="1">
+      <w:start w:val="1"/>
+      <w:numFmt w:val="bullet"/>
+      <w:lvlText w:val=""/>
+      <w:lvlJc w:val="left"/>
+      <w:pPr>
+        <w:tabs>
+          <w:tab w:val="num" w:pos="5040"/>
+        </w:tabs>
+        <w:ind w:left="5040" w:hanging="360"/>
+      </w:pPr>
+      <w:rPr>
+        <w:rFonts w:ascii="Wingdings" w:hAnsi="Wingdings" w:hint="default"/>
+        <w:sz w:val="20"/>
+      </w:rPr>
+    </w:lvl>
+    <w:lvl w:ilvl="7" w:tentative="1">
+      <w:start w:val="1"/>
+      <w:numFmt w:val="bullet"/>
+      <w:lvlText w:val=""/>
+      <w:lvlJc w:val="left"/>
+      <w:pPr>
+        <w:tabs>
+          <w:tab w:val="num" w:pos="5760"/>
+        </w:tabs>
+        <w:ind w:left="5760" w:hanging="360"/>
+      </w:pPr>
+      <w:rPr>
+        <w:rFonts w:ascii="Wingdings" w:hAnsi="Wingdings" w:hint="default"/>
+        <w:sz w:val="20"/>
+      </w:rPr>
+    </w:lvl>
+    <w:lvl w:ilvl="8" w:tentative="1">
+      <w:start w:val="1"/>
+      <w:numFmt w:val="bullet"/>
+      <w:lvlText w:val=""/>
+      <w:lvlJc w:val="left"/>
+      <w:pPr>
+        <w:tabs>
+          <w:tab w:val="num" w:pos="6480"/>
+        </w:tabs>
+        <w:ind w:left="6480" w:hanging="360"/>
+      </w:pPr>
+      <w:rPr>
+        <w:rFonts w:ascii="Wingdings" w:hAnsi="Wingdings" w:hint="default"/>
+        <w:sz w:val="20"/>
+      </w:rPr>
+    </w:lvl>
+  </w:abstractNum>
+  <w:abstractNum w:abstractNumId="1" w15:restartNumberingAfterBreak="0">
+    <w:nsid w:val="29A9691F"/>
+    <w:multiLevelType w:val="multilevel"/>
+    <w:tmpl w:val="2CBED9BC"/>
+    <w:lvl w:ilvl="0">
+      <w:start w:val="1"/>
+      <w:numFmt w:val="bullet"/>
+      <w:lvlText w:val=""/>
+      <w:lvlJc w:val="left"/>
+      <w:pPr>
+        <w:tabs>
+          <w:tab w:val="num" w:pos="720"/>
+        </w:tabs>
+        <w:ind w:left="720" w:hanging="360"/>
+      </w:pPr>
+      <w:rPr>
+        <w:rFonts w:ascii="Symbol" w:hAnsi="Symbol" w:hint="default"/>
+        <w:sz w:val="20"/>
+      </w:rPr>
+    </w:lvl>
+    <w:lvl w:ilvl="1" w:tentative="1">
+      <w:start w:val="1"/>
+      <w:numFmt w:val="bullet"/>
+      <w:lvlText w:val="o"/>
+      <w:lvlJc w:val="left"/>
+      <w:pPr>
+        <w:tabs>
+          <w:tab w:val="num" w:pos="1440"/>
+        </w:tabs>
+        <w:ind w:left="1440" w:hanging="360"/>
+      </w:pPr>
+      <w:rPr>
+        <w:rFonts w:ascii="Courier New" w:hAnsi="Courier New" w:hint="default"/>
+        <w:sz w:val="20"/>
+      </w:rPr>
+    </w:lvl>
+    <w:lvl w:ilvl="2" w:tentative="1">
+      <w:start w:val="1"/>
+      <w:numFmt w:val="bullet"/>
+      <w:lvlText w:val=""/>
+      <w:lvlJc w:val="left"/>
+      <w:pPr>
+        <w:tabs>
+          <w:tab w:val="num" w:pos="2160"/>
+        </w:tabs>
+        <w:ind w:left="2160" w:hanging="360"/>
+      </w:pPr>
+      <w:rPr>
+        <w:rFonts w:ascii="Wingdings" w:hAnsi="Wingdings" w:hint="default"/>
+        <w:sz w:val="20"/>
+      </w:rPr>
+    </w:lvl>
+    <w:lvl w:ilvl="3" w:tentative="1">
+      <w:start w:val="1"/>
+      <w:numFmt w:val="bullet"/>
+      <w:lvlText w:val=""/>
+      <w:lvlJc w:val="left"/>
+      <w:pPr>
+        <w:tabs>
+          <w:tab w:val="num" w:pos="2880"/>
+        </w:tabs>
+        <w:ind w:left="2880" w:hanging="360"/>
+      </w:pPr>
+      <w:rPr>
+        <w:rFonts w:ascii="Wingdings" w:hAnsi="Wingdings" w:hint="default"/>
+        <w:sz w:val="20"/>
+      </w:rPr>
+    </w:lvl>
+    <w:lvl w:ilvl="4" w:tentative="1">
+      <w:start w:val="1"/>
+      <w:numFmt w:val="bullet"/>
+      <w:lvlText w:val=""/>
+      <w:lvlJc w:val="left"/>
+      <w:pPr>
+        <w:tabs>
+          <w:tab w:val="num" w:pos="3600"/>
+        </w:tabs>
+        <w:ind w:left="3600" w:hanging="360"/>
+      </w:pPr>
+      <w:rPr>
+        <w:rFonts w:ascii="Wingdings" w:hAnsi="Wingdings" w:hint="default"/>
+        <w:sz w:val="20"/>
+      </w:rPr>
+    </w:lvl>
+    <w:lvl w:ilvl="5" w:tentative="1">
+      <w:start w:val="1"/>
+      <w:numFmt w:val="bullet"/>
+      <w:lvlText w:val=""/>
+      <w:lvlJc w:val="left"/>
+      <w:pPr>
+        <w:tabs>
+          <w:tab w:val="num" w:pos="4320"/>
+        </w:tabs>
+        <w:ind w:left="4320" w:hanging="360"/>
+      </w:pPr>
+      <w:rPr>
+        <w:rFonts w:ascii="Wingdings" w:hAnsi="Wingdings" w:hint="default"/>
+        <w:sz w:val="20"/>
+      </w:rPr>
+    </w:lvl>
+    <w:lvl w:ilvl="6" w:tentative="1">
+      <w:start w:val="1"/>
+      <w:numFmt w:val="bullet"/>
+      <w:lvlText w:val=""/>
+      <w:lvlJc w:val="left"/>
+      <w:pPr>
+        <w:tabs>
+          <w:tab w:val="num" w:pos="5040"/>
+        </w:tabs>
+        <w:ind w:left="5040" w:hanging="360"/>
+      </w:pPr>
+      <w:rPr>
+        <w:rFonts w:ascii="Wingdings" w:hAnsi="Wingdings" w:hint="default"/>
+        <w:sz w:val="20"/>
+      </w:rPr>
+    </w:lvl>
+    <w:lvl w:ilvl="7" w:tentative="1">
+      <w:start w:val="1"/>
+      <w:numFmt w:val="bullet"/>
+      <w:lvlText w:val=""/>
+      <w:lvlJc w:val="left"/>
+      <w:pPr>
+        <w:tabs>
+          <w:tab w:val="num" w:pos="5760"/>
+        </w:tabs>
+        <w:ind w:left="5760" w:hanging="360"/>
+      </w:pPr>
+      <w:rPr>
+        <w:rFonts w:ascii="Wingdings" w:hAnsi="Wingdings" w:hint="default"/>
+        <w:sz w:val="20"/>
+      </w:rPr>
+    </w:lvl>
+    <w:lvl w:ilvl="8" w:tentative="1">
+      <w:start w:val="1"/>
+      <w:numFmt w:val="bullet"/>
+      <w:lvlText w:val=""/>
+      <w:lvlJc w:val="left"/>
+      <w:pPr>
+        <w:tabs>
+          <w:tab w:val="num" w:pos="6480"/>
+        </w:tabs>
+        <w:ind w:left="6480" w:hanging="360"/>
+      </w:pPr>
+      <w:rPr>
+        <w:rFonts w:ascii="Wingdings" w:hAnsi="Wingdings" w:hint="default"/>
+        <w:sz w:val="20"/>
+      </w:rPr>
+    </w:lvl>
+  </w:abstractNum>
+  <w:num w:numId="1" w16cid:durableId="1213882121">
+    <w:abstractNumId w:val="1"/>
+  </w:num>
+  <w:num w:numId="2" w16cid:durableId="1598636461">
+    <w:abstractNumId w:val="0"/>
+  </w:num>
+</w:numbering>
 </file>
 
 <file path=word/styles.xml><?xml version="1.0" encoding="utf-8"?>

</xml_diff>

<commit_message>
Expanded Intro and Problem Definition with citations
</commit_message>
<xml_diff>
--- a/New Microsoft Word Document.docx
+++ b/New Microsoft Word Document.docx
@@ -23,16 +23,10 @@
     </w:p>
     <w:p>
       <w:r>
-        <w:t>This project proposes a supervised machine learning solution to predict IT support ticket resolution times. The core business problem is unpredictable incident durations. The project will apply regression models to historical workplace data. The goal is to improve resource allocation and Service Level Agreement (SLA) compliance.</w:t>
-      </w:r>
-    </w:p>
-    <w:p>
-      <w:pPr>
-        <w:rPr>
-          <w:lang w:val="ru-RU"/>
-        </w:rPr>
-      </w:pPr>
-    </w:p>
+        <w:t>This project proposes a machine learning solution to predict the resolution time for IT support tickets. Currently, the service desk cannot accurately estimate how long new incidents will take. The project will apply regression models to historical ticket data to improve resource planning and Service Level Agreement compliance.</w:t>
+      </w:r>
+    </w:p>
+    <w:p/>
     <w:p>
       <w:pPr>
         <w:jc w:val="center"/>
@@ -41,7 +35,6 @@
           <w:bCs/>
           <w:sz w:val="32"/>
           <w:szCs w:val="32"/>
-          <w:lang w:val="ru-RU"/>
         </w:rPr>
       </w:pPr>
       <w:r>
@@ -51,7 +44,7 @@
           <w:sz w:val="32"/>
           <w:szCs w:val="32"/>
         </w:rPr>
-        <w:t>Predicting IT Support Ticket Resolution Time Using Supervised Machine Learning Regressors</w:t>
+        <w:t>Predicting IT Support Ticket Resolution Time Using Supervised Machine Learning Regression Models</w:t>
       </w:r>
     </w:p>
     <w:p>
@@ -62,27 +55,44 @@
           <w:bCs/>
           <w:sz w:val="32"/>
           <w:szCs w:val="32"/>
-          <w:lang w:val="ru-RU"/>
         </w:rPr>
       </w:pPr>
     </w:p>
     <w:p>
       <w:pPr>
         <w:rPr>
-          <w:lang w:val="ru-RU"/>
+          <w:b/>
+          <w:bCs/>
+          <w:sz w:val="28"/>
+          <w:szCs w:val="28"/>
         </w:rPr>
       </w:pPr>
       <w:r>
-        <w:t>IT support departments manage many technical incidents every day. Companies need to resolve these incidents fast to keep business operations running. However, predicting the exact time to resolve a ticket is very difficult. This uncertainty creates problems for IT managers. Artificial intelligence and machine learning can help predict these times and prevent service delays. This project will use data analytics to build a predictive model. The model will forecast resolution times to help the IT support team work more efficiently.</w:t>
-      </w:r>
-    </w:p>
-    <w:p>
-      <w:pPr>
         <w:rPr>
-          <w:lang w:val="ru-RU"/>
+          <w:b/>
+          <w:bCs/>
+          <w:sz w:val="28"/>
+          <w:szCs w:val="28"/>
         </w:rPr>
-      </w:pPr>
-    </w:p>
+        <w:t>Introduction</w:t>
+      </w:r>
+    </w:p>
+    <w:p>
+      <w:r>
+        <w:t>Information Technology (IT) support departments are very important for modern companies. Every day, employees send many requests to the IT service desk. These requests are called tickets or incidents. Users report problems like broken software, system errors, or network issues. Companies must fix these problems fast to keep business running. When IT systems stop working, employees cannot do their jobs, which wastes time and money.</w:t>
+      </w:r>
+    </w:p>
+    <w:p>
+      <w:r>
+        <w:t xml:space="preserve">In many IT departments, the main goal is to improve service quality and reduce waiting time. However, a big problem is that managers do not know how long a new ticket will take to fix. Some simple tickets take ten minutes, while complex tickets take several days. </w:t>
+      </w:r>
+    </w:p>
+    <w:p>
+      <w:r>
+        <w:t>Industry reports show that Artificial Intelligence (AI) and predictive analytics give companies a strong competitive advantage in IT support (ServiceNow, 2021). For example, ServiceNow used predictive intelligence in its support operations and reduced time to relief by 11.6%, saving $11.5 million (ServiceNow, 2021). Therefore, studying ticket resolution time is very useful. This capstone project will use data analytics and supervised machine learning to predict the total resolution time of IT tickets.</w:t>
+      </w:r>
+    </w:p>
+    <w:p/>
     <w:p>
       <w:pPr>
         <w:rPr>
@@ -104,7 +114,81 @@
     </w:p>
     <w:p>
       <w:r>
-        <w:t>The main business problem is that the IT service desk cannot accurately estimate the total time required to resolve a support ticket. This lack of predictability has a negative business impact. It leads to Service Level Agreement (SLA) breaches and poor resource allocation. It also causes lower customer satisfaction. Data analytics and predictive modelling can solve this problem. A regression model can analyse historical ticket data to find meaningful patterns. The model will predict the exact resolution time for new tickets. This will allow the organisation to allocate staff better and manage customer expectations.</w:t>
+        <w:t xml:space="preserve">The core business problem is that IT service desks cannot accurately estimate the total time needed to resolve a support ticket when it opens. Currently, support teams use manual guesses or simple priority labels. This is often wrong because ticket duration depends on many factors, such as the project area, contributor count, and issue category. </w:t>
+      </w:r>
+    </w:p>
+    <w:p>
+      <w:r>
+        <w:lastRenderedPageBreak/>
+        <w:t xml:space="preserve">This problem affects IT support engineers, managers, and users. It causes three main business problems: </w:t>
+      </w:r>
+    </w:p>
+    <w:p>
+      <w:pPr>
+        <w:numPr>
+          <w:ilvl w:val="0"/>
+          <w:numId w:val="3"/>
+        </w:numPr>
+      </w:pPr>
+      <w:r>
+        <w:rPr>
+          <w:b/>
+          <w:bCs/>
+        </w:rPr>
+        <w:t>Service Level Agreement (SLA) Breaches:</w:t>
+      </w:r>
+      <w:r>
+        <w:t xml:space="preserve"> SLA is a rule that sets the maximum time to fix an issue. If the team cannot predict long tickets early, they miss deadlines and face penalties.</w:t>
+      </w:r>
+    </w:p>
+    <w:p>
+      <w:pPr>
+        <w:numPr>
+          <w:ilvl w:val="0"/>
+          <w:numId w:val="3"/>
+        </w:numPr>
+      </w:pPr>
+      <w:r>
+        <w:rPr>
+          <w:b/>
+          <w:bCs/>
+        </w:rPr>
+        <w:t>Poor Resource Allocation:</w:t>
+      </w:r>
+      <w:r>
+        <w:t xml:space="preserve"> Managers cannot see the true workload. Some engineers get too many long tickets, while others have little work.</w:t>
+      </w:r>
+    </w:p>
+    <w:p>
+      <w:pPr>
+        <w:numPr>
+          <w:ilvl w:val="0"/>
+          <w:numId w:val="3"/>
+        </w:numPr>
+      </w:pPr>
+      <w:r>
+        <w:rPr>
+          <w:b/>
+          <w:bCs/>
+        </w:rPr>
+        <w:t>Low User Satisfaction:</w:t>
+      </w:r>
+      <w:r>
+        <w:t xml:space="preserve"> Users get frustrated when the IT desk cannot give a realistic time estimate.</w:t>
+      </w:r>
+    </w:p>
+    <w:p>
+      <w:r>
+        <w:t>Data analytics and predictive modelling can solve this problem</w:t>
+      </w:r>
+      <w:r>
+        <w:t xml:space="preserve"> </w:t>
+      </w:r>
+      <w:r>
+        <w:t>(Gerunov, 2022)</w:t>
+      </w:r>
+      <w:r>
+        <w:t xml:space="preserve">. By analysing historical records, a regression model can learn patterns between initial ticket features and final resolution time. When a new ticket arrives, the model will predict how long it will take, helping managers schedule staff and prevent SLA breaches. </w:t>
       </w:r>
     </w:p>
     <w:p/>
@@ -156,7 +240,6 @@
         </w:numPr>
       </w:pPr>
       <w:r>
-        <w:lastRenderedPageBreak/>
         <w:t>To prepare the data by cleaning missing values and formatting features.</w:t>
       </w:r>
     </w:p>
@@ -248,6 +331,7 @@
           <w:b/>
           <w:bCs/>
         </w:rPr>
+        <w:lastRenderedPageBreak/>
         <w:t>Excluded:</w:t>
       </w:r>
       <w:r>
@@ -602,11 +686,127 @@
       </w:rPr>
     </w:lvl>
   </w:abstractNum>
+  <w:abstractNum w:abstractNumId="2" w15:restartNumberingAfterBreak="0">
+    <w:nsid w:val="5B4232EC"/>
+    <w:multiLevelType w:val="multilevel"/>
+    <w:tmpl w:val="A6349EA4"/>
+    <w:lvl w:ilvl="0">
+      <w:start w:val="1"/>
+      <w:numFmt w:val="decimal"/>
+      <w:lvlText w:val="%1."/>
+      <w:lvlJc w:val="left"/>
+      <w:pPr>
+        <w:tabs>
+          <w:tab w:val="num" w:pos="720"/>
+        </w:tabs>
+        <w:ind w:left="720" w:hanging="360"/>
+      </w:pPr>
+    </w:lvl>
+    <w:lvl w:ilvl="1" w:tentative="1">
+      <w:start w:val="1"/>
+      <w:numFmt w:val="decimal"/>
+      <w:lvlText w:val="%2."/>
+      <w:lvlJc w:val="left"/>
+      <w:pPr>
+        <w:tabs>
+          <w:tab w:val="num" w:pos="1440"/>
+        </w:tabs>
+        <w:ind w:left="1440" w:hanging="360"/>
+      </w:pPr>
+    </w:lvl>
+    <w:lvl w:ilvl="2" w:tentative="1">
+      <w:start w:val="1"/>
+      <w:numFmt w:val="decimal"/>
+      <w:lvlText w:val="%3."/>
+      <w:lvlJc w:val="left"/>
+      <w:pPr>
+        <w:tabs>
+          <w:tab w:val="num" w:pos="2160"/>
+        </w:tabs>
+        <w:ind w:left="2160" w:hanging="360"/>
+      </w:pPr>
+    </w:lvl>
+    <w:lvl w:ilvl="3" w:tentative="1">
+      <w:start w:val="1"/>
+      <w:numFmt w:val="decimal"/>
+      <w:lvlText w:val="%4."/>
+      <w:lvlJc w:val="left"/>
+      <w:pPr>
+        <w:tabs>
+          <w:tab w:val="num" w:pos="2880"/>
+        </w:tabs>
+        <w:ind w:left="2880" w:hanging="360"/>
+      </w:pPr>
+    </w:lvl>
+    <w:lvl w:ilvl="4" w:tentative="1">
+      <w:start w:val="1"/>
+      <w:numFmt w:val="decimal"/>
+      <w:lvlText w:val="%5."/>
+      <w:lvlJc w:val="left"/>
+      <w:pPr>
+        <w:tabs>
+          <w:tab w:val="num" w:pos="3600"/>
+        </w:tabs>
+        <w:ind w:left="3600" w:hanging="360"/>
+      </w:pPr>
+    </w:lvl>
+    <w:lvl w:ilvl="5" w:tentative="1">
+      <w:start w:val="1"/>
+      <w:numFmt w:val="decimal"/>
+      <w:lvlText w:val="%6."/>
+      <w:lvlJc w:val="left"/>
+      <w:pPr>
+        <w:tabs>
+          <w:tab w:val="num" w:pos="4320"/>
+        </w:tabs>
+        <w:ind w:left="4320" w:hanging="360"/>
+      </w:pPr>
+    </w:lvl>
+    <w:lvl w:ilvl="6" w:tentative="1">
+      <w:start w:val="1"/>
+      <w:numFmt w:val="decimal"/>
+      <w:lvlText w:val="%7."/>
+      <w:lvlJc w:val="left"/>
+      <w:pPr>
+        <w:tabs>
+          <w:tab w:val="num" w:pos="5040"/>
+        </w:tabs>
+        <w:ind w:left="5040" w:hanging="360"/>
+      </w:pPr>
+    </w:lvl>
+    <w:lvl w:ilvl="7" w:tentative="1">
+      <w:start w:val="1"/>
+      <w:numFmt w:val="decimal"/>
+      <w:lvlText w:val="%8."/>
+      <w:lvlJc w:val="left"/>
+      <w:pPr>
+        <w:tabs>
+          <w:tab w:val="num" w:pos="5760"/>
+        </w:tabs>
+        <w:ind w:left="5760" w:hanging="360"/>
+      </w:pPr>
+    </w:lvl>
+    <w:lvl w:ilvl="8" w:tentative="1">
+      <w:start w:val="1"/>
+      <w:numFmt w:val="decimal"/>
+      <w:lvlText w:val="%9."/>
+      <w:lvlJc w:val="left"/>
+      <w:pPr>
+        <w:tabs>
+          <w:tab w:val="num" w:pos="6480"/>
+        </w:tabs>
+        <w:ind w:left="6480" w:hanging="360"/>
+      </w:pPr>
+    </w:lvl>
+  </w:abstractNum>
   <w:num w:numId="1" w16cid:durableId="1213882121">
     <w:abstractNumId w:val="1"/>
   </w:num>
   <w:num w:numId="2" w16cid:durableId="1598636461">
     <w:abstractNumId w:val="0"/>
+  </w:num>
+  <w:num w:numId="3" w16cid:durableId="872964064">
+    <w:abstractNumId w:val="2"/>
   </w:num>
 </w:numbering>
 </file>

</xml_diff>

<commit_message>
Added Research Hypothesis and refined Project Scope
</commit_message>
<xml_diff>
--- a/New Microsoft Word Document.docx
+++ b/New Microsoft Word Document.docx
@@ -212,68 +212,178 @@
       </w:r>
     </w:p>
     <w:p>
-      <w:r>
-        <w:t>The overall aim of this project is to build a predictive model to estimate the total resolution time for IT incidents.</w:t>
-      </w:r>
-    </w:p>
-    <w:p>
-      <w:r>
-        <w:t>The project has the following objectives:</w:t>
+      <w:pPr>
+        <w:rPr>
+          <w:lang w:val="ru-RU"/>
+        </w:rPr>
+      </w:pPr>
+      <w:r>
+        <w:rPr>
+          <w:b/>
+          <w:bCs/>
+        </w:rPr>
+        <w:t>Project Aim:</w:t>
+      </w:r>
+      <w:r>
+        <w:t xml:space="preserve"> </w:t>
+      </w:r>
+    </w:p>
+    <w:p>
+      <w:r>
+        <w:t xml:space="preserve">The overall aim of this project is to develop and evaluate a supervised machine learning regression model that predicts the total resolution time of IT support tickets using historical data. </w:t>
+      </w:r>
+    </w:p>
+    <w:p>
+      <w:pPr>
+        <w:rPr>
+          <w:lang w:val="ru-RU"/>
+        </w:rPr>
+      </w:pPr>
+      <w:r>
+        <w:rPr>
+          <w:b/>
+          <w:bCs/>
+        </w:rPr>
+        <w:t>Project Objectives:</w:t>
+      </w:r>
+      <w:r>
+        <w:t xml:space="preserve"> </w:t>
+      </w:r>
+    </w:p>
+    <w:p>
+      <w:r>
+        <w:t xml:space="preserve">To achieve this aim, the project has five clear objectives: </w:t>
       </w:r>
     </w:p>
     <w:p>
       <w:pPr>
         <w:numPr>
           <w:ilvl w:val="0"/>
-          <w:numId w:val="1"/>
+          <w:numId w:val="4"/>
         </w:numPr>
       </w:pPr>
       <w:r>
-        <w:t>To perform Exploratory Data Analysis (EDA) to understand the historical ticket data.</w:t>
+        <w:rPr>
+          <w:b/>
+          <w:bCs/>
+        </w:rPr>
+        <w:t>Data Collection and Filtering:</w:t>
+      </w:r>
+      <w:r>
+        <w:t xml:space="preserve"> To collect the historical IT ticket dataset and filter records from 2016 onwards so the data is recent. </w:t>
       </w:r>
     </w:p>
     <w:p>
       <w:pPr>
         <w:numPr>
           <w:ilvl w:val="0"/>
-          <w:numId w:val="1"/>
+          <w:numId w:val="4"/>
         </w:numPr>
       </w:pPr>
       <w:r>
-        <w:t>To prepare the data by cleaning missing values and formatting features.</w:t>
+        <w:rPr>
+          <w:b/>
+          <w:bCs/>
+        </w:rPr>
+        <w:t>Exploratory Data Analysis (EDA):</w:t>
+      </w:r>
+      <w:r>
+        <w:t xml:space="preserve"> To explore the data using statistics and charts in Python to find outliers and trends. </w:t>
       </w:r>
     </w:p>
     <w:p>
       <w:pPr>
         <w:numPr>
           <w:ilvl w:val="0"/>
-          <w:numId w:val="1"/>
+          <w:numId w:val="4"/>
         </w:numPr>
       </w:pPr>
       <w:r>
-        <w:t>To train a simple supervised machine learning model, such as Linear Regression.</w:t>
+        <w:rPr>
+          <w:b/>
+          <w:bCs/>
+        </w:rPr>
+        <w:t>Data Preparation:</w:t>
+      </w:r>
+      <w:r>
+        <w:t xml:space="preserve"> To clean missing values, remove columns that cause data leakage, encode text categories, and scale numeric features. </w:t>
       </w:r>
     </w:p>
     <w:p>
       <w:pPr>
         <w:numPr>
           <w:ilvl w:val="0"/>
-          <w:numId w:val="1"/>
+          <w:numId w:val="4"/>
         </w:numPr>
       </w:pPr>
       <w:r>
-        <w:t>To train a complex ensemble model, such as a Random Forest Regressor.</w:t>
+        <w:rPr>
+          <w:b/>
+          <w:bCs/>
+        </w:rPr>
+        <w:t>Predictive Model Training:</w:t>
+      </w:r>
+      <w:r>
+        <w:t xml:space="preserve"> To train and compare a simple baseline regression model (Linear Regression) and an ensemble model (Random Forest Regressor). </w:t>
       </w:r>
     </w:p>
     <w:p>
       <w:pPr>
         <w:numPr>
           <w:ilvl w:val="0"/>
-          <w:numId w:val="1"/>
+          <w:numId w:val="4"/>
         </w:numPr>
       </w:pPr>
       <w:r>
-        <w:t>To evaluate and compare the performance of the models to find the best predictor.</w:t>
+        <w:rPr>
+          <w:b/>
+          <w:bCs/>
+        </w:rPr>
+        <w:t>Model Evaluation:</w:t>
+      </w:r>
+      <w:r>
+        <w:t xml:space="preserve"> To test the models using error metrics and see which features affect resolution time the most. </w:t>
+      </w:r>
+    </w:p>
+    <w:p>
+      <w:pPr>
+        <w:rPr>
+          <w:lang w:val="ru-RU"/>
+        </w:rPr>
+      </w:pPr>
+      <w:r>
+        <w:rPr>
+          <w:b/>
+          <w:bCs/>
+        </w:rPr>
+        <w:t>Business Objective and Hypothesis:</w:t>
+      </w:r>
+      <w:r>
+        <w:t xml:space="preserve"> </w:t>
+      </w:r>
+    </w:p>
+    <w:p>
+      <w:r>
+        <w:lastRenderedPageBreak/>
+        <w:t xml:space="preserve">The business objective is to help IT managers predict workload and reduce SLA breaches. Using a deductive research approach (Robson, 2003), this project will test one hypothesis: </w:t>
+      </w:r>
+    </w:p>
+    <w:p>
+      <w:pPr>
+        <w:numPr>
+          <w:ilvl w:val="0"/>
+          <w:numId w:val="5"/>
+        </w:numPr>
+      </w:pPr>
+      <w:r>
+        <w:rPr>
+          <w:b/>
+          <w:bCs/>
+        </w:rPr>
+        <w:t>Hypothesis (H1):</w:t>
+      </w:r>
+      <w:r>
+        <w:t xml:space="preserve"> Initial ticket metadata (issue type, priority, project code, and contributor count) has a significant relationship with total resolution time, and a Random Forest Regressor will predict resolution time with a lower error than Linear Regression.</w:t>
       </w:r>
     </w:p>
     <w:p/>
@@ -298,44 +408,158 @@
     </w:p>
     <w:p>
       <w:r>
-        <w:t>The project scope is clearly defined to ensure it can be completed in two semesters.</w:t>
+        <w:t xml:space="preserve">The project scope is clearly defined so the work is realistic for two semesters. </w:t>
+      </w:r>
+    </w:p>
+    <w:p>
+      <w:r>
+        <w:rPr>
+          <w:b/>
+          <w:bCs/>
+        </w:rPr>
+        <w:t>Included in Scope:</w:t>
       </w:r>
     </w:p>
     <w:p>
       <w:pPr>
         <w:numPr>
           <w:ilvl w:val="0"/>
-          <w:numId w:val="2"/>
+          <w:numId w:val="8"/>
         </w:numPr>
       </w:pPr>
+      <w:r>
+        <w:t xml:space="preserve">Analysing structured historical data from the issues.csv dataset, filtered to recent records from 2016 to 2023 (26,379 records). </w:t>
+      </w:r>
+    </w:p>
+    <w:p>
+      <w:pPr>
+        <w:numPr>
+          <w:ilvl w:val="0"/>
+          <w:numId w:val="8"/>
+        </w:numPr>
+      </w:pPr>
+      <w:r>
+        <w:t xml:space="preserve">Using initial ticket features known at creation time: </w:t>
+      </w:r>
+      <w:proofErr w:type="spellStart"/>
+      <w:r>
+        <w:t>issue_type</w:t>
+      </w:r>
+      <w:proofErr w:type="spellEnd"/>
+      <w:r>
+        <w:t xml:space="preserve">, </w:t>
+      </w:r>
+      <w:proofErr w:type="spellStart"/>
+      <w:r>
+        <w:t>issue_priority</w:t>
+      </w:r>
+      <w:proofErr w:type="spellEnd"/>
+      <w:r>
+        <w:t xml:space="preserve">, </w:t>
+      </w:r>
+      <w:proofErr w:type="spellStart"/>
+      <w:r>
+        <w:t>issue_proj</w:t>
+      </w:r>
+      <w:proofErr w:type="spellEnd"/>
+      <w:r>
+        <w:t xml:space="preserve">, </w:t>
+      </w:r>
+      <w:proofErr w:type="spellStart"/>
+      <w:r>
+        <w:t>issue_contr_count</w:t>
+      </w:r>
+      <w:proofErr w:type="spellEnd"/>
+      <w:r>
+        <w:t>, and started date.</w:t>
+      </w:r>
+    </w:p>
+    <w:p>
+      <w:pPr>
+        <w:numPr>
+          <w:ilvl w:val="0"/>
+          <w:numId w:val="8"/>
+        </w:numPr>
+      </w:pPr>
+      <w:r>
+        <w:t xml:space="preserve">Predicting the numeric target variable </w:t>
+      </w:r>
+      <w:proofErr w:type="spellStart"/>
+      <w:r>
+        <w:t>wf_total_time</w:t>
+      </w:r>
+      <w:proofErr w:type="spellEnd"/>
+      <w:r>
+        <w:t xml:space="preserve"> (total workflow resolution time). </w:t>
+      </w:r>
+    </w:p>
+    <w:p>
+      <w:pPr>
+        <w:numPr>
+          <w:ilvl w:val="0"/>
+          <w:numId w:val="8"/>
+        </w:numPr>
+      </w:pPr>
+      <w:r>
+        <w:t xml:space="preserve">Completing EDA and data preparation in Semester 1 (CA2), and model training in Semester 2 (CA3). </w:t>
+      </w:r>
+    </w:p>
+    <w:p>
       <w:r>
         <w:rPr>
           <w:b/>
           <w:bCs/>
         </w:rPr>
-        <w:t>Included:</w:t>
-      </w:r>
-      <w:r>
-        <w:t xml:space="preserve"> The project will include the analysis of historical, structured data (such as issue type and priority). It will focus only on predicting the target variable, which is the total workflow time (wf_total_time).</w:t>
+        <w:t>Excluded from Scope:</w:t>
       </w:r>
     </w:p>
     <w:p>
       <w:pPr>
         <w:numPr>
           <w:ilvl w:val="0"/>
-          <w:numId w:val="2"/>
+          <w:numId w:val="9"/>
         </w:numPr>
       </w:pPr>
       <w:r>
-        <w:rPr>
-          <w:b/>
-          <w:bCs/>
-        </w:rPr>
-        <w:lastRenderedPageBreak/>
-        <w:t>Excluded:</w:t>
-      </w:r>
-      <w:r>
-        <w:t xml:space="preserve"> The project will exclude the analysis of unstructured text data, such as user comments. It will also exclude the live deployment of the model into a production environment.</w:t>
+        <w:t>Natural Language Processing (NLP) on text comments, because the dataset only has structured columns.</w:t>
+      </w:r>
+    </w:p>
+    <w:p>
+      <w:pPr>
+        <w:numPr>
+          <w:ilvl w:val="0"/>
+          <w:numId w:val="9"/>
+        </w:numPr>
+      </w:pPr>
+      <w:r>
+        <w:t xml:space="preserve">Intermediate workflow timer columns (such as </w:t>
+      </w:r>
+      <w:proofErr w:type="spellStart"/>
+      <w:r>
+        <w:t>wf_in_progress</w:t>
+      </w:r>
+      <w:proofErr w:type="spellEnd"/>
+      <w:r>
+        <w:t xml:space="preserve"> or </w:t>
+      </w:r>
+      <w:proofErr w:type="spellStart"/>
+      <w:r>
+        <w:t>wf_waiting</w:t>
+      </w:r>
+      <w:proofErr w:type="spellEnd"/>
+      <w:r>
+        <w:t>). Using them as inputs would cause data leakage because this data is unknown when a ticket first opens.</w:t>
+      </w:r>
+    </w:p>
+    <w:p>
+      <w:pPr>
+        <w:numPr>
+          <w:ilvl w:val="0"/>
+          <w:numId w:val="9"/>
+        </w:numPr>
+      </w:pPr>
+      <w:r>
+        <w:t xml:space="preserve">Deploying the model into a live server. The project will run offline in Jupyter Notebook. </w:t>
       </w:r>
     </w:p>
     <w:p/>
@@ -365,6 +589,7 @@
     </w:p>
     <w:p>
       <w:r>
+        <w:lastRenderedPageBreak/>
         <w:t>The project will use predictive modelling techniques. Because the target variable is a continuous number, the project will use regression algorithms. The model planning phase will start with a simple algorithm like Linear Regression. Then, the project will use a Random Forest Regressor to capture more complex patterns in the data.</w:t>
       </w:r>
     </w:p>
@@ -687,6 +912,417 @@
     </w:lvl>
   </w:abstractNum>
   <w:abstractNum w:abstractNumId="2" w15:restartNumberingAfterBreak="0">
+    <w:nsid w:val="2AE42C38"/>
+    <w:multiLevelType w:val="multilevel"/>
+    <w:tmpl w:val="1E48F2E8"/>
+    <w:lvl w:ilvl="0">
+      <w:start w:val="1"/>
+      <w:numFmt w:val="bullet"/>
+      <w:lvlText w:val=""/>
+      <w:lvlJc w:val="left"/>
+      <w:pPr>
+        <w:tabs>
+          <w:tab w:val="num" w:pos="720"/>
+        </w:tabs>
+        <w:ind w:left="720" w:hanging="360"/>
+      </w:pPr>
+      <w:rPr>
+        <w:rFonts w:ascii="Symbol" w:hAnsi="Symbol" w:hint="default"/>
+        <w:sz w:val="20"/>
+      </w:rPr>
+    </w:lvl>
+    <w:lvl w:ilvl="1" w:tentative="1">
+      <w:start w:val="1"/>
+      <w:numFmt w:val="bullet"/>
+      <w:lvlText w:val="o"/>
+      <w:lvlJc w:val="left"/>
+      <w:pPr>
+        <w:tabs>
+          <w:tab w:val="num" w:pos="1440"/>
+        </w:tabs>
+        <w:ind w:left="1440" w:hanging="360"/>
+      </w:pPr>
+      <w:rPr>
+        <w:rFonts w:ascii="Courier New" w:hAnsi="Courier New" w:hint="default"/>
+        <w:sz w:val="20"/>
+      </w:rPr>
+    </w:lvl>
+    <w:lvl w:ilvl="2" w:tentative="1">
+      <w:start w:val="1"/>
+      <w:numFmt w:val="bullet"/>
+      <w:lvlText w:val=""/>
+      <w:lvlJc w:val="left"/>
+      <w:pPr>
+        <w:tabs>
+          <w:tab w:val="num" w:pos="2160"/>
+        </w:tabs>
+        <w:ind w:left="2160" w:hanging="360"/>
+      </w:pPr>
+      <w:rPr>
+        <w:rFonts w:ascii="Wingdings" w:hAnsi="Wingdings" w:hint="default"/>
+        <w:sz w:val="20"/>
+      </w:rPr>
+    </w:lvl>
+    <w:lvl w:ilvl="3" w:tentative="1">
+      <w:start w:val="1"/>
+      <w:numFmt w:val="bullet"/>
+      <w:lvlText w:val=""/>
+      <w:lvlJc w:val="left"/>
+      <w:pPr>
+        <w:tabs>
+          <w:tab w:val="num" w:pos="2880"/>
+        </w:tabs>
+        <w:ind w:left="2880" w:hanging="360"/>
+      </w:pPr>
+      <w:rPr>
+        <w:rFonts w:ascii="Wingdings" w:hAnsi="Wingdings" w:hint="default"/>
+        <w:sz w:val="20"/>
+      </w:rPr>
+    </w:lvl>
+    <w:lvl w:ilvl="4" w:tentative="1">
+      <w:start w:val="1"/>
+      <w:numFmt w:val="bullet"/>
+      <w:lvlText w:val=""/>
+      <w:lvlJc w:val="left"/>
+      <w:pPr>
+        <w:tabs>
+          <w:tab w:val="num" w:pos="3600"/>
+        </w:tabs>
+        <w:ind w:left="3600" w:hanging="360"/>
+      </w:pPr>
+      <w:rPr>
+        <w:rFonts w:ascii="Wingdings" w:hAnsi="Wingdings" w:hint="default"/>
+        <w:sz w:val="20"/>
+      </w:rPr>
+    </w:lvl>
+    <w:lvl w:ilvl="5" w:tentative="1">
+      <w:start w:val="1"/>
+      <w:numFmt w:val="bullet"/>
+      <w:lvlText w:val=""/>
+      <w:lvlJc w:val="left"/>
+      <w:pPr>
+        <w:tabs>
+          <w:tab w:val="num" w:pos="4320"/>
+        </w:tabs>
+        <w:ind w:left="4320" w:hanging="360"/>
+      </w:pPr>
+      <w:rPr>
+        <w:rFonts w:ascii="Wingdings" w:hAnsi="Wingdings" w:hint="default"/>
+        <w:sz w:val="20"/>
+      </w:rPr>
+    </w:lvl>
+    <w:lvl w:ilvl="6" w:tentative="1">
+      <w:start w:val="1"/>
+      <w:numFmt w:val="bullet"/>
+      <w:lvlText w:val=""/>
+      <w:lvlJc w:val="left"/>
+      <w:pPr>
+        <w:tabs>
+          <w:tab w:val="num" w:pos="5040"/>
+        </w:tabs>
+        <w:ind w:left="5040" w:hanging="360"/>
+      </w:pPr>
+      <w:rPr>
+        <w:rFonts w:ascii="Wingdings" w:hAnsi="Wingdings" w:hint="default"/>
+        <w:sz w:val="20"/>
+      </w:rPr>
+    </w:lvl>
+    <w:lvl w:ilvl="7" w:tentative="1">
+      <w:start w:val="1"/>
+      <w:numFmt w:val="bullet"/>
+      <w:lvlText w:val=""/>
+      <w:lvlJc w:val="left"/>
+      <w:pPr>
+        <w:tabs>
+          <w:tab w:val="num" w:pos="5760"/>
+        </w:tabs>
+        <w:ind w:left="5760" w:hanging="360"/>
+      </w:pPr>
+      <w:rPr>
+        <w:rFonts w:ascii="Wingdings" w:hAnsi="Wingdings" w:hint="default"/>
+        <w:sz w:val="20"/>
+      </w:rPr>
+    </w:lvl>
+    <w:lvl w:ilvl="8" w:tentative="1">
+      <w:start w:val="1"/>
+      <w:numFmt w:val="bullet"/>
+      <w:lvlText w:val=""/>
+      <w:lvlJc w:val="left"/>
+      <w:pPr>
+        <w:tabs>
+          <w:tab w:val="num" w:pos="6480"/>
+        </w:tabs>
+        <w:ind w:left="6480" w:hanging="360"/>
+      </w:pPr>
+      <w:rPr>
+        <w:rFonts w:ascii="Wingdings" w:hAnsi="Wingdings" w:hint="default"/>
+        <w:sz w:val="20"/>
+      </w:rPr>
+    </w:lvl>
+  </w:abstractNum>
+  <w:abstractNum w:abstractNumId="3" w15:restartNumberingAfterBreak="0">
+    <w:nsid w:val="41A477C0"/>
+    <w:multiLevelType w:val="multilevel"/>
+    <w:tmpl w:val="A226F970"/>
+    <w:lvl w:ilvl="0">
+      <w:start w:val="1"/>
+      <w:numFmt w:val="decimal"/>
+      <w:lvlText w:val="%1."/>
+      <w:lvlJc w:val="left"/>
+      <w:pPr>
+        <w:tabs>
+          <w:tab w:val="num" w:pos="720"/>
+        </w:tabs>
+        <w:ind w:left="720" w:hanging="360"/>
+      </w:pPr>
+    </w:lvl>
+    <w:lvl w:ilvl="1" w:tentative="1">
+      <w:start w:val="1"/>
+      <w:numFmt w:val="decimal"/>
+      <w:lvlText w:val="%2."/>
+      <w:lvlJc w:val="left"/>
+      <w:pPr>
+        <w:tabs>
+          <w:tab w:val="num" w:pos="1440"/>
+        </w:tabs>
+        <w:ind w:left="1440" w:hanging="360"/>
+      </w:pPr>
+    </w:lvl>
+    <w:lvl w:ilvl="2" w:tentative="1">
+      <w:start w:val="1"/>
+      <w:numFmt w:val="decimal"/>
+      <w:lvlText w:val="%3."/>
+      <w:lvlJc w:val="left"/>
+      <w:pPr>
+        <w:tabs>
+          <w:tab w:val="num" w:pos="2160"/>
+        </w:tabs>
+        <w:ind w:left="2160" w:hanging="360"/>
+      </w:pPr>
+    </w:lvl>
+    <w:lvl w:ilvl="3" w:tentative="1">
+      <w:start w:val="1"/>
+      <w:numFmt w:val="decimal"/>
+      <w:lvlText w:val="%4."/>
+      <w:lvlJc w:val="left"/>
+      <w:pPr>
+        <w:tabs>
+          <w:tab w:val="num" w:pos="2880"/>
+        </w:tabs>
+        <w:ind w:left="2880" w:hanging="360"/>
+      </w:pPr>
+    </w:lvl>
+    <w:lvl w:ilvl="4" w:tentative="1">
+      <w:start w:val="1"/>
+      <w:numFmt w:val="decimal"/>
+      <w:lvlText w:val="%5."/>
+      <w:lvlJc w:val="left"/>
+      <w:pPr>
+        <w:tabs>
+          <w:tab w:val="num" w:pos="3600"/>
+        </w:tabs>
+        <w:ind w:left="3600" w:hanging="360"/>
+      </w:pPr>
+    </w:lvl>
+    <w:lvl w:ilvl="5" w:tentative="1">
+      <w:start w:val="1"/>
+      <w:numFmt w:val="decimal"/>
+      <w:lvlText w:val="%6."/>
+      <w:lvlJc w:val="left"/>
+      <w:pPr>
+        <w:tabs>
+          <w:tab w:val="num" w:pos="4320"/>
+        </w:tabs>
+        <w:ind w:left="4320" w:hanging="360"/>
+      </w:pPr>
+    </w:lvl>
+    <w:lvl w:ilvl="6" w:tentative="1">
+      <w:start w:val="1"/>
+      <w:numFmt w:val="decimal"/>
+      <w:lvlText w:val="%7."/>
+      <w:lvlJc w:val="left"/>
+      <w:pPr>
+        <w:tabs>
+          <w:tab w:val="num" w:pos="5040"/>
+        </w:tabs>
+        <w:ind w:left="5040" w:hanging="360"/>
+      </w:pPr>
+    </w:lvl>
+    <w:lvl w:ilvl="7" w:tentative="1">
+      <w:start w:val="1"/>
+      <w:numFmt w:val="decimal"/>
+      <w:lvlText w:val="%8."/>
+      <w:lvlJc w:val="left"/>
+      <w:pPr>
+        <w:tabs>
+          <w:tab w:val="num" w:pos="5760"/>
+        </w:tabs>
+        <w:ind w:left="5760" w:hanging="360"/>
+      </w:pPr>
+    </w:lvl>
+    <w:lvl w:ilvl="8" w:tentative="1">
+      <w:start w:val="1"/>
+      <w:numFmt w:val="decimal"/>
+      <w:lvlText w:val="%9."/>
+      <w:lvlJc w:val="left"/>
+      <w:pPr>
+        <w:tabs>
+          <w:tab w:val="num" w:pos="6480"/>
+        </w:tabs>
+        <w:ind w:left="6480" w:hanging="360"/>
+      </w:pPr>
+    </w:lvl>
+  </w:abstractNum>
+  <w:abstractNum w:abstractNumId="4" w15:restartNumberingAfterBreak="0">
+    <w:nsid w:val="53175136"/>
+    <w:multiLevelType w:val="multilevel"/>
+    <w:tmpl w:val="9E7EDC70"/>
+    <w:lvl w:ilvl="0">
+      <w:start w:val="1"/>
+      <w:numFmt w:val="bullet"/>
+      <w:lvlText w:val=""/>
+      <w:lvlJc w:val="left"/>
+      <w:pPr>
+        <w:tabs>
+          <w:tab w:val="num" w:pos="720"/>
+        </w:tabs>
+        <w:ind w:left="720" w:hanging="360"/>
+      </w:pPr>
+      <w:rPr>
+        <w:rFonts w:ascii="Symbol" w:hAnsi="Symbol" w:hint="default"/>
+        <w:sz w:val="20"/>
+      </w:rPr>
+    </w:lvl>
+    <w:lvl w:ilvl="1" w:tentative="1">
+      <w:start w:val="1"/>
+      <w:numFmt w:val="bullet"/>
+      <w:lvlText w:val="o"/>
+      <w:lvlJc w:val="left"/>
+      <w:pPr>
+        <w:tabs>
+          <w:tab w:val="num" w:pos="1440"/>
+        </w:tabs>
+        <w:ind w:left="1440" w:hanging="360"/>
+      </w:pPr>
+      <w:rPr>
+        <w:rFonts w:ascii="Courier New" w:hAnsi="Courier New" w:hint="default"/>
+        <w:sz w:val="20"/>
+      </w:rPr>
+    </w:lvl>
+    <w:lvl w:ilvl="2" w:tentative="1">
+      <w:start w:val="1"/>
+      <w:numFmt w:val="bullet"/>
+      <w:lvlText w:val=""/>
+      <w:lvlJc w:val="left"/>
+      <w:pPr>
+        <w:tabs>
+          <w:tab w:val="num" w:pos="2160"/>
+        </w:tabs>
+        <w:ind w:left="2160" w:hanging="360"/>
+      </w:pPr>
+      <w:rPr>
+        <w:rFonts w:ascii="Wingdings" w:hAnsi="Wingdings" w:hint="default"/>
+        <w:sz w:val="20"/>
+      </w:rPr>
+    </w:lvl>
+    <w:lvl w:ilvl="3" w:tentative="1">
+      <w:start w:val="1"/>
+      <w:numFmt w:val="bullet"/>
+      <w:lvlText w:val=""/>
+      <w:lvlJc w:val="left"/>
+      <w:pPr>
+        <w:tabs>
+          <w:tab w:val="num" w:pos="2880"/>
+        </w:tabs>
+        <w:ind w:left="2880" w:hanging="360"/>
+      </w:pPr>
+      <w:rPr>
+        <w:rFonts w:ascii="Wingdings" w:hAnsi="Wingdings" w:hint="default"/>
+        <w:sz w:val="20"/>
+      </w:rPr>
+    </w:lvl>
+    <w:lvl w:ilvl="4" w:tentative="1">
+      <w:start w:val="1"/>
+      <w:numFmt w:val="bullet"/>
+      <w:lvlText w:val=""/>
+      <w:lvlJc w:val="left"/>
+      <w:pPr>
+        <w:tabs>
+          <w:tab w:val="num" w:pos="3600"/>
+        </w:tabs>
+        <w:ind w:left="3600" w:hanging="360"/>
+      </w:pPr>
+      <w:rPr>
+        <w:rFonts w:ascii="Wingdings" w:hAnsi="Wingdings" w:hint="default"/>
+        <w:sz w:val="20"/>
+      </w:rPr>
+    </w:lvl>
+    <w:lvl w:ilvl="5" w:tentative="1">
+      <w:start w:val="1"/>
+      <w:numFmt w:val="bullet"/>
+      <w:lvlText w:val=""/>
+      <w:lvlJc w:val="left"/>
+      <w:pPr>
+        <w:tabs>
+          <w:tab w:val="num" w:pos="4320"/>
+        </w:tabs>
+        <w:ind w:left="4320" w:hanging="360"/>
+      </w:pPr>
+      <w:rPr>
+        <w:rFonts w:ascii="Wingdings" w:hAnsi="Wingdings" w:hint="default"/>
+        <w:sz w:val="20"/>
+      </w:rPr>
+    </w:lvl>
+    <w:lvl w:ilvl="6" w:tentative="1">
+      <w:start w:val="1"/>
+      <w:numFmt w:val="bullet"/>
+      <w:lvlText w:val=""/>
+      <w:lvlJc w:val="left"/>
+      <w:pPr>
+        <w:tabs>
+          <w:tab w:val="num" w:pos="5040"/>
+        </w:tabs>
+        <w:ind w:left="5040" w:hanging="360"/>
+      </w:pPr>
+      <w:rPr>
+        <w:rFonts w:ascii="Wingdings" w:hAnsi="Wingdings" w:hint="default"/>
+        <w:sz w:val="20"/>
+      </w:rPr>
+    </w:lvl>
+    <w:lvl w:ilvl="7" w:tentative="1">
+      <w:start w:val="1"/>
+      <w:numFmt w:val="bullet"/>
+      <w:lvlText w:val=""/>
+      <w:lvlJc w:val="left"/>
+      <w:pPr>
+        <w:tabs>
+          <w:tab w:val="num" w:pos="5760"/>
+        </w:tabs>
+        <w:ind w:left="5760" w:hanging="360"/>
+      </w:pPr>
+      <w:rPr>
+        <w:rFonts w:ascii="Wingdings" w:hAnsi="Wingdings" w:hint="default"/>
+        <w:sz w:val="20"/>
+      </w:rPr>
+    </w:lvl>
+    <w:lvl w:ilvl="8" w:tentative="1">
+      <w:start w:val="1"/>
+      <w:numFmt w:val="bullet"/>
+      <w:lvlText w:val=""/>
+      <w:lvlJc w:val="left"/>
+      <w:pPr>
+        <w:tabs>
+          <w:tab w:val="num" w:pos="6480"/>
+        </w:tabs>
+        <w:ind w:left="6480" w:hanging="360"/>
+      </w:pPr>
+      <w:rPr>
+        <w:rFonts w:ascii="Wingdings" w:hAnsi="Wingdings" w:hint="default"/>
+        <w:sz w:val="20"/>
+      </w:rPr>
+    </w:lvl>
+  </w:abstractNum>
+  <w:abstractNum w:abstractNumId="5" w15:restartNumberingAfterBreak="0">
     <w:nsid w:val="5B4232EC"/>
     <w:multiLevelType w:val="multilevel"/>
     <w:tmpl w:val="A6349EA4"/>
@@ -797,6 +1433,453 @@
         </w:tabs>
         <w:ind w:left="6480" w:hanging="360"/>
       </w:pPr>
+    </w:lvl>
+  </w:abstractNum>
+  <w:abstractNum w:abstractNumId="6" w15:restartNumberingAfterBreak="0">
+    <w:nsid w:val="656C3C3C"/>
+    <w:multiLevelType w:val="multilevel"/>
+    <w:tmpl w:val="033EB9B2"/>
+    <w:lvl w:ilvl="0">
+      <w:start w:val="1"/>
+      <w:numFmt w:val="bullet"/>
+      <w:lvlText w:val=""/>
+      <w:lvlJc w:val="left"/>
+      <w:pPr>
+        <w:tabs>
+          <w:tab w:val="num" w:pos="720"/>
+        </w:tabs>
+        <w:ind w:left="720" w:hanging="360"/>
+      </w:pPr>
+      <w:rPr>
+        <w:rFonts w:ascii="Symbol" w:hAnsi="Symbol" w:hint="default"/>
+        <w:sz w:val="20"/>
+      </w:rPr>
+    </w:lvl>
+    <w:lvl w:ilvl="1" w:tentative="1">
+      <w:start w:val="1"/>
+      <w:numFmt w:val="bullet"/>
+      <w:lvlText w:val="o"/>
+      <w:lvlJc w:val="left"/>
+      <w:pPr>
+        <w:tabs>
+          <w:tab w:val="num" w:pos="1440"/>
+        </w:tabs>
+        <w:ind w:left="1440" w:hanging="360"/>
+      </w:pPr>
+      <w:rPr>
+        <w:rFonts w:ascii="Courier New" w:hAnsi="Courier New" w:hint="default"/>
+        <w:sz w:val="20"/>
+      </w:rPr>
+    </w:lvl>
+    <w:lvl w:ilvl="2" w:tentative="1">
+      <w:start w:val="1"/>
+      <w:numFmt w:val="bullet"/>
+      <w:lvlText w:val=""/>
+      <w:lvlJc w:val="left"/>
+      <w:pPr>
+        <w:tabs>
+          <w:tab w:val="num" w:pos="2160"/>
+        </w:tabs>
+        <w:ind w:left="2160" w:hanging="360"/>
+      </w:pPr>
+      <w:rPr>
+        <w:rFonts w:ascii="Wingdings" w:hAnsi="Wingdings" w:hint="default"/>
+        <w:sz w:val="20"/>
+      </w:rPr>
+    </w:lvl>
+    <w:lvl w:ilvl="3" w:tentative="1">
+      <w:start w:val="1"/>
+      <w:numFmt w:val="bullet"/>
+      <w:lvlText w:val=""/>
+      <w:lvlJc w:val="left"/>
+      <w:pPr>
+        <w:tabs>
+          <w:tab w:val="num" w:pos="2880"/>
+        </w:tabs>
+        <w:ind w:left="2880" w:hanging="360"/>
+      </w:pPr>
+      <w:rPr>
+        <w:rFonts w:ascii="Wingdings" w:hAnsi="Wingdings" w:hint="default"/>
+        <w:sz w:val="20"/>
+      </w:rPr>
+    </w:lvl>
+    <w:lvl w:ilvl="4" w:tentative="1">
+      <w:start w:val="1"/>
+      <w:numFmt w:val="bullet"/>
+      <w:lvlText w:val=""/>
+      <w:lvlJc w:val="left"/>
+      <w:pPr>
+        <w:tabs>
+          <w:tab w:val="num" w:pos="3600"/>
+        </w:tabs>
+        <w:ind w:left="3600" w:hanging="360"/>
+      </w:pPr>
+      <w:rPr>
+        <w:rFonts w:ascii="Wingdings" w:hAnsi="Wingdings" w:hint="default"/>
+        <w:sz w:val="20"/>
+      </w:rPr>
+    </w:lvl>
+    <w:lvl w:ilvl="5" w:tentative="1">
+      <w:start w:val="1"/>
+      <w:numFmt w:val="bullet"/>
+      <w:lvlText w:val=""/>
+      <w:lvlJc w:val="left"/>
+      <w:pPr>
+        <w:tabs>
+          <w:tab w:val="num" w:pos="4320"/>
+        </w:tabs>
+        <w:ind w:left="4320" w:hanging="360"/>
+      </w:pPr>
+      <w:rPr>
+        <w:rFonts w:ascii="Wingdings" w:hAnsi="Wingdings" w:hint="default"/>
+        <w:sz w:val="20"/>
+      </w:rPr>
+    </w:lvl>
+    <w:lvl w:ilvl="6" w:tentative="1">
+      <w:start w:val="1"/>
+      <w:numFmt w:val="bullet"/>
+      <w:lvlText w:val=""/>
+      <w:lvlJc w:val="left"/>
+      <w:pPr>
+        <w:tabs>
+          <w:tab w:val="num" w:pos="5040"/>
+        </w:tabs>
+        <w:ind w:left="5040" w:hanging="360"/>
+      </w:pPr>
+      <w:rPr>
+        <w:rFonts w:ascii="Wingdings" w:hAnsi="Wingdings" w:hint="default"/>
+        <w:sz w:val="20"/>
+      </w:rPr>
+    </w:lvl>
+    <w:lvl w:ilvl="7" w:tentative="1">
+      <w:start w:val="1"/>
+      <w:numFmt w:val="bullet"/>
+      <w:lvlText w:val=""/>
+      <w:lvlJc w:val="left"/>
+      <w:pPr>
+        <w:tabs>
+          <w:tab w:val="num" w:pos="5760"/>
+        </w:tabs>
+        <w:ind w:left="5760" w:hanging="360"/>
+      </w:pPr>
+      <w:rPr>
+        <w:rFonts w:ascii="Wingdings" w:hAnsi="Wingdings" w:hint="default"/>
+        <w:sz w:val="20"/>
+      </w:rPr>
+    </w:lvl>
+    <w:lvl w:ilvl="8" w:tentative="1">
+      <w:start w:val="1"/>
+      <w:numFmt w:val="bullet"/>
+      <w:lvlText w:val=""/>
+      <w:lvlJc w:val="left"/>
+      <w:pPr>
+        <w:tabs>
+          <w:tab w:val="num" w:pos="6480"/>
+        </w:tabs>
+        <w:ind w:left="6480" w:hanging="360"/>
+      </w:pPr>
+      <w:rPr>
+        <w:rFonts w:ascii="Wingdings" w:hAnsi="Wingdings" w:hint="default"/>
+        <w:sz w:val="20"/>
+      </w:rPr>
+    </w:lvl>
+  </w:abstractNum>
+  <w:abstractNum w:abstractNumId="7" w15:restartNumberingAfterBreak="0">
+    <w:nsid w:val="7AA679AC"/>
+    <w:multiLevelType w:val="multilevel"/>
+    <w:tmpl w:val="33D861B8"/>
+    <w:lvl w:ilvl="0">
+      <w:start w:val="1"/>
+      <w:numFmt w:val="bullet"/>
+      <w:lvlText w:val=""/>
+      <w:lvlJc w:val="left"/>
+      <w:pPr>
+        <w:tabs>
+          <w:tab w:val="num" w:pos="720"/>
+        </w:tabs>
+        <w:ind w:left="720" w:hanging="360"/>
+      </w:pPr>
+      <w:rPr>
+        <w:rFonts w:ascii="Symbol" w:hAnsi="Symbol" w:hint="default"/>
+        <w:sz w:val="20"/>
+      </w:rPr>
+    </w:lvl>
+    <w:lvl w:ilvl="1" w:tentative="1">
+      <w:start w:val="1"/>
+      <w:numFmt w:val="bullet"/>
+      <w:lvlText w:val="o"/>
+      <w:lvlJc w:val="left"/>
+      <w:pPr>
+        <w:tabs>
+          <w:tab w:val="num" w:pos="1440"/>
+        </w:tabs>
+        <w:ind w:left="1440" w:hanging="360"/>
+      </w:pPr>
+      <w:rPr>
+        <w:rFonts w:ascii="Courier New" w:hAnsi="Courier New" w:hint="default"/>
+        <w:sz w:val="20"/>
+      </w:rPr>
+    </w:lvl>
+    <w:lvl w:ilvl="2" w:tentative="1">
+      <w:start w:val="1"/>
+      <w:numFmt w:val="bullet"/>
+      <w:lvlText w:val=""/>
+      <w:lvlJc w:val="left"/>
+      <w:pPr>
+        <w:tabs>
+          <w:tab w:val="num" w:pos="2160"/>
+        </w:tabs>
+        <w:ind w:left="2160" w:hanging="360"/>
+      </w:pPr>
+      <w:rPr>
+        <w:rFonts w:ascii="Wingdings" w:hAnsi="Wingdings" w:hint="default"/>
+        <w:sz w:val="20"/>
+      </w:rPr>
+    </w:lvl>
+    <w:lvl w:ilvl="3" w:tentative="1">
+      <w:start w:val="1"/>
+      <w:numFmt w:val="bullet"/>
+      <w:lvlText w:val=""/>
+      <w:lvlJc w:val="left"/>
+      <w:pPr>
+        <w:tabs>
+          <w:tab w:val="num" w:pos="2880"/>
+        </w:tabs>
+        <w:ind w:left="2880" w:hanging="360"/>
+      </w:pPr>
+      <w:rPr>
+        <w:rFonts w:ascii="Wingdings" w:hAnsi="Wingdings" w:hint="default"/>
+        <w:sz w:val="20"/>
+      </w:rPr>
+    </w:lvl>
+    <w:lvl w:ilvl="4" w:tentative="1">
+      <w:start w:val="1"/>
+      <w:numFmt w:val="bullet"/>
+      <w:lvlText w:val=""/>
+      <w:lvlJc w:val="left"/>
+      <w:pPr>
+        <w:tabs>
+          <w:tab w:val="num" w:pos="3600"/>
+        </w:tabs>
+        <w:ind w:left="3600" w:hanging="360"/>
+      </w:pPr>
+      <w:rPr>
+        <w:rFonts w:ascii="Wingdings" w:hAnsi="Wingdings" w:hint="default"/>
+        <w:sz w:val="20"/>
+      </w:rPr>
+    </w:lvl>
+    <w:lvl w:ilvl="5" w:tentative="1">
+      <w:start w:val="1"/>
+      <w:numFmt w:val="bullet"/>
+      <w:lvlText w:val=""/>
+      <w:lvlJc w:val="left"/>
+      <w:pPr>
+        <w:tabs>
+          <w:tab w:val="num" w:pos="4320"/>
+        </w:tabs>
+        <w:ind w:left="4320" w:hanging="360"/>
+      </w:pPr>
+      <w:rPr>
+        <w:rFonts w:ascii="Wingdings" w:hAnsi="Wingdings" w:hint="default"/>
+        <w:sz w:val="20"/>
+      </w:rPr>
+    </w:lvl>
+    <w:lvl w:ilvl="6" w:tentative="1">
+      <w:start w:val="1"/>
+      <w:numFmt w:val="bullet"/>
+      <w:lvlText w:val=""/>
+      <w:lvlJc w:val="left"/>
+      <w:pPr>
+        <w:tabs>
+          <w:tab w:val="num" w:pos="5040"/>
+        </w:tabs>
+        <w:ind w:left="5040" w:hanging="360"/>
+      </w:pPr>
+      <w:rPr>
+        <w:rFonts w:ascii="Wingdings" w:hAnsi="Wingdings" w:hint="default"/>
+        <w:sz w:val="20"/>
+      </w:rPr>
+    </w:lvl>
+    <w:lvl w:ilvl="7" w:tentative="1">
+      <w:start w:val="1"/>
+      <w:numFmt w:val="bullet"/>
+      <w:lvlText w:val=""/>
+      <w:lvlJc w:val="left"/>
+      <w:pPr>
+        <w:tabs>
+          <w:tab w:val="num" w:pos="5760"/>
+        </w:tabs>
+        <w:ind w:left="5760" w:hanging="360"/>
+      </w:pPr>
+      <w:rPr>
+        <w:rFonts w:ascii="Wingdings" w:hAnsi="Wingdings" w:hint="default"/>
+        <w:sz w:val="20"/>
+      </w:rPr>
+    </w:lvl>
+    <w:lvl w:ilvl="8" w:tentative="1">
+      <w:start w:val="1"/>
+      <w:numFmt w:val="bullet"/>
+      <w:lvlText w:val=""/>
+      <w:lvlJc w:val="left"/>
+      <w:pPr>
+        <w:tabs>
+          <w:tab w:val="num" w:pos="6480"/>
+        </w:tabs>
+        <w:ind w:left="6480" w:hanging="360"/>
+      </w:pPr>
+      <w:rPr>
+        <w:rFonts w:ascii="Wingdings" w:hAnsi="Wingdings" w:hint="default"/>
+        <w:sz w:val="20"/>
+      </w:rPr>
+    </w:lvl>
+  </w:abstractNum>
+  <w:abstractNum w:abstractNumId="8" w15:restartNumberingAfterBreak="0">
+    <w:nsid w:val="7D5F7C98"/>
+    <w:multiLevelType w:val="multilevel"/>
+    <w:tmpl w:val="685C1D94"/>
+    <w:lvl w:ilvl="0">
+      <w:start w:val="1"/>
+      <w:numFmt w:val="bullet"/>
+      <w:lvlText w:val=""/>
+      <w:lvlJc w:val="left"/>
+      <w:pPr>
+        <w:tabs>
+          <w:tab w:val="num" w:pos="720"/>
+        </w:tabs>
+        <w:ind w:left="720" w:hanging="360"/>
+      </w:pPr>
+      <w:rPr>
+        <w:rFonts w:ascii="Symbol" w:hAnsi="Symbol" w:hint="default"/>
+        <w:sz w:val="20"/>
+      </w:rPr>
+    </w:lvl>
+    <w:lvl w:ilvl="1" w:tentative="1">
+      <w:start w:val="1"/>
+      <w:numFmt w:val="bullet"/>
+      <w:lvlText w:val="o"/>
+      <w:lvlJc w:val="left"/>
+      <w:pPr>
+        <w:tabs>
+          <w:tab w:val="num" w:pos="1440"/>
+        </w:tabs>
+        <w:ind w:left="1440" w:hanging="360"/>
+      </w:pPr>
+      <w:rPr>
+        <w:rFonts w:ascii="Courier New" w:hAnsi="Courier New" w:hint="default"/>
+        <w:sz w:val="20"/>
+      </w:rPr>
+    </w:lvl>
+    <w:lvl w:ilvl="2" w:tentative="1">
+      <w:start w:val="1"/>
+      <w:numFmt w:val="bullet"/>
+      <w:lvlText w:val=""/>
+      <w:lvlJc w:val="left"/>
+      <w:pPr>
+        <w:tabs>
+          <w:tab w:val="num" w:pos="2160"/>
+        </w:tabs>
+        <w:ind w:left="2160" w:hanging="360"/>
+      </w:pPr>
+      <w:rPr>
+        <w:rFonts w:ascii="Wingdings" w:hAnsi="Wingdings" w:hint="default"/>
+        <w:sz w:val="20"/>
+      </w:rPr>
+    </w:lvl>
+    <w:lvl w:ilvl="3" w:tentative="1">
+      <w:start w:val="1"/>
+      <w:numFmt w:val="bullet"/>
+      <w:lvlText w:val=""/>
+      <w:lvlJc w:val="left"/>
+      <w:pPr>
+        <w:tabs>
+          <w:tab w:val="num" w:pos="2880"/>
+        </w:tabs>
+        <w:ind w:left="2880" w:hanging="360"/>
+      </w:pPr>
+      <w:rPr>
+        <w:rFonts w:ascii="Wingdings" w:hAnsi="Wingdings" w:hint="default"/>
+        <w:sz w:val="20"/>
+      </w:rPr>
+    </w:lvl>
+    <w:lvl w:ilvl="4" w:tentative="1">
+      <w:start w:val="1"/>
+      <w:numFmt w:val="bullet"/>
+      <w:lvlText w:val=""/>
+      <w:lvlJc w:val="left"/>
+      <w:pPr>
+        <w:tabs>
+          <w:tab w:val="num" w:pos="3600"/>
+        </w:tabs>
+        <w:ind w:left="3600" w:hanging="360"/>
+      </w:pPr>
+      <w:rPr>
+        <w:rFonts w:ascii="Wingdings" w:hAnsi="Wingdings" w:hint="default"/>
+        <w:sz w:val="20"/>
+      </w:rPr>
+    </w:lvl>
+    <w:lvl w:ilvl="5" w:tentative="1">
+      <w:start w:val="1"/>
+      <w:numFmt w:val="bullet"/>
+      <w:lvlText w:val=""/>
+      <w:lvlJc w:val="left"/>
+      <w:pPr>
+        <w:tabs>
+          <w:tab w:val="num" w:pos="4320"/>
+        </w:tabs>
+        <w:ind w:left="4320" w:hanging="360"/>
+      </w:pPr>
+      <w:rPr>
+        <w:rFonts w:ascii="Wingdings" w:hAnsi="Wingdings" w:hint="default"/>
+        <w:sz w:val="20"/>
+      </w:rPr>
+    </w:lvl>
+    <w:lvl w:ilvl="6" w:tentative="1">
+      <w:start w:val="1"/>
+      <w:numFmt w:val="bullet"/>
+      <w:lvlText w:val=""/>
+      <w:lvlJc w:val="left"/>
+      <w:pPr>
+        <w:tabs>
+          <w:tab w:val="num" w:pos="5040"/>
+        </w:tabs>
+        <w:ind w:left="5040" w:hanging="360"/>
+      </w:pPr>
+      <w:rPr>
+        <w:rFonts w:ascii="Wingdings" w:hAnsi="Wingdings" w:hint="default"/>
+        <w:sz w:val="20"/>
+      </w:rPr>
+    </w:lvl>
+    <w:lvl w:ilvl="7" w:tentative="1">
+      <w:start w:val="1"/>
+      <w:numFmt w:val="bullet"/>
+      <w:lvlText w:val=""/>
+      <w:lvlJc w:val="left"/>
+      <w:pPr>
+        <w:tabs>
+          <w:tab w:val="num" w:pos="5760"/>
+        </w:tabs>
+        <w:ind w:left="5760" w:hanging="360"/>
+      </w:pPr>
+      <w:rPr>
+        <w:rFonts w:ascii="Wingdings" w:hAnsi="Wingdings" w:hint="default"/>
+        <w:sz w:val="20"/>
+      </w:rPr>
+    </w:lvl>
+    <w:lvl w:ilvl="8" w:tentative="1">
+      <w:start w:val="1"/>
+      <w:numFmt w:val="bullet"/>
+      <w:lvlText w:val=""/>
+      <w:lvlJc w:val="left"/>
+      <w:pPr>
+        <w:tabs>
+          <w:tab w:val="num" w:pos="6480"/>
+        </w:tabs>
+        <w:ind w:left="6480" w:hanging="360"/>
+      </w:pPr>
+      <w:rPr>
+        <w:rFonts w:ascii="Wingdings" w:hAnsi="Wingdings" w:hint="default"/>
+        <w:sz w:val="20"/>
+      </w:rPr>
     </w:lvl>
   </w:abstractNum>
   <w:num w:numId="1" w16cid:durableId="1213882121">
@@ -806,7 +1889,25 @@
     <w:abstractNumId w:val="0"/>
   </w:num>
   <w:num w:numId="3" w16cid:durableId="872964064">
+    <w:abstractNumId w:val="5"/>
+  </w:num>
+  <w:num w:numId="4" w16cid:durableId="1608266724">
+    <w:abstractNumId w:val="3"/>
+  </w:num>
+  <w:num w:numId="5" w16cid:durableId="783423473">
+    <w:abstractNumId w:val="7"/>
+  </w:num>
+  <w:num w:numId="6" w16cid:durableId="868566141">
+    <w:abstractNumId w:val="6"/>
+  </w:num>
+  <w:num w:numId="7" w16cid:durableId="1005132898">
     <w:abstractNumId w:val="2"/>
+  </w:num>
+  <w:num w:numId="8" w16cid:durableId="347365037">
+    <w:abstractNumId w:val="8"/>
+  </w:num>
+  <w:num w:numId="9" w16cid:durableId="940262862">
+    <w:abstractNumId w:val="4"/>
   </w:num>
 </w:numbering>
 </file>

</xml_diff>

<commit_message>
Project Architecture Chart Added
</commit_message>
<xml_diff>
--- a/New Microsoft Word Document.docx
+++ b/New Microsoft Word Document.docx
@@ -212,11 +212,6 @@
       </w:r>
     </w:p>
     <w:p>
-      <w:pPr>
-        <w:rPr>
-          <w:lang w:val="ru-RU"/>
-        </w:rPr>
-      </w:pPr>
       <w:r>
         <w:rPr>
           <w:b/>
@@ -234,11 +229,6 @@
       </w:r>
     </w:p>
     <w:p>
-      <w:pPr>
-        <w:rPr>
-          <w:lang w:val="ru-RU"/>
-        </w:rPr>
-      </w:pPr>
       <w:r>
         <w:rPr>
           <w:b/>
@@ -346,11 +336,6 @@
       </w:r>
     </w:p>
     <w:p>
-      <w:pPr>
-        <w:rPr>
-          <w:lang w:val="ru-RU"/>
-        </w:rPr>
-      </w:pPr>
       <w:r>
         <w:rPr>
           <w:b/>
@@ -439,39 +424,7 @@
         </w:numPr>
       </w:pPr>
       <w:r>
-        <w:t xml:space="preserve">Using initial ticket features known at creation time: </w:t>
-      </w:r>
-      <w:proofErr w:type="spellStart"/>
-      <w:r>
-        <w:t>issue_type</w:t>
-      </w:r>
-      <w:proofErr w:type="spellEnd"/>
-      <w:r>
-        <w:t xml:space="preserve">, </w:t>
-      </w:r>
-      <w:proofErr w:type="spellStart"/>
-      <w:r>
-        <w:t>issue_priority</w:t>
-      </w:r>
-      <w:proofErr w:type="spellEnd"/>
-      <w:r>
-        <w:t xml:space="preserve">, </w:t>
-      </w:r>
-      <w:proofErr w:type="spellStart"/>
-      <w:r>
-        <w:t>issue_proj</w:t>
-      </w:r>
-      <w:proofErr w:type="spellEnd"/>
-      <w:r>
-        <w:t xml:space="preserve">, </w:t>
-      </w:r>
-      <w:proofErr w:type="spellStart"/>
-      <w:r>
-        <w:t>issue_contr_count</w:t>
-      </w:r>
-      <w:proofErr w:type="spellEnd"/>
-      <w:r>
-        <w:t>, and started date.</w:t>
+        <w:t>Using initial ticket features known at creation time: issue_type, issue_priority, issue_proj, issue_contr_count, and started date.</w:t>
       </w:r>
     </w:p>
     <w:p>
@@ -482,15 +435,7 @@
         </w:numPr>
       </w:pPr>
       <w:r>
-        <w:t xml:space="preserve">Predicting the numeric target variable </w:t>
-      </w:r>
-      <w:proofErr w:type="spellStart"/>
-      <w:r>
-        <w:t>wf_total_time</w:t>
-      </w:r>
-      <w:proofErr w:type="spellEnd"/>
-      <w:r>
-        <w:t xml:space="preserve"> (total workflow resolution time). </w:t>
+        <w:t xml:space="preserve">Predicting the numeric target variable wf_total_time (total workflow resolution time). </w:t>
       </w:r>
     </w:p>
     <w:p>
@@ -532,23 +477,7 @@
         </w:numPr>
       </w:pPr>
       <w:r>
-        <w:t xml:space="preserve">Intermediate workflow timer columns (such as </w:t>
-      </w:r>
-      <w:proofErr w:type="spellStart"/>
-      <w:r>
-        <w:t>wf_in_progress</w:t>
-      </w:r>
-      <w:proofErr w:type="spellEnd"/>
-      <w:r>
-        <w:t xml:space="preserve"> or </w:t>
-      </w:r>
-      <w:proofErr w:type="spellStart"/>
-      <w:r>
-        <w:t>wf_waiting</w:t>
-      </w:r>
-      <w:proofErr w:type="spellEnd"/>
-      <w:r>
-        <w:t>). Using them as inputs would cause data leakage because this data is unknown when a ticket first opens.</w:t>
+        <w:t>Intermediate workflow timer columns (such as wf_in_progress or wf_waiting). Using them as inputs would cause data leakage because this data is unknown when a ticket first opens.</w:t>
       </w:r>
     </w:p>
     <w:p>
@@ -562,7 +491,13 @@
         <w:t xml:space="preserve">Deploying the model into a live server. The project will run offline in Jupyter Notebook. </w:t>
       </w:r>
     </w:p>
-    <w:p/>
+    <w:p>
+      <w:pPr>
+        <w:rPr>
+          <w:lang w:val="en-GB"/>
+        </w:rPr>
+      </w:pPr>
+    </w:p>
     <w:p>
       <w:pPr>
         <w:rPr>
@@ -584,15 +519,3205 @@
     </w:p>
     <w:p>
       <w:r>
-        <w:t>The project will follow the standard Data Science Life Cycle. The first phase is data discovery to understand the business domain. The second phase is data preparation. In this phase, the data will be cleaned and transformed.</w:t>
+        <w:t xml:space="preserve">I will follow the Data Science Life Cycle from our lectures (Sumathi et al., 2022), which matches CRISP-DM: </w:t>
       </w:r>
     </w:p>
     <w:p>
-      <w:r>
+      <w:pPr>
+        <w:numPr>
+          <w:ilvl w:val="0"/>
+          <w:numId w:val="10"/>
+        </w:numPr>
+      </w:pPr>
+      <w:r>
+        <w:rPr>
+          <w:b/>
+          <w:bCs/>
+        </w:rPr>
         <w:lastRenderedPageBreak/>
-        <w:t>The project will use predictive modelling techniques. Because the target variable is a continuous number, the project will use regression algorithms. The model planning phase will start with a simple algorithm like Linear Regression. Then, the project will use a Random Forest Regressor to capture more complex patterns in the data.</w:t>
+        <w:t>Discovery (CA1):</w:t>
+      </w:r>
+      <w:r>
+        <w:t xml:space="preserve"> I learn about the IT support problem, check my data file, and write my plan and hypothesis (Sumathi et al., 2022). </w:t>
       </w:r>
     </w:p>
+    <w:p>
+      <w:pPr>
+        <w:numPr>
+          <w:ilvl w:val="0"/>
+          <w:numId w:val="10"/>
+        </w:numPr>
+      </w:pPr>
+      <w:r>
+        <w:rPr>
+          <w:b/>
+          <w:bCs/>
+        </w:rPr>
+        <w:t>Data Preparation (Semester 1 - CA2):</w:t>
+      </w:r>
+      <w:r>
+        <w:t xml:space="preserve"> Raw data is messy. I will use Python in Jupyter Notebook to filter dates (2016–2023), fix missing values in issue_assignee, delete unfinished tickets, change text words into numbers, and apply feature scaling. </w:t>
+      </w:r>
+    </w:p>
+    <w:p>
+      <w:pPr>
+        <w:numPr>
+          <w:ilvl w:val="0"/>
+          <w:numId w:val="10"/>
+        </w:numPr>
+      </w:pPr>
+      <w:r>
+        <w:rPr>
+          <w:b/>
+          <w:bCs/>
+        </w:rPr>
+        <w:t>Model Planning (Semester 2 - CA3):</w:t>
+      </w:r>
+      <w:r>
+        <w:t xml:space="preserve"> In class, we learned that when we predict a number (like time), we must use Regression, not Classification or Forecasting. </w:t>
+      </w:r>
+    </w:p>
+    <w:p>
+      <w:pPr>
+        <w:numPr>
+          <w:ilvl w:val="0"/>
+          <w:numId w:val="10"/>
+        </w:numPr>
+      </w:pPr>
+      <w:r>
+        <w:rPr>
+          <w:b/>
+          <w:bCs/>
+        </w:rPr>
+        <w:t>Model Building (Semester 2 - CA3):</w:t>
+      </w:r>
+      <w:r>
+        <w:t xml:space="preserve"> I will split my clean data into 80% for training and 20% for testing. I will start with a simple Linear Regression model, and then build a Random Forest Regressor, which finds harder patterns in ticket data (Gerunov, 2022; Saputra et al., 2024). </w:t>
+      </w:r>
+    </w:p>
+    <w:p>
+      <w:pPr>
+        <w:numPr>
+          <w:ilvl w:val="0"/>
+          <w:numId w:val="10"/>
+        </w:numPr>
+      </w:pPr>
+      <w:r>
+        <w:rPr>
+          <w:b/>
+          <w:bCs/>
+        </w:rPr>
+        <w:t>Communicate Results:</w:t>
+      </w:r>
+      <w:r>
+        <w:t xml:space="preserve"> Managers need models that are clear and easy to trust (Sumathi et al., 2022). I will check my models using Mean Absolute Error (MAE), Root Mean Squared Error (RMSE), and R-squared (</w:t>
+      </w:r>
+      <m:oMath>
+        <m:sSup>
+          <m:sSupPr>
+            <m:ctrlPr>
+              <w:rPr>
+                <w:rFonts w:ascii="Cambria Math" w:hAnsi="Cambria Math"/>
+              </w:rPr>
+            </m:ctrlPr>
+          </m:sSupPr>
+          <m:e>
+            <m:r>
+              <w:rPr>
+                <w:rFonts w:ascii="Cambria Math" w:hAnsi="Cambria Math"/>
+              </w:rPr>
+              <m:t>R</m:t>
+            </m:r>
+          </m:e>
+          <m:sup>
+            <m:r>
+              <w:rPr>
+                <w:rFonts w:ascii="Cambria Math" w:hAnsi="Cambria Math"/>
+              </w:rPr>
+              <m:t>2</m:t>
+            </m:r>
+          </m:sup>
+        </m:sSup>
+      </m:oMath>
+      <w:r>
+        <w:t xml:space="preserve">), and make a feature importance chart. </w:t>
+      </w:r>
+    </w:p>
+    <w:p>
+      <w:pPr>
+        <w:numPr>
+          <w:ilvl w:val="0"/>
+          <w:numId w:val="10"/>
+        </w:numPr>
+      </w:pPr>
+      <w:r>
+        <w:rPr>
+          <w:b/>
+          <w:bCs/>
+        </w:rPr>
+        <w:t>Operationalize:</w:t>
+      </w:r>
+      <w:r>
+        <w:t xml:space="preserve"> </w:t>
+      </w:r>
+      <w:r>
+        <w:t>Documenting the final code and recommendations for future business use.</w:t>
+      </w:r>
+    </w:p>
+    <w:p>
+      <w:pPr>
+        <w:rPr>
+          <w:b/>
+          <w:bCs/>
+        </w:rPr>
+      </w:pPr>
+      <w:r>
+        <w:rPr>
+          <w:b/>
+          <w:bCs/>
+        </w:rPr>
+        <w:t xml:space="preserve">Software Justification (Open-Source vs. Proprietary): </w:t>
+      </w:r>
+    </w:p>
+    <w:p>
+      <w:pPr>
+        <w:rPr>
+          <w:b/>
+          <w:bCs/>
+        </w:rPr>
+      </w:pPr>
+      <w:r>
+        <w:t>I will use open-source software (Python, Jupyter Notebook, Pandas, Scikit-Learn, Matplotlib) instead of proprietary tools (MATLAB or SAS). Open-source tools are free, flexible, and have strong community support. I will also use GitHub for version</w:t>
+      </w:r>
+      <w:r>
+        <w:rPr>
+          <w:b/>
+          <w:bCs/>
+        </w:rPr>
+        <w:t xml:space="preserve"> </w:t>
+      </w:r>
+      <w:r>
+        <w:t>control.</w:t>
+      </w:r>
+      <w:r>
+        <w:rPr>
+          <w:b/>
+          <w:bCs/>
+        </w:rPr>
+        <w:t xml:space="preserve"> </w:t>
+      </w:r>
+    </w:p>
+    <w:p>
+      <w:pPr>
+        <w:rPr>
+          <w:b/>
+          <w:bCs/>
+        </w:rPr>
+      </w:pPr>
+      <w:r>
+        <w:rPr>
+          <w:b/>
+          <w:bCs/>
+        </w:rPr>
+        <w:t>High-Level Architectural Diagram:</w:t>
+      </w:r>
+    </w:p>
+    <w:p>
+      <w:pPr>
+        <w:rPr>
+          <w:b/>
+          <w:bCs/>
+        </w:rPr>
+      </w:pPr>
+      <w:r>
+        <w:rPr>
+          <w:b/>
+          <w:bCs/>
+          <w:noProof/>
+        </w:rPr>
+        <mc:AlternateContent>
+          <mc:Choice Requires="wpg">
+            <w:drawing>
+              <wp:anchor distT="0" distB="0" distL="114300" distR="114300" simplePos="0" relativeHeight="251687936" behindDoc="0" locked="0" layoutInCell="1" allowOverlap="1" wp14:anchorId="0DE2CCCE" wp14:editId="0EF8DB5A">
+                <wp:simplePos x="0" y="0"/>
+                <wp:positionH relativeFrom="column">
+                  <wp:posOffset>-660694</wp:posOffset>
+                </wp:positionH>
+                <wp:positionV relativeFrom="paragraph">
+                  <wp:posOffset>120063</wp:posOffset>
+                </wp:positionV>
+                <wp:extent cx="7098181" cy="3536032"/>
+                <wp:effectExtent l="0" t="0" r="7620" b="26670"/>
+                <wp:wrapNone/>
+                <wp:docPr id="518058521" name="Group 17"/>
+                <wp:cNvGraphicFramePr/>
+                <a:graphic xmlns:a="http://schemas.openxmlformats.org/drawingml/2006/main">
+                  <a:graphicData uri="http://schemas.microsoft.com/office/word/2010/wordprocessingGroup">
+                    <wpg:wgp>
+                      <wpg:cNvGrpSpPr/>
+                      <wpg:grpSpPr>
+                        <a:xfrm>
+                          <a:off x="0" y="0"/>
+                          <a:ext cx="7098181" cy="3536032"/>
+                          <a:chOff x="0" y="0"/>
+                          <a:chExt cx="7098181" cy="3536032"/>
+                        </a:xfrm>
+                      </wpg:grpSpPr>
+                      <wpg:grpSp>
+                        <wpg:cNvPr id="556313692" name="Group 8"/>
+                        <wpg:cNvGrpSpPr/>
+                        <wpg:grpSpPr>
+                          <a:xfrm>
+                            <a:off x="0" y="665979"/>
+                            <a:ext cx="1580380" cy="2082506"/>
+                            <a:chOff x="0" y="0"/>
+                            <a:chExt cx="1395385" cy="1902460"/>
+                          </a:xfrm>
+                        </wpg:grpSpPr>
+                        <wps:wsp>
+                          <wps:cNvPr id="1426133891" name="Rectangle: Rounded Corners 1"/>
+                          <wps:cNvSpPr/>
+                          <wps:spPr>
+                            <a:xfrm>
+                              <a:off x="0" y="0"/>
+                              <a:ext cx="1395385" cy="1902460"/>
+                            </a:xfrm>
+                            <a:prstGeom prst="roundRect">
+                              <a:avLst/>
+                            </a:prstGeom>
+                            <a:solidFill>
+                              <a:schemeClr val="accent1">
+                                <a:lumMod val="20000"/>
+                                <a:lumOff val="80000"/>
+                              </a:schemeClr>
+                            </a:solidFill>
+                            <a:ln>
+                              <a:solidFill>
+                                <a:schemeClr val="accent1"/>
+                              </a:solidFill>
+                            </a:ln>
+                          </wps:spPr>
+                          <wps:style>
+                            <a:lnRef idx="2">
+                              <a:schemeClr val="accent1">
+                                <a:shade val="15000"/>
+                              </a:schemeClr>
+                            </a:lnRef>
+                            <a:fillRef idx="1">
+                              <a:schemeClr val="accent1"/>
+                            </a:fillRef>
+                            <a:effectRef idx="0">
+                              <a:schemeClr val="accent1"/>
+                            </a:effectRef>
+                            <a:fontRef idx="minor">
+                              <a:schemeClr val="lt1"/>
+                            </a:fontRef>
+                          </wps:style>
+                          <wps:bodyPr rot="0" spcFirstLastPara="0" vertOverflow="overflow" horzOverflow="overflow" vert="horz" wrap="square" lIns="91440" tIns="45720" rIns="91440" bIns="45720" numCol="1" spcCol="0" rtlCol="0" fromWordArt="0" anchor="ctr" anchorCtr="0" forceAA="0" compatLnSpc="1">
+                            <a:prstTxWarp prst="textNoShape">
+                              <a:avLst/>
+                            </a:prstTxWarp>
+                            <a:noAutofit/>
+                          </wps:bodyPr>
+                        </wps:wsp>
+                        <wps:wsp>
+                          <wps:cNvPr id="1587734522" name="Text Box 3"/>
+                          <wps:cNvSpPr txBox="1"/>
+                          <wps:spPr>
+                            <a:xfrm>
+                              <a:off x="110996" y="10571"/>
+                              <a:ext cx="1172864" cy="427524"/>
+                            </a:xfrm>
+                            <a:prstGeom prst="rect">
+                              <a:avLst/>
+                            </a:prstGeom>
+                            <a:noFill/>
+                            <a:ln w="6350">
+                              <a:noFill/>
+                            </a:ln>
+                          </wps:spPr>
+                          <wps:txbx>
+                            <w:txbxContent>
+                              <w:p>
+                                <w:pPr>
+                                  <w:jc w:val="center"/>
+                                  <w:rPr>
+                                    <w:b/>
+                                    <w:bCs/>
+                                    <w:color w:val="156082" w:themeColor="accent1"/>
+                                    <w:sz w:val="22"/>
+                                    <w:szCs w:val="22"/>
+                                    <w:lang w:val="en-GB"/>
+                                  </w:rPr>
+                                </w:pPr>
+                                <w:r>
+                                  <w:rPr>
+                                    <w:b/>
+                                    <w:bCs/>
+                                    <w:color w:val="156082" w:themeColor="accent1"/>
+                                    <w:sz w:val="22"/>
+                                    <w:szCs w:val="22"/>
+                                    <w:lang w:val="en-GB"/>
+                                  </w:rPr>
+                                  <w:t>1.</w:t>
+                                </w:r>
+                                <w:r>
+                                  <w:rPr>
+                                    <w:b/>
+                                    <w:bCs/>
+                                    <w:color w:val="156082" w:themeColor="accent1"/>
+                                    <w:sz w:val="22"/>
+                                    <w:szCs w:val="22"/>
+                                    <w:lang w:val="en-GB"/>
+                                  </w:rPr>
+                                  <w:t>D</w:t>
+                                </w:r>
+                                <w:r>
+                                  <w:rPr>
+                                    <w:b/>
+                                    <w:bCs/>
+                                    <w:color w:val="156082" w:themeColor="accent1"/>
+                                    <w:sz w:val="22"/>
+                                    <w:szCs w:val="22"/>
+                                    <w:lang w:val="en-GB"/>
+                                  </w:rPr>
+                                  <w:t xml:space="preserve">ata Discovery </w:t>
+                                </w:r>
+                                <w:r>
+                                  <w:rPr>
+                                    <w:b/>
+                                    <w:bCs/>
+                                    <w:color w:val="156082" w:themeColor="accent1"/>
+                                    <w:sz w:val="22"/>
+                                    <w:szCs w:val="22"/>
+                                    <w:lang w:val="en-GB"/>
+                                  </w:rPr>
+                                  <w:t>&amp; Source</w:t>
+                                </w:r>
+                              </w:p>
+                            </w:txbxContent>
+                          </wps:txbx>
+                          <wps:bodyPr rot="0" spcFirstLastPara="0" vertOverflow="overflow" horzOverflow="overflow" vert="horz" wrap="square" lIns="91440" tIns="45720" rIns="91440" bIns="45720" numCol="1" spcCol="0" rtlCol="0" fromWordArt="0" anchor="t" anchorCtr="0" forceAA="0" compatLnSpc="1">
+                            <a:prstTxWarp prst="textNoShape">
+                              <a:avLst/>
+                            </a:prstTxWarp>
+                            <a:noAutofit/>
+                          </wps:bodyPr>
+                        </wps:wsp>
+                        <wps:wsp>
+                          <wps:cNvPr id="273491939" name="Text Box 7"/>
+                          <wps:cNvSpPr txBox="1"/>
+                          <wps:spPr>
+                            <a:xfrm>
+                              <a:off x="0" y="465128"/>
+                              <a:ext cx="1337244" cy="1379220"/>
+                            </a:xfrm>
+                            <a:prstGeom prst="rect">
+                              <a:avLst/>
+                            </a:prstGeom>
+                            <a:noFill/>
+                            <a:ln w="6350">
+                              <a:noFill/>
+                            </a:ln>
+                          </wps:spPr>
+                          <wps:txbx>
+                            <w:txbxContent>
+                              <w:p>
+                                <w:pPr>
+                                  <w:spacing w:line="240" w:lineRule="auto"/>
+                                  <w:rPr>
+                                    <w:b/>
+                                    <w:bCs/>
+                                    <w:sz w:val="20"/>
+                                    <w:szCs w:val="20"/>
+                                    <w:lang w:val="en-GB"/>
+                                  </w:rPr>
+                                </w:pPr>
+                                <w:r>
+                                  <w:rPr>
+                                    <w:b/>
+                                    <w:bCs/>
+                                    <w:sz w:val="22"/>
+                                    <w:szCs w:val="22"/>
+                                    <w:lang w:val="en-GB"/>
+                                  </w:rPr>
+                                  <w:t>-</w:t>
+                                </w:r>
+                                <w:r>
+                                  <w:rPr>
+                                    <w:sz w:val="20"/>
+                                    <w:szCs w:val="20"/>
+                                    <w:lang w:val="en-GB"/>
+                                  </w:rPr>
+                                  <w:t xml:space="preserve">  </w:t>
+                                </w:r>
+                                <w:r>
+                                  <w:rPr>
+                                    <w:b/>
+                                    <w:bCs/>
+                                    <w:sz w:val="20"/>
+                                    <w:szCs w:val="20"/>
+                                    <w:lang w:val="en-GB"/>
+                                  </w:rPr>
+                                  <w:t>Dataset: issues.csv</w:t>
+                                </w:r>
+                              </w:p>
+                              <w:p>
+                                <w:pPr>
+                                  <w:spacing w:line="240" w:lineRule="auto"/>
+                                  <w:rPr>
+                                    <w:b/>
+                                    <w:bCs/>
+                                    <w:sz w:val="20"/>
+                                    <w:szCs w:val="20"/>
+                                  </w:rPr>
+                                </w:pPr>
+                                <w:r>
+                                  <w:rPr>
+                                    <w:b/>
+                                    <w:bCs/>
+                                    <w:sz w:val="22"/>
+                                    <w:szCs w:val="22"/>
+                                    <w:lang w:val="en-GB"/>
+                                  </w:rPr>
+                                  <w:t>-</w:t>
+                                </w:r>
+                                <w:r>
+                                  <w:rPr>
+                                    <w:b/>
+                                    <w:bCs/>
+                                    <w:sz w:val="20"/>
+                                    <w:szCs w:val="20"/>
+                                    <w:lang w:val="en-GB"/>
+                                  </w:rPr>
+                                  <w:t xml:space="preserve"> </w:t>
+                                </w:r>
+                                <w:r>
+                                  <w:rPr>
+                                    <w:b/>
+                                    <w:bCs/>
+                                    <w:sz w:val="20"/>
+                                    <w:szCs w:val="20"/>
+                                    <w:lang w:val="en-GB"/>
+                                  </w:rPr>
+                                  <w:t>66</w:t>
+                                </w:r>
+                                <w:r>
+                                  <w:rPr>
+                                    <w:b/>
+                                    <w:bCs/>
+                                    <w:sz w:val="20"/>
+                                    <w:szCs w:val="20"/>
+                                    <w:lang w:val="en-GB"/>
+                                  </w:rPr>
+                                  <w:t>,691 IT records</w:t>
+                                </w:r>
+                              </w:p>
+                              <w:p>
+                                <w:pPr>
+                                  <w:spacing w:line="240" w:lineRule="auto"/>
+                                  <w:rPr>
+                                    <w:b/>
+                                    <w:bCs/>
+                                    <w:sz w:val="20"/>
+                                    <w:szCs w:val="20"/>
+                                  </w:rPr>
+                                </w:pPr>
+                                <w:r>
+                                  <w:rPr>
+                                    <w:b/>
+                                    <w:bCs/>
+                                    <w:sz w:val="22"/>
+                                    <w:szCs w:val="22"/>
+                                    <w:lang w:val="en-GB"/>
+                                  </w:rPr>
+                                  <w:t>-</w:t>
+                                </w:r>
+                                <w:r>
+                                  <w:rPr>
+                                    <w:b/>
+                                    <w:bCs/>
+                                    <w:sz w:val="20"/>
+                                    <w:szCs w:val="20"/>
+                                    <w:lang w:val="en-GB"/>
+                                  </w:rPr>
+                                  <w:t xml:space="preserve"> </w:t>
+                                </w:r>
+                                <w:r>
+                                  <w:rPr>
+                                    <w:b/>
+                                    <w:bCs/>
+                                    <w:sz w:val="20"/>
+                                    <w:szCs w:val="20"/>
+                                    <w:lang w:val="en-GB"/>
+                                  </w:rPr>
+                                  <w:t>Filter 2016-2023</w:t>
+                                </w:r>
+                              </w:p>
+                              <w:p>
+                                <w:pPr>
+                                  <w:spacing w:line="240" w:lineRule="auto"/>
+                                  <w:rPr>
+                                    <w:b/>
+                                    <w:bCs/>
+                                    <w:sz w:val="20"/>
+                                    <w:szCs w:val="20"/>
+                                  </w:rPr>
+                                </w:pPr>
+                                <w:r>
+                                  <w:rPr>
+                                    <w:b/>
+                                    <w:bCs/>
+                                    <w:sz w:val="22"/>
+                                    <w:szCs w:val="22"/>
+                                    <w:lang w:val="en-GB"/>
+                                  </w:rPr>
+                                  <w:t>-</w:t>
+                                </w:r>
+                                <w:r>
+                                  <w:rPr>
+                                    <w:b/>
+                                    <w:bCs/>
+                                    <w:sz w:val="20"/>
+                                    <w:szCs w:val="20"/>
+                                    <w:lang w:val="en-GB"/>
+                                  </w:rPr>
+                                  <w:t xml:space="preserve"> </w:t>
+                                </w:r>
+                                <w:r>
+                                  <w:rPr>
+                                    <w:b/>
+                                    <w:bCs/>
+                                    <w:sz w:val="20"/>
+                                    <w:szCs w:val="20"/>
+                                    <w:lang w:val="en-GB"/>
+                                  </w:rPr>
+                                  <w:t>Identify target:</w:t>
+                                </w:r>
+                                <w:r>
+                                  <w:rPr>
+                                    <w:b/>
+                                    <w:bCs/>
+                                    <w:sz w:val="20"/>
+                                    <w:szCs w:val="20"/>
+                                    <w:lang w:val="en-GB"/>
+                                  </w:rPr>
+                                  <w:t xml:space="preserve"> wf_total_time</w:t>
+                                </w:r>
+                              </w:p>
+                            </w:txbxContent>
+                          </wps:txbx>
+                          <wps:bodyPr rot="0" spcFirstLastPara="0" vertOverflow="overflow" horzOverflow="overflow" vert="horz" wrap="square" lIns="91440" tIns="45720" rIns="91440" bIns="45720" numCol="1" spcCol="0" rtlCol="0" fromWordArt="0" anchor="t" anchorCtr="0" forceAA="0" compatLnSpc="1">
+                            <a:prstTxWarp prst="textNoShape">
+                              <a:avLst/>
+                            </a:prstTxWarp>
+                            <a:noAutofit/>
+                          </wps:bodyPr>
+                        </wps:wsp>
+                      </wpg:grpSp>
+                      <wpg:grpSp>
+                        <wpg:cNvPr id="1674261529" name="Group 9"/>
+                        <wpg:cNvGrpSpPr/>
+                        <wpg:grpSpPr>
+                          <a:xfrm>
+                            <a:off x="1818229" y="671264"/>
+                            <a:ext cx="1696085" cy="2087245"/>
+                            <a:chOff x="0" y="0"/>
+                            <a:chExt cx="1522238" cy="1907746"/>
+                          </a:xfrm>
+                        </wpg:grpSpPr>
+                        <wps:wsp>
+                          <wps:cNvPr id="974686362" name="Rectangle: Rounded Corners 1"/>
+                          <wps:cNvSpPr/>
+                          <wps:spPr>
+                            <a:xfrm>
+                              <a:off x="68714" y="5286"/>
+                              <a:ext cx="1357985" cy="1902460"/>
+                            </a:xfrm>
+                            <a:prstGeom prst="roundRect">
+                              <a:avLst/>
+                            </a:prstGeom>
+                            <a:solidFill>
+                              <a:schemeClr val="accent1">
+                                <a:lumMod val="20000"/>
+                                <a:lumOff val="80000"/>
+                              </a:schemeClr>
+                            </a:solidFill>
+                            <a:ln>
+                              <a:solidFill>
+                                <a:schemeClr val="tx2">
+                                  <a:lumMod val="75000"/>
+                                  <a:lumOff val="25000"/>
+                                </a:schemeClr>
+                              </a:solidFill>
+                            </a:ln>
+                          </wps:spPr>
+                          <wps:style>
+                            <a:lnRef idx="2">
+                              <a:schemeClr val="accent1">
+                                <a:shade val="15000"/>
+                              </a:schemeClr>
+                            </a:lnRef>
+                            <a:fillRef idx="1">
+                              <a:schemeClr val="accent1"/>
+                            </a:fillRef>
+                            <a:effectRef idx="0">
+                              <a:schemeClr val="accent1"/>
+                            </a:effectRef>
+                            <a:fontRef idx="minor">
+                              <a:schemeClr val="lt1"/>
+                            </a:fontRef>
+                          </wps:style>
+                          <wps:bodyPr rot="0" spcFirstLastPara="0" vertOverflow="overflow" horzOverflow="overflow" vert="horz" wrap="square" lIns="91440" tIns="45720" rIns="91440" bIns="45720" numCol="1" spcCol="0" rtlCol="0" fromWordArt="0" anchor="ctr" anchorCtr="0" forceAA="0" compatLnSpc="1">
+                            <a:prstTxWarp prst="textNoShape">
+                              <a:avLst/>
+                            </a:prstTxWarp>
+                            <a:noAutofit/>
+                          </wps:bodyPr>
+                        </wps:wsp>
+                        <wps:wsp>
+                          <wps:cNvPr id="272576344" name="Text Box 3"/>
+                          <wps:cNvSpPr txBox="1"/>
+                          <wps:spPr>
+                            <a:xfrm>
+                              <a:off x="126854" y="0"/>
+                              <a:ext cx="1278483" cy="454400"/>
+                            </a:xfrm>
+                            <a:prstGeom prst="rect">
+                              <a:avLst/>
+                            </a:prstGeom>
+                            <a:noFill/>
+                            <a:ln w="6350">
+                              <a:noFill/>
+                            </a:ln>
+                          </wps:spPr>
+                          <wps:txbx>
+                            <w:txbxContent>
+                              <w:p>
+                                <w:pPr>
+                                  <w:jc w:val="center"/>
+                                  <w:rPr>
+                                    <w:b/>
+                                    <w:bCs/>
+                                    <w:color w:val="156082" w:themeColor="accent1"/>
+                                    <w:sz w:val="22"/>
+                                    <w:szCs w:val="22"/>
+                                    <w:lang w:val="en-GB"/>
+                                  </w:rPr>
+                                </w:pPr>
+                                <w:r>
+                                  <w:rPr>
+                                    <w:b/>
+                                    <w:bCs/>
+                                    <w:color w:val="156082" w:themeColor="accent1"/>
+                                    <w:sz w:val="22"/>
+                                    <w:szCs w:val="22"/>
+                                    <w:lang w:val="en-GB"/>
+                                  </w:rPr>
+                                  <w:t>2.Data Preparation &amp; EDA (CA2)</w:t>
+                                </w:r>
+                              </w:p>
+                            </w:txbxContent>
+                          </wps:txbx>
+                          <wps:bodyPr rot="0" spcFirstLastPara="0" vertOverflow="overflow" horzOverflow="overflow" vert="horz" wrap="square" lIns="91440" tIns="45720" rIns="91440" bIns="45720" numCol="1" spcCol="0" rtlCol="0" fromWordArt="0" anchor="t" anchorCtr="0" forceAA="0" compatLnSpc="1">
+                            <a:prstTxWarp prst="textNoShape">
+                              <a:avLst/>
+                            </a:prstTxWarp>
+                            <a:noAutofit/>
+                          </wps:bodyPr>
+                        </wps:wsp>
+                        <wps:wsp>
+                          <wps:cNvPr id="1943021445" name="Text Box 7"/>
+                          <wps:cNvSpPr txBox="1"/>
+                          <wps:spPr>
+                            <a:xfrm>
+                              <a:off x="0" y="415756"/>
+                              <a:ext cx="1522238" cy="1358387"/>
+                            </a:xfrm>
+                            <a:prstGeom prst="rect">
+                              <a:avLst/>
+                            </a:prstGeom>
+                            <a:noFill/>
+                            <a:ln w="6350">
+                              <a:noFill/>
+                            </a:ln>
+                          </wps:spPr>
+                          <wps:txbx>
+                            <w:txbxContent>
+                              <w:p>
+                                <w:pPr>
+                                  <w:spacing w:line="240" w:lineRule="auto"/>
+                                  <w:rPr>
+                                    <w:b/>
+                                    <w:bCs/>
+                                    <w:sz w:val="20"/>
+                                    <w:szCs w:val="20"/>
+                                    <w:lang w:val="en-GB"/>
+                                  </w:rPr>
+                                </w:pPr>
+                                <w:r>
+                                  <w:rPr>
+                                    <w:b/>
+                                    <w:bCs/>
+                                    <w:sz w:val="22"/>
+                                    <w:szCs w:val="22"/>
+                                    <w:lang w:val="en-GB"/>
+                                  </w:rPr>
+                                  <w:t>-</w:t>
+                                </w:r>
+                                <w:r>
+                                  <w:rPr>
+                                    <w:sz w:val="20"/>
+                                    <w:szCs w:val="20"/>
+                                    <w:lang w:val="en-GB"/>
+                                  </w:rPr>
+                                  <w:t xml:space="preserve">  </w:t>
+                                </w:r>
+                                <w:r>
+                                  <w:rPr>
+                                    <w:b/>
+                                    <w:bCs/>
+                                    <w:sz w:val="20"/>
+                                    <w:szCs w:val="20"/>
+                                    <w:lang w:val="en-GB"/>
+                                  </w:rPr>
+                                  <w:t>Remove data leakage (intermediate wf_cols)</w:t>
+                                </w:r>
+                              </w:p>
+                              <w:p>
+                                <w:pPr>
+                                  <w:spacing w:line="240" w:lineRule="auto"/>
+                                  <w:rPr>
+                                    <w:b/>
+                                    <w:bCs/>
+                                    <w:sz w:val="20"/>
+                                    <w:szCs w:val="20"/>
+                                  </w:rPr>
+                                </w:pPr>
+                                <w:r>
+                                  <w:rPr>
+                                    <w:b/>
+                                    <w:bCs/>
+                                    <w:sz w:val="22"/>
+                                    <w:szCs w:val="22"/>
+                                    <w:lang w:val="en-GB"/>
+                                  </w:rPr>
+                                  <w:t>-</w:t>
+                                </w:r>
+                                <w:r>
+                                  <w:rPr>
+                                    <w:b/>
+                                    <w:bCs/>
+                                    <w:sz w:val="20"/>
+                                    <w:szCs w:val="20"/>
+                                    <w:lang w:val="en-GB"/>
+                                  </w:rPr>
+                                  <w:t xml:space="preserve"> </w:t>
+                                </w:r>
+                                <w:r>
+                                  <w:rPr>
+                                    <w:b/>
+                                    <w:bCs/>
+                                    <w:sz w:val="20"/>
+                                    <w:szCs w:val="20"/>
+                                    <w:lang w:val="en-GB"/>
+                                  </w:rPr>
+                                  <w:t>Handle missing val</w:t>
+                                </w:r>
+                                <w:r>
+                                  <w:rPr>
+                                    <w:b/>
+                                    <w:bCs/>
+                                    <w:sz w:val="20"/>
+                                    <w:szCs w:val="20"/>
+                                    <w:lang w:val="en-GB"/>
+                                  </w:rPr>
+                                  <w:t>ues</w:t>
+                                </w:r>
+                              </w:p>
+                              <w:p>
+                                <w:pPr>
+                                  <w:spacing w:line="240" w:lineRule="auto"/>
+                                  <w:rPr>
+                                    <w:b/>
+                                    <w:bCs/>
+                                    <w:sz w:val="20"/>
+                                    <w:szCs w:val="20"/>
+                                  </w:rPr>
+                                </w:pPr>
+                                <w:r>
+                                  <w:rPr>
+                                    <w:b/>
+                                    <w:bCs/>
+                                    <w:sz w:val="22"/>
+                                    <w:szCs w:val="22"/>
+                                    <w:lang w:val="en-GB"/>
+                                  </w:rPr>
+                                  <w:t>-</w:t>
+                                </w:r>
+                                <w:r>
+                                  <w:rPr>
+                                    <w:b/>
+                                    <w:bCs/>
+                                    <w:sz w:val="20"/>
+                                    <w:szCs w:val="20"/>
+                                    <w:lang w:val="en-GB"/>
+                                  </w:rPr>
+                                  <w:t xml:space="preserve"> </w:t>
+                                </w:r>
+                                <w:r>
+                                  <w:rPr>
+                                    <w:b/>
+                                    <w:bCs/>
+                                    <w:sz w:val="20"/>
+                                    <w:szCs w:val="20"/>
+                                    <w:lang w:val="en-GB"/>
+                                  </w:rPr>
+                                  <w:t>Encode categories</w:t>
+                                </w:r>
+                              </w:p>
+                              <w:p>
+                                <w:pPr>
+                                  <w:spacing w:line="240" w:lineRule="auto"/>
+                                  <w:rPr>
+                                    <w:b/>
+                                    <w:bCs/>
+                                    <w:sz w:val="20"/>
+                                    <w:szCs w:val="20"/>
+                                  </w:rPr>
+                                </w:pPr>
+                                <w:r>
+                                  <w:rPr>
+                                    <w:b/>
+                                    <w:bCs/>
+                                    <w:sz w:val="22"/>
+                                    <w:szCs w:val="22"/>
+                                    <w:lang w:val="en-GB"/>
+                                  </w:rPr>
+                                  <w:t>-</w:t>
+                                </w:r>
+                                <w:r>
+                                  <w:rPr>
+                                    <w:b/>
+                                    <w:bCs/>
+                                    <w:sz w:val="20"/>
+                                    <w:szCs w:val="20"/>
+                                    <w:lang w:val="en-GB"/>
+                                  </w:rPr>
+                                  <w:t xml:space="preserve"> </w:t>
+                                </w:r>
+                                <w:r>
+                                  <w:rPr>
+                                    <w:b/>
+                                    <w:bCs/>
+                                    <w:sz w:val="20"/>
+                                    <w:szCs w:val="20"/>
+                                    <w:lang w:val="en-GB"/>
+                                  </w:rPr>
+                                  <w:t>Feature scaling &amp; EDA</w:t>
+                                </w:r>
+                              </w:p>
+                              <w:p/>
+                            </w:txbxContent>
+                          </wps:txbx>
+                          <wps:bodyPr rot="0" spcFirstLastPara="0" vertOverflow="overflow" horzOverflow="overflow" vert="horz" wrap="square" lIns="91440" tIns="45720" rIns="91440" bIns="45720" numCol="1" spcCol="0" rtlCol="0" fromWordArt="0" anchor="t" anchorCtr="0" forceAA="0" compatLnSpc="1">
+                            <a:prstTxWarp prst="textNoShape">
+                              <a:avLst/>
+                            </a:prstTxWarp>
+                            <a:noAutofit/>
+                          </wps:bodyPr>
+                        </wps:wsp>
+                      </wpg:grpSp>
+                      <wpg:grpSp>
+                        <wpg:cNvPr id="560116727" name="Group 10"/>
+                        <wpg:cNvGrpSpPr/>
+                        <wpg:grpSpPr>
+                          <a:xfrm>
+                            <a:off x="3715741" y="628980"/>
+                            <a:ext cx="1579880" cy="2140648"/>
+                            <a:chOff x="0" y="0"/>
+                            <a:chExt cx="1580291" cy="2081100"/>
+                          </a:xfrm>
+                        </wpg:grpSpPr>
+                        <wps:wsp>
+                          <wps:cNvPr id="1940701393" name="Rectangle: Rounded Corners 1"/>
+                          <wps:cNvSpPr/>
+                          <wps:spPr>
+                            <a:xfrm>
+                              <a:off x="0" y="31713"/>
+                              <a:ext cx="1527524" cy="2049387"/>
+                            </a:xfrm>
+                            <a:prstGeom prst="roundRect">
+                              <a:avLst/>
+                            </a:prstGeom>
+                            <a:solidFill>
+                              <a:schemeClr val="accent2">
+                                <a:lumMod val="20000"/>
+                                <a:lumOff val="80000"/>
+                              </a:schemeClr>
+                            </a:solidFill>
+                            <a:ln>
+                              <a:solidFill>
+                                <a:schemeClr val="accent2"/>
+                              </a:solidFill>
+                            </a:ln>
+                          </wps:spPr>
+                          <wps:style>
+                            <a:lnRef idx="2">
+                              <a:schemeClr val="accent1">
+                                <a:shade val="15000"/>
+                              </a:schemeClr>
+                            </a:lnRef>
+                            <a:fillRef idx="1">
+                              <a:schemeClr val="accent1"/>
+                            </a:fillRef>
+                            <a:effectRef idx="0">
+                              <a:schemeClr val="accent1"/>
+                            </a:effectRef>
+                            <a:fontRef idx="minor">
+                              <a:schemeClr val="lt1"/>
+                            </a:fontRef>
+                          </wps:style>
+                          <wps:bodyPr rot="0" spcFirstLastPara="0" vertOverflow="overflow" horzOverflow="overflow" vert="horz" wrap="square" lIns="91440" tIns="45720" rIns="91440" bIns="45720" numCol="1" spcCol="0" rtlCol="0" fromWordArt="0" anchor="ctr" anchorCtr="0" forceAA="0" compatLnSpc="1">
+                            <a:prstTxWarp prst="textNoShape">
+                              <a:avLst/>
+                            </a:prstTxWarp>
+                            <a:noAutofit/>
+                          </wps:bodyPr>
+                        </wps:wsp>
+                        <wps:wsp>
+                          <wps:cNvPr id="28782981" name="Text Box 3"/>
+                          <wps:cNvSpPr txBox="1"/>
+                          <wps:spPr>
+                            <a:xfrm>
+                              <a:off x="79283" y="0"/>
+                              <a:ext cx="1337244" cy="448945"/>
+                            </a:xfrm>
+                            <a:prstGeom prst="rect">
+                              <a:avLst/>
+                            </a:prstGeom>
+                            <a:noFill/>
+                            <a:ln w="6350">
+                              <a:noFill/>
+                            </a:ln>
+                          </wps:spPr>
+                          <wps:txbx>
+                            <w:txbxContent>
+                              <w:p>
+                                <w:pPr>
+                                  <w:jc w:val="center"/>
+                                  <w:rPr>
+                                    <w:b/>
+                                    <w:bCs/>
+                                    <w:color w:val="E97132" w:themeColor="accent2"/>
+                                    <w:sz w:val="22"/>
+                                    <w:szCs w:val="22"/>
+                                    <w:lang w:val="en-GB"/>
+                                  </w:rPr>
+                                </w:pPr>
+                                <w:r>
+                                  <w:rPr>
+                                    <w:b/>
+                                    <w:bCs/>
+                                    <w:color w:val="E97132" w:themeColor="accent2"/>
+                                    <w:sz w:val="22"/>
+                                    <w:szCs w:val="22"/>
+                                    <w:lang w:val="en-GB"/>
+                                  </w:rPr>
+                                  <w:t xml:space="preserve">3.Model Planning &amp; </w:t>
+                                </w:r>
+                                <w:r>
+                                  <w:rPr>
+                                    <w:b/>
+                                    <w:bCs/>
+                                    <w:color w:val="E97132" w:themeColor="accent2"/>
+                                    <w:sz w:val="22"/>
+                                    <w:szCs w:val="22"/>
+                                    <w:lang w:val="en-GB"/>
+                                  </w:rPr>
+                                  <w:t>B</w:t>
+                                </w:r>
+                                <w:r>
+                                  <w:rPr>
+                                    <w:b/>
+                                    <w:bCs/>
+                                    <w:color w:val="E97132" w:themeColor="accent2"/>
+                                    <w:sz w:val="22"/>
+                                    <w:szCs w:val="22"/>
+                                    <w:lang w:val="en-GB"/>
+                                  </w:rPr>
+                                  <w:t>uilding (CA3)</w:t>
+                                </w:r>
+                              </w:p>
+                            </w:txbxContent>
+                          </wps:txbx>
+                          <wps:bodyPr rot="0" spcFirstLastPara="0" vertOverflow="overflow" horzOverflow="overflow" vert="horz" wrap="square" lIns="91440" tIns="45720" rIns="91440" bIns="45720" numCol="1" spcCol="0" rtlCol="0" fromWordArt="0" anchor="t" anchorCtr="0" forceAA="0" compatLnSpc="1">
+                            <a:prstTxWarp prst="textNoShape">
+                              <a:avLst/>
+                            </a:prstTxWarp>
+                            <a:noAutofit/>
+                          </wps:bodyPr>
+                        </wps:wsp>
+                        <wps:wsp>
+                          <wps:cNvPr id="1601057792" name="Text Box 7"/>
+                          <wps:cNvSpPr txBox="1"/>
+                          <wps:spPr>
+                            <a:xfrm>
+                              <a:off x="10571" y="454557"/>
+                              <a:ext cx="1569720" cy="1537522"/>
+                            </a:xfrm>
+                            <a:prstGeom prst="rect">
+                              <a:avLst/>
+                            </a:prstGeom>
+                            <a:noFill/>
+                            <a:ln w="6350">
+                              <a:noFill/>
+                            </a:ln>
+                          </wps:spPr>
+                          <wps:txbx>
+                            <w:txbxContent>
+                              <w:p>
+                                <w:pPr>
+                                  <w:spacing w:line="240" w:lineRule="auto"/>
+                                  <w:rPr>
+                                    <w:b/>
+                                    <w:bCs/>
+                                    <w:sz w:val="20"/>
+                                    <w:szCs w:val="20"/>
+                                    <w:lang w:val="en-GB"/>
+                                  </w:rPr>
+                                </w:pPr>
+                                <w:r>
+                                  <w:rPr>
+                                    <w:b/>
+                                    <w:bCs/>
+                                    <w:sz w:val="22"/>
+                                    <w:szCs w:val="22"/>
+                                    <w:lang w:val="en-GB"/>
+                                  </w:rPr>
+                                  <w:t>-</w:t>
+                                </w:r>
+                                <w:r>
+                                  <w:rPr>
+                                    <w:sz w:val="20"/>
+                                    <w:szCs w:val="20"/>
+                                    <w:lang w:val="en-GB"/>
+                                  </w:rPr>
+                                  <w:t xml:space="preserve">  </w:t>
+                                </w:r>
+                                <w:r>
+                                  <w:rPr>
+                                    <w:b/>
+                                    <w:bCs/>
+                                    <w:sz w:val="20"/>
+                                    <w:szCs w:val="20"/>
+                                    <w:lang w:val="en-GB"/>
+                                  </w:rPr>
+                                  <w:t>Train/Test</w:t>
+                                </w:r>
+                                <w:r>
+                                  <w:rPr>
+                                    <w:b/>
+                                    <w:bCs/>
+                                    <w:sz w:val="20"/>
+                                    <w:szCs w:val="20"/>
+                                    <w:lang w:val="en-GB"/>
+                                  </w:rPr>
+                                  <w:t xml:space="preserve"> Split (80/20)</w:t>
+                                </w:r>
+                              </w:p>
+                              <w:p>
+                                <w:pPr>
+                                  <w:spacing w:line="240" w:lineRule="auto"/>
+                                  <w:rPr>
+                                    <w:b/>
+                                    <w:bCs/>
+                                    <w:sz w:val="20"/>
+                                    <w:szCs w:val="20"/>
+                                  </w:rPr>
+                                </w:pPr>
+                                <w:r>
+                                  <w:rPr>
+                                    <w:b/>
+                                    <w:bCs/>
+                                    <w:sz w:val="22"/>
+                                    <w:szCs w:val="22"/>
+                                    <w:lang w:val="en-GB"/>
+                                  </w:rPr>
+                                  <w:t>-</w:t>
+                                </w:r>
+                                <w:r>
+                                  <w:rPr>
+                                    <w:b/>
+                                    <w:bCs/>
+                                    <w:sz w:val="20"/>
+                                    <w:szCs w:val="20"/>
+                                    <w:lang w:val="en-GB"/>
+                                  </w:rPr>
+                                  <w:t xml:space="preserve"> </w:t>
+                                </w:r>
+                                <w:r>
+                                  <w:rPr>
+                                    <w:b/>
+                                    <w:bCs/>
+                                    <w:sz w:val="20"/>
+                                    <w:szCs w:val="20"/>
+                                    <w:lang w:val="en-GB"/>
+                                  </w:rPr>
+                                  <w:t>Baseline Model: Line</w:t>
+                                </w:r>
+                                <w:r>
+                                  <w:rPr>
+                                    <w:b/>
+                                    <w:bCs/>
+                                    <w:sz w:val="20"/>
+                                    <w:szCs w:val="20"/>
+                                    <w:lang w:val="en-GB"/>
+                                  </w:rPr>
+                                  <w:t>a</w:t>
+                                </w:r>
+                                <w:r>
+                                  <w:rPr>
+                                    <w:b/>
+                                    <w:bCs/>
+                                    <w:sz w:val="20"/>
+                                    <w:szCs w:val="20"/>
+                                    <w:lang w:val="en-GB"/>
+                                  </w:rPr>
+                                  <w:t>r</w:t>
+                                </w:r>
+                                <w:r>
+                                  <w:rPr>
+                                    <w:b/>
+                                    <w:bCs/>
+                                    <w:sz w:val="20"/>
+                                    <w:szCs w:val="20"/>
+                                    <w:lang w:val="en-GB"/>
+                                  </w:rPr>
+                                  <w:t xml:space="preserve"> Regression</w:t>
+                                </w:r>
+                              </w:p>
+                              <w:p>
+                                <w:pPr>
+                                  <w:spacing w:line="240" w:lineRule="auto"/>
+                                  <w:rPr>
+                                    <w:b/>
+                                    <w:bCs/>
+                                    <w:sz w:val="20"/>
+                                    <w:szCs w:val="20"/>
+                                  </w:rPr>
+                                </w:pPr>
+                                <w:r>
+                                  <w:rPr>
+                                    <w:b/>
+                                    <w:bCs/>
+                                    <w:sz w:val="22"/>
+                                    <w:szCs w:val="22"/>
+                                    <w:lang w:val="en-GB"/>
+                                  </w:rPr>
+                                  <w:t>-</w:t>
+                                </w:r>
+                                <w:r>
+                                  <w:rPr>
+                                    <w:b/>
+                                    <w:bCs/>
+                                    <w:sz w:val="20"/>
+                                    <w:szCs w:val="20"/>
+                                    <w:lang w:val="en-GB"/>
+                                  </w:rPr>
+                                  <w:t xml:space="preserve"> En</w:t>
+                                </w:r>
+                                <w:r>
+                                  <w:rPr>
+                                    <w:b/>
+                                    <w:bCs/>
+                                    <w:sz w:val="20"/>
+                                    <w:szCs w:val="20"/>
+                                    <w:lang w:val="en-GB"/>
+                                  </w:rPr>
+                                  <w:t>semble</w:t>
+                                </w:r>
+                                <w:r>
+                                  <w:rPr>
+                                    <w:b/>
+                                    <w:bCs/>
+                                    <w:sz w:val="20"/>
+                                    <w:szCs w:val="20"/>
+                                    <w:lang w:val="en-GB"/>
+                                  </w:rPr>
+                                  <w:t xml:space="preserve"> Model: Random Forest</w:t>
+                                </w:r>
+                              </w:p>
+                              <w:p>
+                                <w:pPr>
+                                  <w:spacing w:line="240" w:lineRule="auto"/>
+                                  <w:rPr>
+                                    <w:b/>
+                                    <w:bCs/>
+                                    <w:sz w:val="20"/>
+                                    <w:szCs w:val="20"/>
+                                  </w:rPr>
+                                </w:pPr>
+                                <w:r>
+                                  <w:rPr>
+                                    <w:b/>
+                                    <w:bCs/>
+                                    <w:sz w:val="22"/>
+                                    <w:szCs w:val="22"/>
+                                    <w:lang w:val="en-GB"/>
+                                  </w:rPr>
+                                  <w:t>-</w:t>
+                                </w:r>
+                                <w:r>
+                                  <w:rPr>
+                                    <w:b/>
+                                    <w:bCs/>
+                                    <w:sz w:val="20"/>
+                                    <w:szCs w:val="20"/>
+                                    <w:lang w:val="en-GB"/>
+                                  </w:rPr>
+                                  <w:t xml:space="preserve"> </w:t>
+                                </w:r>
+                                <w:r>
+                                  <w:rPr>
+                                    <w:b/>
+                                    <w:bCs/>
+                                    <w:sz w:val="20"/>
+                                    <w:szCs w:val="20"/>
+                                    <w:lang w:val="en-GB"/>
+                                  </w:rPr>
+                                  <w:t>Hy</w:t>
+                                </w:r>
+                                <w:r>
+                                  <w:rPr>
+                                    <w:b/>
+                                    <w:bCs/>
+                                    <w:sz w:val="20"/>
+                                    <w:szCs w:val="20"/>
+                                    <w:lang w:val="en-GB"/>
+                                  </w:rPr>
+                                  <w:t>perparameter tuning</w:t>
+                                </w:r>
+                              </w:p>
+                              <w:p/>
+                            </w:txbxContent>
+                          </wps:txbx>
+                          <wps:bodyPr rot="0" spcFirstLastPara="0" vertOverflow="overflow" horzOverflow="overflow" vert="horz" wrap="square" lIns="91440" tIns="45720" rIns="91440" bIns="45720" numCol="1" spcCol="0" rtlCol="0" fromWordArt="0" anchor="t" anchorCtr="0" forceAA="0" compatLnSpc="1">
+                            <a:prstTxWarp prst="textNoShape">
+                              <a:avLst/>
+                            </a:prstTxWarp>
+                            <a:noAutofit/>
+                          </wps:bodyPr>
+                        </wps:wsp>
+                      </wpg:grpSp>
+                      <wpg:grpSp>
+                        <wpg:cNvPr id="1309628945" name="Group 11"/>
+                        <wpg:cNvGrpSpPr/>
+                        <wpg:grpSpPr>
+                          <a:xfrm>
+                            <a:off x="5528685" y="676550"/>
+                            <a:ext cx="1569496" cy="2070016"/>
+                            <a:chOff x="0" y="0"/>
+                            <a:chExt cx="1559237" cy="2082506"/>
+                          </a:xfrm>
+                        </wpg:grpSpPr>
+                        <wps:wsp>
+                          <wps:cNvPr id="939970791" name="Rectangle: Rounded Corners 1"/>
+                          <wps:cNvSpPr/>
+                          <wps:spPr>
+                            <a:xfrm>
+                              <a:off x="0" y="0"/>
+                              <a:ext cx="1542286" cy="2082506"/>
+                            </a:xfrm>
+                            <a:prstGeom prst="roundRect">
+                              <a:avLst/>
+                            </a:prstGeom>
+                            <a:solidFill>
+                              <a:schemeClr val="accent1">
+                                <a:lumMod val="20000"/>
+                                <a:lumOff val="80000"/>
+                              </a:schemeClr>
+                            </a:solidFill>
+                            <a:ln>
+                              <a:solidFill>
+                                <a:schemeClr val="accent1"/>
+                              </a:solidFill>
+                            </a:ln>
+                          </wps:spPr>
+                          <wps:style>
+                            <a:lnRef idx="2">
+                              <a:schemeClr val="accent1">
+                                <a:shade val="15000"/>
+                              </a:schemeClr>
+                            </a:lnRef>
+                            <a:fillRef idx="1">
+                              <a:schemeClr val="accent1"/>
+                            </a:fillRef>
+                            <a:effectRef idx="0">
+                              <a:schemeClr val="accent1"/>
+                            </a:effectRef>
+                            <a:fontRef idx="minor">
+                              <a:schemeClr val="lt1"/>
+                            </a:fontRef>
+                          </wps:style>
+                          <wps:bodyPr rot="0" spcFirstLastPara="0" vertOverflow="overflow" horzOverflow="overflow" vert="horz" wrap="square" lIns="91440" tIns="45720" rIns="91440" bIns="45720" numCol="1" spcCol="0" rtlCol="0" fromWordArt="0" anchor="ctr" anchorCtr="0" forceAA="0" compatLnSpc="1">
+                            <a:prstTxWarp prst="textNoShape">
+                              <a:avLst/>
+                            </a:prstTxWarp>
+                            <a:noAutofit/>
+                          </wps:bodyPr>
+                        </wps:wsp>
+                        <wps:wsp>
+                          <wps:cNvPr id="2110357183" name="Text Box 3"/>
+                          <wps:cNvSpPr txBox="1"/>
+                          <wps:spPr>
+                            <a:xfrm>
+                              <a:off x="200729" y="36927"/>
+                              <a:ext cx="1222292" cy="464820"/>
+                            </a:xfrm>
+                            <a:prstGeom prst="rect">
+                              <a:avLst/>
+                            </a:prstGeom>
+                            <a:noFill/>
+                            <a:ln w="6350">
+                              <a:noFill/>
+                            </a:ln>
+                          </wps:spPr>
+                          <wps:txbx>
+                            <w:txbxContent>
+                              <w:p>
+                                <w:pPr>
+                                  <w:jc w:val="center"/>
+                                  <w:rPr>
+                                    <w:b/>
+                                    <w:bCs/>
+                                    <w:color w:val="156082" w:themeColor="accent1"/>
+                                    <w:sz w:val="22"/>
+                                    <w:szCs w:val="22"/>
+                                    <w:lang w:val="en-GB"/>
+                                  </w:rPr>
+                                </w:pPr>
+                                <w:r>
+                                  <w:rPr>
+                                    <w:b/>
+                                    <w:bCs/>
+                                    <w:color w:val="156082" w:themeColor="accent1"/>
+                                    <w:sz w:val="22"/>
+                                    <w:szCs w:val="22"/>
+                                    <w:lang w:val="en-GB"/>
+                                  </w:rPr>
+                                  <w:t>4.Evaluation &amp; Communicatio</w:t>
+                                </w:r>
+                                <w:r>
+                                  <w:rPr>
+                                    <w:b/>
+                                    <w:bCs/>
+                                    <w:color w:val="156082" w:themeColor="accent1"/>
+                                    <w:sz w:val="22"/>
+                                    <w:szCs w:val="22"/>
+                                    <w:lang w:val="en-GB"/>
+                                  </w:rPr>
+                                  <w:t>n</w:t>
+                                </w:r>
+                                <w:r>
+                                  <w:rPr>
+                                    <w:b/>
+                                    <w:bCs/>
+                                    <w:color w:val="156082" w:themeColor="accent1"/>
+                                    <w:sz w:val="22"/>
+                                    <w:szCs w:val="22"/>
+                                    <w:lang w:val="en-GB"/>
+                                  </w:rPr>
+                                  <w:t>n</w:t>
+                                </w:r>
+                              </w:p>
+                            </w:txbxContent>
+                          </wps:txbx>
+                          <wps:bodyPr rot="0" spcFirstLastPara="0" vertOverflow="overflow" horzOverflow="overflow" vert="horz" wrap="square" lIns="91440" tIns="45720" rIns="91440" bIns="45720" numCol="1" spcCol="0" rtlCol="0" fromWordArt="0" anchor="t" anchorCtr="0" forceAA="0" compatLnSpc="1">
+                            <a:prstTxWarp prst="textNoShape">
+                              <a:avLst/>
+                            </a:prstTxWarp>
+                            <a:noAutofit/>
+                          </wps:bodyPr>
+                        </wps:wsp>
+                        <wps:wsp>
+                          <wps:cNvPr id="1773720411" name="Text Box 7"/>
+                          <wps:cNvSpPr txBox="1"/>
+                          <wps:spPr>
+                            <a:xfrm>
+                              <a:off x="42284" y="502127"/>
+                              <a:ext cx="1516953" cy="1516953"/>
+                            </a:xfrm>
+                            <a:prstGeom prst="rect">
+                              <a:avLst/>
+                            </a:prstGeom>
+                            <a:noFill/>
+                            <a:ln w="6350">
+                              <a:noFill/>
+                            </a:ln>
+                          </wps:spPr>
+                          <wps:txbx>
+                            <w:txbxContent>
+                              <w:p>
+                                <w:pPr>
+                                  <w:spacing w:line="240" w:lineRule="auto"/>
+                                  <w:rPr>
+                                    <w:b/>
+                                    <w:bCs/>
+                                    <w:sz w:val="20"/>
+                                    <w:szCs w:val="20"/>
+                                    <w:lang w:val="en-GB"/>
+                                  </w:rPr>
+                                </w:pPr>
+                                <w:r>
+                                  <w:rPr>
+                                    <w:b/>
+                                    <w:bCs/>
+                                    <w:sz w:val="22"/>
+                                    <w:szCs w:val="22"/>
+                                    <w:lang w:val="en-GB"/>
+                                  </w:rPr>
+                                  <w:t>-</w:t>
+                                </w:r>
+                                <w:r>
+                                  <w:rPr>
+                                    <w:sz w:val="20"/>
+                                    <w:szCs w:val="20"/>
+                                    <w:lang w:val="en-GB"/>
+                                  </w:rPr>
+                                  <w:t xml:space="preserve">  </w:t>
+                                </w:r>
+                                <w:r>
+                                  <w:rPr>
+                                    <w:b/>
+                                    <w:bCs/>
+                                    <w:sz w:val="20"/>
+                                    <w:szCs w:val="20"/>
+                                    <w:lang w:val="en-GB"/>
+                                  </w:rPr>
+                                  <w:t>Metrics</w:t>
+                                </w:r>
+                                <w:r>
+                                  <w:rPr>
+                                    <w:b/>
+                                    <w:bCs/>
+                                    <w:sz w:val="20"/>
+                                    <w:szCs w:val="20"/>
+                                    <w:lang w:val="en-GB"/>
+                                  </w:rPr>
+                                  <w:t>: MAE, RMSE, R2</w:t>
+                                </w:r>
+                              </w:p>
+                              <w:p>
+                                <w:pPr>
+                                  <w:spacing w:line="240" w:lineRule="auto"/>
+                                  <w:rPr>
+                                    <w:b/>
+                                    <w:bCs/>
+                                    <w:sz w:val="20"/>
+                                    <w:szCs w:val="20"/>
+                                  </w:rPr>
+                                </w:pPr>
+                                <w:r>
+                                  <w:rPr>
+                                    <w:b/>
+                                    <w:bCs/>
+                                    <w:sz w:val="22"/>
+                                    <w:szCs w:val="22"/>
+                                    <w:lang w:val="en-GB"/>
+                                  </w:rPr>
+                                  <w:t>-</w:t>
+                                </w:r>
+                                <w:r>
+                                  <w:rPr>
+                                    <w:b/>
+                                    <w:bCs/>
+                                    <w:sz w:val="20"/>
+                                    <w:szCs w:val="20"/>
+                                    <w:lang w:val="en-GB"/>
+                                  </w:rPr>
+                                  <w:t xml:space="preserve"> </w:t>
+                                </w:r>
+                                <w:r>
+                                  <w:rPr>
+                                    <w:b/>
+                                    <w:bCs/>
+                                    <w:sz w:val="20"/>
+                                    <w:szCs w:val="20"/>
+                                    <w:lang w:val="en-GB"/>
+                                  </w:rPr>
+                                  <w:t>Feature Importance</w:t>
+                                </w:r>
+                                <w:r>
+                                  <w:rPr>
+                                    <w:b/>
+                                    <w:bCs/>
+                                    <w:sz w:val="20"/>
+                                    <w:szCs w:val="20"/>
+                                    <w:lang w:val="en-GB"/>
+                                  </w:rPr>
+                                  <w:t xml:space="preserve"> (Interpretability)</w:t>
+                                </w:r>
+                              </w:p>
+                              <w:p>
+                                <w:pPr>
+                                  <w:spacing w:line="240" w:lineRule="auto"/>
+                                  <w:rPr>
+                                    <w:b/>
+                                    <w:bCs/>
+                                    <w:sz w:val="20"/>
+                                    <w:szCs w:val="20"/>
+                                  </w:rPr>
+                                </w:pPr>
+                                <w:r>
+                                  <w:rPr>
+                                    <w:b/>
+                                    <w:bCs/>
+                                    <w:sz w:val="22"/>
+                                    <w:szCs w:val="22"/>
+                                    <w:lang w:val="en-GB"/>
+                                  </w:rPr>
+                                  <w:t>-</w:t>
+                                </w:r>
+                                <w:r>
+                                  <w:rPr>
+                                    <w:b/>
+                                    <w:bCs/>
+                                    <w:sz w:val="20"/>
+                                    <w:szCs w:val="20"/>
+                                    <w:lang w:val="en-GB"/>
+                                  </w:rPr>
+                                  <w:t xml:space="preserve"> </w:t>
+                                </w:r>
+                                <w:r>
+                                  <w:rPr>
+                                    <w:b/>
+                                    <w:bCs/>
+                                    <w:sz w:val="20"/>
+                                    <w:szCs w:val="20"/>
+                                    <w:lang w:val="en-GB"/>
+                                  </w:rPr>
+                                  <w:t>SLA Risk Insi</w:t>
+                                </w:r>
+                                <w:r>
+                                  <w:rPr>
+                                    <w:b/>
+                                    <w:bCs/>
+                                    <w:sz w:val="20"/>
+                                    <w:szCs w:val="20"/>
+                                    <w:lang w:val="en-GB"/>
+                                  </w:rPr>
+                                  <w:t>ghts</w:t>
+                                </w:r>
+                              </w:p>
+                              <w:p>
+                                <w:pPr>
+                                  <w:spacing w:line="240" w:lineRule="auto"/>
+                                  <w:rPr>
+                                    <w:b/>
+                                    <w:bCs/>
+                                    <w:sz w:val="20"/>
+                                    <w:szCs w:val="20"/>
+                                  </w:rPr>
+                                </w:pPr>
+                                <w:r>
+                                  <w:rPr>
+                                    <w:b/>
+                                    <w:bCs/>
+                                    <w:sz w:val="22"/>
+                                    <w:szCs w:val="22"/>
+                                    <w:lang w:val="en-GB"/>
+                                  </w:rPr>
+                                  <w:t>-</w:t>
+                                </w:r>
+                                <w:r>
+                                  <w:rPr>
+                                    <w:b/>
+                                    <w:bCs/>
+                                    <w:sz w:val="20"/>
+                                    <w:szCs w:val="20"/>
+                                    <w:lang w:val="en-GB"/>
+                                  </w:rPr>
+                                  <w:t xml:space="preserve"> </w:t>
+                                </w:r>
+                                <w:r>
+                                  <w:rPr>
+                                    <w:b/>
+                                    <w:bCs/>
+                                    <w:sz w:val="20"/>
+                                    <w:szCs w:val="20"/>
+                                    <w:lang w:val="en-GB"/>
+                                  </w:rPr>
+                                  <w:t>Final</w:t>
+                                </w:r>
+                                <w:r>
+                                  <w:rPr>
+                                    <w:b/>
+                                    <w:bCs/>
+                                    <w:sz w:val="20"/>
+                                    <w:szCs w:val="20"/>
+                                    <w:lang w:val="en-GB"/>
+                                  </w:rPr>
+                                  <w:t xml:space="preserve"> The</w:t>
+                                </w:r>
+                                <w:r>
+                                  <w:rPr>
+                                    <w:b/>
+                                    <w:bCs/>
+                                    <w:sz w:val="20"/>
+                                    <w:szCs w:val="20"/>
+                                    <w:lang w:val="en-GB"/>
+                                  </w:rPr>
+                                  <w:t>sis &amp; Report</w:t>
+                                </w:r>
+                              </w:p>
+                              <w:p/>
+                            </w:txbxContent>
+                          </wps:txbx>
+                          <wps:bodyPr rot="0" spcFirstLastPara="0" vertOverflow="overflow" horzOverflow="overflow" vert="horz" wrap="square" lIns="91440" tIns="45720" rIns="91440" bIns="45720" numCol="1" spcCol="0" rtlCol="0" fromWordArt="0" anchor="t" anchorCtr="0" forceAA="0" compatLnSpc="1">
+                            <a:prstTxWarp prst="textNoShape">
+                              <a:avLst/>
+                            </a:prstTxWarp>
+                            <a:noAutofit/>
+                          </wps:bodyPr>
+                        </wps:wsp>
+                      </wpg:grpSp>
+                      <wps:wsp>
+                        <wps:cNvPr id="1242247666" name="Arrow: Right 12"/>
+                        <wps:cNvSpPr/>
+                        <wps:spPr>
+                          <a:xfrm>
+                            <a:off x="1601522" y="1668141"/>
+                            <a:ext cx="253706" cy="90225"/>
+                          </a:xfrm>
+                          <a:prstGeom prst="rightArrow">
+                            <a:avLst/>
+                          </a:prstGeom>
+                          <a:solidFill>
+                            <a:schemeClr val="accent2"/>
+                          </a:solidFill>
+                          <a:ln>
+                            <a:solidFill>
+                              <a:schemeClr val="accent2"/>
+                            </a:solidFill>
+                          </a:ln>
+                        </wps:spPr>
+                        <wps:style>
+                          <a:lnRef idx="2">
+                            <a:schemeClr val="accent1">
+                              <a:shade val="15000"/>
+                            </a:schemeClr>
+                          </a:lnRef>
+                          <a:fillRef idx="1">
+                            <a:schemeClr val="accent1"/>
+                          </a:fillRef>
+                          <a:effectRef idx="0">
+                            <a:schemeClr val="accent1"/>
+                          </a:effectRef>
+                          <a:fontRef idx="minor">
+                            <a:schemeClr val="lt1"/>
+                          </a:fontRef>
+                        </wps:style>
+                        <wps:bodyPr rot="0" spcFirstLastPara="0" vertOverflow="overflow" horzOverflow="overflow" vert="horz" wrap="square" lIns="91440" tIns="45720" rIns="91440" bIns="45720" numCol="1" spcCol="0" rtlCol="0" fromWordArt="0" anchor="ctr" anchorCtr="0" forceAA="0" compatLnSpc="1">
+                          <a:prstTxWarp prst="textNoShape">
+                            <a:avLst/>
+                          </a:prstTxWarp>
+                          <a:noAutofit/>
+                        </wps:bodyPr>
+                      </wps:wsp>
+                      <wps:wsp>
+                        <wps:cNvPr id="2080914116" name="Arrow: Right 12"/>
+                        <wps:cNvSpPr/>
+                        <wps:spPr>
+                          <a:xfrm>
+                            <a:off x="3425036" y="1668141"/>
+                            <a:ext cx="253706" cy="90225"/>
+                          </a:xfrm>
+                          <a:prstGeom prst="rightArrow">
+                            <a:avLst/>
+                          </a:prstGeom>
+                          <a:solidFill>
+                            <a:schemeClr val="accent2"/>
+                          </a:solidFill>
+                          <a:ln>
+                            <a:solidFill>
+                              <a:schemeClr val="accent2"/>
+                            </a:solidFill>
+                          </a:ln>
+                        </wps:spPr>
+                        <wps:style>
+                          <a:lnRef idx="2">
+                            <a:schemeClr val="accent1">
+                              <a:shade val="15000"/>
+                            </a:schemeClr>
+                          </a:lnRef>
+                          <a:fillRef idx="1">
+                            <a:schemeClr val="accent1"/>
+                          </a:fillRef>
+                          <a:effectRef idx="0">
+                            <a:schemeClr val="accent1"/>
+                          </a:effectRef>
+                          <a:fontRef idx="minor">
+                            <a:schemeClr val="lt1"/>
+                          </a:fontRef>
+                        </wps:style>
+                        <wps:bodyPr rot="0" spcFirstLastPara="0" vertOverflow="overflow" horzOverflow="overflow" vert="horz" wrap="square" lIns="91440" tIns="45720" rIns="91440" bIns="45720" numCol="1" spcCol="0" rtlCol="0" fromWordArt="0" anchor="ctr" anchorCtr="0" forceAA="0" compatLnSpc="1">
+                          <a:prstTxWarp prst="textNoShape">
+                            <a:avLst/>
+                          </a:prstTxWarp>
+                          <a:noAutofit/>
+                        </wps:bodyPr>
+                      </wps:wsp>
+                      <wps:wsp>
+                        <wps:cNvPr id="453811531" name="Arrow: Right 12"/>
+                        <wps:cNvSpPr/>
+                        <wps:spPr>
+                          <a:xfrm>
+                            <a:off x="5243265" y="1699854"/>
+                            <a:ext cx="253706" cy="90225"/>
+                          </a:xfrm>
+                          <a:prstGeom prst="rightArrow">
+                            <a:avLst/>
+                          </a:prstGeom>
+                          <a:solidFill>
+                            <a:schemeClr val="accent2"/>
+                          </a:solidFill>
+                          <a:ln>
+                            <a:solidFill>
+                              <a:schemeClr val="accent2"/>
+                            </a:solidFill>
+                          </a:ln>
+                        </wps:spPr>
+                        <wps:style>
+                          <a:lnRef idx="2">
+                            <a:schemeClr val="accent1">
+                              <a:shade val="15000"/>
+                            </a:schemeClr>
+                          </a:lnRef>
+                          <a:fillRef idx="1">
+                            <a:schemeClr val="accent1"/>
+                          </a:fillRef>
+                          <a:effectRef idx="0">
+                            <a:schemeClr val="accent1"/>
+                          </a:effectRef>
+                          <a:fontRef idx="minor">
+                            <a:schemeClr val="lt1"/>
+                          </a:fontRef>
+                        </wps:style>
+                        <wps:bodyPr rot="0" spcFirstLastPara="0" vertOverflow="overflow" horzOverflow="overflow" vert="horz" wrap="square" lIns="91440" tIns="45720" rIns="91440" bIns="45720" numCol="1" spcCol="0" rtlCol="0" fromWordArt="0" anchor="ctr" anchorCtr="0" forceAA="0" compatLnSpc="1">
+                          <a:prstTxWarp prst="textNoShape">
+                            <a:avLst/>
+                          </a:prstTxWarp>
+                          <a:noAutofit/>
+                        </wps:bodyPr>
+                      </wps:wsp>
+                      <wps:wsp>
+                        <wps:cNvPr id="197903587" name="Rectangle: Rounded Corners 14"/>
+                        <wps:cNvSpPr/>
+                        <wps:spPr>
+                          <a:xfrm>
+                            <a:off x="73998" y="3012763"/>
+                            <a:ext cx="6971640" cy="523269"/>
+                          </a:xfrm>
+                          <a:prstGeom prst="roundRect">
+                            <a:avLst/>
+                          </a:prstGeom>
+                          <a:solidFill>
+                            <a:srgbClr val="DEF1FA"/>
+                          </a:solidFill>
+                          <a:ln w="19050">
+                            <a:solidFill>
+                              <a:schemeClr val="accent1"/>
+                            </a:solidFill>
+                          </a:ln>
+                        </wps:spPr>
+                        <wps:style>
+                          <a:lnRef idx="2">
+                            <a:schemeClr val="accent1">
+                              <a:shade val="15000"/>
+                            </a:schemeClr>
+                          </a:lnRef>
+                          <a:fillRef idx="1">
+                            <a:schemeClr val="accent1"/>
+                          </a:fillRef>
+                          <a:effectRef idx="0">
+                            <a:schemeClr val="accent1"/>
+                          </a:effectRef>
+                          <a:fontRef idx="minor">
+                            <a:schemeClr val="lt1"/>
+                          </a:fontRef>
+                        </wps:style>
+                        <wps:bodyPr rot="0" spcFirstLastPara="0" vertOverflow="overflow" horzOverflow="overflow" vert="horz" wrap="square" lIns="91440" tIns="45720" rIns="91440" bIns="45720" numCol="1" spcCol="0" rtlCol="0" fromWordArt="0" anchor="ctr" anchorCtr="0" forceAA="0" compatLnSpc="1">
+                          <a:prstTxWarp prst="textNoShape">
+                            <a:avLst/>
+                          </a:prstTxWarp>
+                          <a:noAutofit/>
+                        </wps:bodyPr>
+                      </wps:wsp>
+                      <wps:wsp>
+                        <wps:cNvPr id="1984704735" name="Text Box 15"/>
+                        <wps:cNvSpPr txBox="1"/>
+                        <wps:spPr>
+                          <a:xfrm>
+                            <a:off x="264278" y="3102617"/>
+                            <a:ext cx="6628078" cy="338275"/>
+                          </a:xfrm>
+                          <a:prstGeom prst="rect">
+                            <a:avLst/>
+                          </a:prstGeom>
+                          <a:noFill/>
+                          <a:ln w="6350">
+                            <a:noFill/>
+                          </a:ln>
+                        </wps:spPr>
+                        <wps:txbx>
+                          <w:txbxContent>
+                            <w:p>
+                              <w:pPr>
+                                <w:jc w:val="center"/>
+                                <w:rPr>
+                                  <w:color w:val="0F4761" w:themeColor="accent1" w:themeShade="BF"/>
+                                  <w:lang w:val="en-GB"/>
+                                </w:rPr>
+                              </w:pPr>
+                              <w:r>
+                                <w:rPr>
+                                  <w:color w:val="0F4761" w:themeColor="accent1" w:themeShade="BF"/>
+                                  <w:lang w:val="en-GB"/>
+                                </w:rPr>
+                                <w:t>Tools &amp; Technologies: Python</w:t>
+                              </w:r>
+                              <w:r>
+                                <w:rPr>
+                                  <w:color w:val="0F4761" w:themeColor="accent1" w:themeShade="BF"/>
+                                  <w:lang w:val="en-GB"/>
+                                </w:rPr>
+                                <w:t xml:space="preserve"> | Pandas &amp; NumPy | Mat</w:t>
+                              </w:r>
+                              <w:r>
+                                <w:rPr>
+                                  <w:color w:val="0F4761" w:themeColor="accent1" w:themeShade="BF"/>
+                                  <w:lang w:val="en-GB"/>
+                                </w:rPr>
+                                <w:t>plotlib &amp; Seaborn | Scikit-Learn |</w:t>
+                              </w:r>
+                              <w:r>
+                                <w:rPr>
+                                  <w:color w:val="0F4761" w:themeColor="accent1" w:themeShade="BF"/>
+                                  <w:lang w:val="en-GB"/>
+                                </w:rPr>
+                                <w:t xml:space="preserve"> GitHub</w:t>
+                              </w:r>
+                            </w:p>
+                          </w:txbxContent>
+                        </wps:txbx>
+                        <wps:bodyPr rot="0" spcFirstLastPara="0" vertOverflow="overflow" horzOverflow="overflow" vert="horz" wrap="square" lIns="91440" tIns="45720" rIns="91440" bIns="45720" numCol="1" spcCol="0" rtlCol="0" fromWordArt="0" anchor="t" anchorCtr="0" forceAA="0" compatLnSpc="1">
+                          <a:prstTxWarp prst="textNoShape">
+                            <a:avLst/>
+                          </a:prstTxWarp>
+                          <a:noAutofit/>
+                        </wps:bodyPr>
+                      </wps:wsp>
+                      <wps:wsp>
+                        <wps:cNvPr id="174022927" name="Text Box 16"/>
+                        <wps:cNvSpPr txBox="1"/>
+                        <wps:spPr>
+                          <a:xfrm>
+                            <a:off x="1115251" y="0"/>
+                            <a:ext cx="4804482" cy="364702"/>
+                          </a:xfrm>
+                          <a:prstGeom prst="rect">
+                            <a:avLst/>
+                          </a:prstGeom>
+                          <a:solidFill>
+                            <a:schemeClr val="lt1"/>
+                          </a:solidFill>
+                          <a:ln w="6350">
+                            <a:noFill/>
+                          </a:ln>
+                        </wps:spPr>
+                        <wps:txbx>
+                          <w:txbxContent>
+                            <w:p>
+                              <w:pPr>
+                                <w:jc w:val="center"/>
+                                <w:rPr>
+                                  <w:b/>
+                                  <w:bCs/>
+                                  <w:color w:val="0F4761" w:themeColor="accent1" w:themeShade="BF"/>
+                                  <w:sz w:val="28"/>
+                                  <w:szCs w:val="28"/>
+                                  <w:lang w:val="en-GB"/>
+                                </w:rPr>
+                              </w:pPr>
+                              <w:r>
+                                <w:rPr>
+                                  <w:b/>
+                                  <w:bCs/>
+                                  <w:color w:val="0F4761" w:themeColor="accent1" w:themeShade="BF"/>
+                                  <w:sz w:val="28"/>
+                                  <w:szCs w:val="28"/>
+                                  <w:lang w:val="en-GB"/>
+                                </w:rPr>
+                                <w:t>High</w:t>
+                              </w:r>
+                              <w:r>
+                                <w:rPr>
+                                  <w:b/>
+                                  <w:bCs/>
+                                  <w:color w:val="0F4761" w:themeColor="accent1" w:themeShade="BF"/>
+                                  <w:sz w:val="28"/>
+                                  <w:szCs w:val="28"/>
+                                  <w:lang w:val="en-GB"/>
+                                </w:rPr>
+                                <w:t xml:space="preserve">-Level </w:t>
+                              </w:r>
+                              <w:r>
+                                <w:rPr>
+                                  <w:b/>
+                                  <w:bCs/>
+                                  <w:color w:val="0F4761" w:themeColor="accent1" w:themeShade="BF"/>
+                                  <w:sz w:val="28"/>
+                                  <w:szCs w:val="28"/>
+                                  <w:lang w:val="en-GB"/>
+                                </w:rPr>
+                                <w:t>Pro</w:t>
+                              </w:r>
+                              <w:r>
+                                <w:rPr>
+                                  <w:b/>
+                                  <w:bCs/>
+                                  <w:color w:val="0F4761" w:themeColor="accent1" w:themeShade="BF"/>
+                                  <w:sz w:val="28"/>
+                                  <w:szCs w:val="28"/>
+                                  <w:lang w:val="en-GB"/>
+                                </w:rPr>
+                                <w:t>ject Architecture &amp; Data Science</w:t>
+                              </w:r>
+                              <w:r>
+                                <w:rPr>
+                                  <w:b/>
+                                  <w:bCs/>
+                                  <w:color w:val="0F4761" w:themeColor="accent1" w:themeShade="BF"/>
+                                  <w:sz w:val="28"/>
+                                  <w:szCs w:val="28"/>
+                                  <w:lang w:val="en-GB"/>
+                                </w:rPr>
+                                <w:t xml:space="preserve"> Workflow</w:t>
+                              </w:r>
+                            </w:p>
+                          </w:txbxContent>
+                        </wps:txbx>
+                        <wps:bodyPr rot="0" spcFirstLastPara="0" vertOverflow="overflow" horzOverflow="overflow" vert="horz" wrap="square" lIns="91440" tIns="45720" rIns="91440" bIns="45720" numCol="1" spcCol="0" rtlCol="0" fromWordArt="0" anchor="t" anchorCtr="0" forceAA="0" compatLnSpc="1">
+                          <a:prstTxWarp prst="textNoShape">
+                            <a:avLst/>
+                          </a:prstTxWarp>
+                          <a:noAutofit/>
+                        </wps:bodyPr>
+                      </wps:wsp>
+                    </wpg:wgp>
+                  </a:graphicData>
+                </a:graphic>
+              </wp:anchor>
+            </w:drawing>
+          </mc:Choice>
+          <mc:Fallback>
+            <w:pict>
+              <v:group w14:anchorId="0DE2CCCE" id="Group 17" o:spid="_x0000_s1026" style="position:absolute;margin-left:-52pt;margin-top:9.45pt;width:558.9pt;height:278.45pt;z-index:251687936" coordsize="70981,35360" o:gfxdata="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">
+                <v:group id="Group 8" o:spid="_x0000_s1027" style="position:absolute;top:6659;width:15803;height:20825" coordsize="13953,19024" o:gfxdata="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">
+                  <v:roundrect id="Rectangle: Rounded Corners 1" o:spid="_x0000_s1028" style="position:absolute;width:13953;height:19024;visibility:visible;mso-wrap-style:square;v-text-anchor:middle" arcsize="10923f" o:gfxdata="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" fillcolor="#c1e4f5 [660]" strokecolor="#156082 [3204]" strokeweight="1.5pt">
+                    <v:stroke joinstyle="miter"/>
+                  </v:roundrect>
+                  <v:shapetype id="_x0000_t202" coordsize="21600,21600" o:spt="202" path="m,l,21600r21600,l21600,xe">
+                    <v:stroke joinstyle="miter"/>
+                    <v:path gradientshapeok="t" o:connecttype="rect"/>
+                  </v:shapetype>
+                  <v:shape id="Text Box 3" o:spid="_x0000_s1029" type="#_x0000_t202" style="position:absolute;left:1109;top:105;width:11729;height:4275;visibility:visible;mso-wrap-style:square;v-text-anchor:top" o:gfxdata="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" filled="f" stroked="f" strokeweight=".5pt">
+                    <v:textbox>
+                      <w:txbxContent>
+                        <w:p>
+                          <w:pPr>
+                            <w:jc w:val="center"/>
+                            <w:rPr>
+                              <w:b/>
+                              <w:bCs/>
+                              <w:color w:val="156082" w:themeColor="accent1"/>
+                              <w:sz w:val="22"/>
+                              <w:szCs w:val="22"/>
+                              <w:lang w:val="en-GB"/>
+                            </w:rPr>
+                          </w:pPr>
+                          <w:r>
+                            <w:rPr>
+                              <w:b/>
+                              <w:bCs/>
+                              <w:color w:val="156082" w:themeColor="accent1"/>
+                              <w:sz w:val="22"/>
+                              <w:szCs w:val="22"/>
+                              <w:lang w:val="en-GB"/>
+                            </w:rPr>
+                            <w:t>1.</w:t>
+                          </w:r>
+                          <w:r>
+                            <w:rPr>
+                              <w:b/>
+                              <w:bCs/>
+                              <w:color w:val="156082" w:themeColor="accent1"/>
+                              <w:sz w:val="22"/>
+                              <w:szCs w:val="22"/>
+                              <w:lang w:val="en-GB"/>
+                            </w:rPr>
+                            <w:t>D</w:t>
+                          </w:r>
+                          <w:r>
+                            <w:rPr>
+                              <w:b/>
+                              <w:bCs/>
+                              <w:color w:val="156082" w:themeColor="accent1"/>
+                              <w:sz w:val="22"/>
+                              <w:szCs w:val="22"/>
+                              <w:lang w:val="en-GB"/>
+                            </w:rPr>
+                            <w:t xml:space="preserve">ata Discovery </w:t>
+                          </w:r>
+                          <w:r>
+                            <w:rPr>
+                              <w:b/>
+                              <w:bCs/>
+                              <w:color w:val="156082" w:themeColor="accent1"/>
+                              <w:sz w:val="22"/>
+                              <w:szCs w:val="22"/>
+                              <w:lang w:val="en-GB"/>
+                            </w:rPr>
+                            <w:t>&amp; Source</w:t>
+                          </w:r>
+                        </w:p>
+                      </w:txbxContent>
+                    </v:textbox>
+                  </v:shape>
+                  <v:shape id="Text Box 7" o:spid="_x0000_s1030" type="#_x0000_t202" style="position:absolute;top:4651;width:13372;height:13792;visibility:visible;mso-wrap-style:square;v-text-anchor:top" o:gfxdata="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" filled="f" stroked="f" strokeweight=".5pt">
+                    <v:textbox>
+                      <w:txbxContent>
+                        <w:p>
+                          <w:pPr>
+                            <w:spacing w:line="240" w:lineRule="auto"/>
+                            <w:rPr>
+                              <w:b/>
+                              <w:bCs/>
+                              <w:sz w:val="20"/>
+                              <w:szCs w:val="20"/>
+                              <w:lang w:val="en-GB"/>
+                            </w:rPr>
+                          </w:pPr>
+                          <w:r>
+                            <w:rPr>
+                              <w:b/>
+                              <w:bCs/>
+                              <w:sz w:val="22"/>
+                              <w:szCs w:val="22"/>
+                              <w:lang w:val="en-GB"/>
+                            </w:rPr>
+                            <w:t>-</w:t>
+                          </w:r>
+                          <w:r>
+                            <w:rPr>
+                              <w:sz w:val="20"/>
+                              <w:szCs w:val="20"/>
+                              <w:lang w:val="en-GB"/>
+                            </w:rPr>
+                            <w:t xml:space="preserve">  </w:t>
+                          </w:r>
+                          <w:r>
+                            <w:rPr>
+                              <w:b/>
+                              <w:bCs/>
+                              <w:sz w:val="20"/>
+                              <w:szCs w:val="20"/>
+                              <w:lang w:val="en-GB"/>
+                            </w:rPr>
+                            <w:t>Dataset: issues.csv</w:t>
+                          </w:r>
+                        </w:p>
+                        <w:p>
+                          <w:pPr>
+                            <w:spacing w:line="240" w:lineRule="auto"/>
+                            <w:rPr>
+                              <w:b/>
+                              <w:bCs/>
+                              <w:sz w:val="20"/>
+                              <w:szCs w:val="20"/>
+                            </w:rPr>
+                          </w:pPr>
+                          <w:r>
+                            <w:rPr>
+                              <w:b/>
+                              <w:bCs/>
+                              <w:sz w:val="22"/>
+                              <w:szCs w:val="22"/>
+                              <w:lang w:val="en-GB"/>
+                            </w:rPr>
+                            <w:t>-</w:t>
+                          </w:r>
+                          <w:r>
+                            <w:rPr>
+                              <w:b/>
+                              <w:bCs/>
+                              <w:sz w:val="20"/>
+                              <w:szCs w:val="20"/>
+                              <w:lang w:val="en-GB"/>
+                            </w:rPr>
+                            <w:t xml:space="preserve"> </w:t>
+                          </w:r>
+                          <w:r>
+                            <w:rPr>
+                              <w:b/>
+                              <w:bCs/>
+                              <w:sz w:val="20"/>
+                              <w:szCs w:val="20"/>
+                              <w:lang w:val="en-GB"/>
+                            </w:rPr>
+                            <w:t>66</w:t>
+                          </w:r>
+                          <w:r>
+                            <w:rPr>
+                              <w:b/>
+                              <w:bCs/>
+                              <w:sz w:val="20"/>
+                              <w:szCs w:val="20"/>
+                              <w:lang w:val="en-GB"/>
+                            </w:rPr>
+                            <w:t>,691 IT records</w:t>
+                          </w:r>
+                        </w:p>
+                        <w:p>
+                          <w:pPr>
+                            <w:spacing w:line="240" w:lineRule="auto"/>
+                            <w:rPr>
+                              <w:b/>
+                              <w:bCs/>
+                              <w:sz w:val="20"/>
+                              <w:szCs w:val="20"/>
+                            </w:rPr>
+                          </w:pPr>
+                          <w:r>
+                            <w:rPr>
+                              <w:b/>
+                              <w:bCs/>
+                              <w:sz w:val="22"/>
+                              <w:szCs w:val="22"/>
+                              <w:lang w:val="en-GB"/>
+                            </w:rPr>
+                            <w:t>-</w:t>
+                          </w:r>
+                          <w:r>
+                            <w:rPr>
+                              <w:b/>
+                              <w:bCs/>
+                              <w:sz w:val="20"/>
+                              <w:szCs w:val="20"/>
+                              <w:lang w:val="en-GB"/>
+                            </w:rPr>
+                            <w:t xml:space="preserve"> </w:t>
+                          </w:r>
+                          <w:r>
+                            <w:rPr>
+                              <w:b/>
+                              <w:bCs/>
+                              <w:sz w:val="20"/>
+                              <w:szCs w:val="20"/>
+                              <w:lang w:val="en-GB"/>
+                            </w:rPr>
+                            <w:t>Filter 2016-2023</w:t>
+                          </w:r>
+                        </w:p>
+                        <w:p>
+                          <w:pPr>
+                            <w:spacing w:line="240" w:lineRule="auto"/>
+                            <w:rPr>
+                              <w:b/>
+                              <w:bCs/>
+                              <w:sz w:val="20"/>
+                              <w:szCs w:val="20"/>
+                            </w:rPr>
+                          </w:pPr>
+                          <w:r>
+                            <w:rPr>
+                              <w:b/>
+                              <w:bCs/>
+                              <w:sz w:val="22"/>
+                              <w:szCs w:val="22"/>
+                              <w:lang w:val="en-GB"/>
+                            </w:rPr>
+                            <w:t>-</w:t>
+                          </w:r>
+                          <w:r>
+                            <w:rPr>
+                              <w:b/>
+                              <w:bCs/>
+                              <w:sz w:val="20"/>
+                              <w:szCs w:val="20"/>
+                              <w:lang w:val="en-GB"/>
+                            </w:rPr>
+                            <w:t xml:space="preserve"> </w:t>
+                          </w:r>
+                          <w:r>
+                            <w:rPr>
+                              <w:b/>
+                              <w:bCs/>
+                              <w:sz w:val="20"/>
+                              <w:szCs w:val="20"/>
+                              <w:lang w:val="en-GB"/>
+                            </w:rPr>
+                            <w:t>Identify target:</w:t>
+                          </w:r>
+                          <w:r>
+                            <w:rPr>
+                              <w:b/>
+                              <w:bCs/>
+                              <w:sz w:val="20"/>
+                              <w:szCs w:val="20"/>
+                              <w:lang w:val="en-GB"/>
+                            </w:rPr>
+                            <w:t xml:space="preserve"> wf_total_time</w:t>
+                          </w:r>
+                        </w:p>
+                      </w:txbxContent>
+                    </v:textbox>
+                  </v:shape>
+                </v:group>
+                <v:group id="Group 9" o:spid="_x0000_s1031" style="position:absolute;left:18182;top:6712;width:16961;height:20873" coordsize="15222,19077" o:gfxdata="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">
+                  <v:roundrect id="Rectangle: Rounded Corners 1" o:spid="_x0000_s1032" style="position:absolute;left:687;top:52;width:13579;height:19025;visibility:visible;mso-wrap-style:square;v-text-anchor:middle" arcsize="10923f" o:gfxdata="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" fillcolor="#c1e4f5 [660]" strokecolor="#215e99 [2431]" strokeweight="1.5pt">
+                    <v:stroke joinstyle="miter"/>
+                  </v:roundrect>
+                  <v:shape id="Text Box 3" o:spid="_x0000_s1033" type="#_x0000_t202" style="position:absolute;left:1268;width:12785;height:4544;visibility:visible;mso-wrap-style:square;v-text-anchor:top" o:gfxdata="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" filled="f" stroked="f" strokeweight=".5pt">
+                    <v:textbox>
+                      <w:txbxContent>
+                        <w:p>
+                          <w:pPr>
+                            <w:jc w:val="center"/>
+                            <w:rPr>
+                              <w:b/>
+                              <w:bCs/>
+                              <w:color w:val="156082" w:themeColor="accent1"/>
+                              <w:sz w:val="22"/>
+                              <w:szCs w:val="22"/>
+                              <w:lang w:val="en-GB"/>
+                            </w:rPr>
+                          </w:pPr>
+                          <w:r>
+                            <w:rPr>
+                              <w:b/>
+                              <w:bCs/>
+                              <w:color w:val="156082" w:themeColor="accent1"/>
+                              <w:sz w:val="22"/>
+                              <w:szCs w:val="22"/>
+                              <w:lang w:val="en-GB"/>
+                            </w:rPr>
+                            <w:t>2.Data Preparation &amp; EDA (CA2)</w:t>
+                          </w:r>
+                        </w:p>
+                      </w:txbxContent>
+                    </v:textbox>
+                  </v:shape>
+                  <v:shape id="Text Box 7" o:spid="_x0000_s1034" type="#_x0000_t202" style="position:absolute;top:4157;width:15222;height:13584;visibility:visible;mso-wrap-style:square;v-text-anchor:top" o:gfxdata="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" filled="f" stroked="f" strokeweight=".5pt">
+                    <v:textbox>
+                      <w:txbxContent>
+                        <w:p>
+                          <w:pPr>
+                            <w:spacing w:line="240" w:lineRule="auto"/>
+                            <w:rPr>
+                              <w:b/>
+                              <w:bCs/>
+                              <w:sz w:val="20"/>
+                              <w:szCs w:val="20"/>
+                              <w:lang w:val="en-GB"/>
+                            </w:rPr>
+                          </w:pPr>
+                          <w:r>
+                            <w:rPr>
+                              <w:b/>
+                              <w:bCs/>
+                              <w:sz w:val="22"/>
+                              <w:szCs w:val="22"/>
+                              <w:lang w:val="en-GB"/>
+                            </w:rPr>
+                            <w:t>-</w:t>
+                          </w:r>
+                          <w:r>
+                            <w:rPr>
+                              <w:sz w:val="20"/>
+                              <w:szCs w:val="20"/>
+                              <w:lang w:val="en-GB"/>
+                            </w:rPr>
+                            <w:t xml:space="preserve">  </w:t>
+                          </w:r>
+                          <w:r>
+                            <w:rPr>
+                              <w:b/>
+                              <w:bCs/>
+                              <w:sz w:val="20"/>
+                              <w:szCs w:val="20"/>
+                              <w:lang w:val="en-GB"/>
+                            </w:rPr>
+                            <w:t>Remove data leakage (intermediate wf_cols)</w:t>
+                          </w:r>
+                        </w:p>
+                        <w:p>
+                          <w:pPr>
+                            <w:spacing w:line="240" w:lineRule="auto"/>
+                            <w:rPr>
+                              <w:b/>
+                              <w:bCs/>
+                              <w:sz w:val="20"/>
+                              <w:szCs w:val="20"/>
+                            </w:rPr>
+                          </w:pPr>
+                          <w:r>
+                            <w:rPr>
+                              <w:b/>
+                              <w:bCs/>
+                              <w:sz w:val="22"/>
+                              <w:szCs w:val="22"/>
+                              <w:lang w:val="en-GB"/>
+                            </w:rPr>
+                            <w:t>-</w:t>
+                          </w:r>
+                          <w:r>
+                            <w:rPr>
+                              <w:b/>
+                              <w:bCs/>
+                              <w:sz w:val="20"/>
+                              <w:szCs w:val="20"/>
+                              <w:lang w:val="en-GB"/>
+                            </w:rPr>
+                            <w:t xml:space="preserve"> </w:t>
+                          </w:r>
+                          <w:r>
+                            <w:rPr>
+                              <w:b/>
+                              <w:bCs/>
+                              <w:sz w:val="20"/>
+                              <w:szCs w:val="20"/>
+                              <w:lang w:val="en-GB"/>
+                            </w:rPr>
+                            <w:t>Handle missing val</w:t>
+                          </w:r>
+                          <w:r>
+                            <w:rPr>
+                              <w:b/>
+                              <w:bCs/>
+                              <w:sz w:val="20"/>
+                              <w:szCs w:val="20"/>
+                              <w:lang w:val="en-GB"/>
+                            </w:rPr>
+                            <w:t>ues</w:t>
+                          </w:r>
+                        </w:p>
+                        <w:p>
+                          <w:pPr>
+                            <w:spacing w:line="240" w:lineRule="auto"/>
+                            <w:rPr>
+                              <w:b/>
+                              <w:bCs/>
+                              <w:sz w:val="20"/>
+                              <w:szCs w:val="20"/>
+                            </w:rPr>
+                          </w:pPr>
+                          <w:r>
+                            <w:rPr>
+                              <w:b/>
+                              <w:bCs/>
+                              <w:sz w:val="22"/>
+                              <w:szCs w:val="22"/>
+                              <w:lang w:val="en-GB"/>
+                            </w:rPr>
+                            <w:t>-</w:t>
+                          </w:r>
+                          <w:r>
+                            <w:rPr>
+                              <w:b/>
+                              <w:bCs/>
+                              <w:sz w:val="20"/>
+                              <w:szCs w:val="20"/>
+                              <w:lang w:val="en-GB"/>
+                            </w:rPr>
+                            <w:t xml:space="preserve"> </w:t>
+                          </w:r>
+                          <w:r>
+                            <w:rPr>
+                              <w:b/>
+                              <w:bCs/>
+                              <w:sz w:val="20"/>
+                              <w:szCs w:val="20"/>
+                              <w:lang w:val="en-GB"/>
+                            </w:rPr>
+                            <w:t>Encode categories</w:t>
+                          </w:r>
+                        </w:p>
+                        <w:p>
+                          <w:pPr>
+                            <w:spacing w:line="240" w:lineRule="auto"/>
+                            <w:rPr>
+                              <w:b/>
+                              <w:bCs/>
+                              <w:sz w:val="20"/>
+                              <w:szCs w:val="20"/>
+                            </w:rPr>
+                          </w:pPr>
+                          <w:r>
+                            <w:rPr>
+                              <w:b/>
+                              <w:bCs/>
+                              <w:sz w:val="22"/>
+                              <w:szCs w:val="22"/>
+                              <w:lang w:val="en-GB"/>
+                            </w:rPr>
+                            <w:t>-</w:t>
+                          </w:r>
+                          <w:r>
+                            <w:rPr>
+                              <w:b/>
+                              <w:bCs/>
+                              <w:sz w:val="20"/>
+                              <w:szCs w:val="20"/>
+                              <w:lang w:val="en-GB"/>
+                            </w:rPr>
+                            <w:t xml:space="preserve"> </w:t>
+                          </w:r>
+                          <w:r>
+                            <w:rPr>
+                              <w:b/>
+                              <w:bCs/>
+                              <w:sz w:val="20"/>
+                              <w:szCs w:val="20"/>
+                              <w:lang w:val="en-GB"/>
+                            </w:rPr>
+                            <w:t>Feature scaling &amp; EDA</w:t>
+                          </w:r>
+                        </w:p>
+                        <w:p/>
+                      </w:txbxContent>
+                    </v:textbox>
+                  </v:shape>
+                </v:group>
+                <v:group id="Group 10" o:spid="_x0000_s1035" style="position:absolute;left:37157;top:6289;width:15799;height:21407" coordsize="15802,20811" o:gfxdata="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">
+                  <v:roundrect id="Rectangle: Rounded Corners 1" o:spid="_x0000_s1036" style="position:absolute;top:317;width:15275;height:20494;visibility:visible;mso-wrap-style:square;v-text-anchor:middle" arcsize="10923f" o:gfxdata="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" fillcolor="#fae2d5 [661]" strokecolor="#e97132 [3205]" strokeweight="1.5pt">
+                    <v:stroke joinstyle="miter"/>
+                  </v:roundrect>
+                  <v:shape id="Text Box 3" o:spid="_x0000_s1037" type="#_x0000_t202" style="position:absolute;left:792;width:13373;height:4489;visibility:visible;mso-wrap-style:square;v-text-anchor:top" o:gfxdata="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" filled="f" stroked="f" strokeweight=".5pt">
+                    <v:textbox>
+                      <w:txbxContent>
+                        <w:p>
+                          <w:pPr>
+                            <w:jc w:val="center"/>
+                            <w:rPr>
+                              <w:b/>
+                              <w:bCs/>
+                              <w:color w:val="E97132" w:themeColor="accent2"/>
+                              <w:sz w:val="22"/>
+                              <w:szCs w:val="22"/>
+                              <w:lang w:val="en-GB"/>
+                            </w:rPr>
+                          </w:pPr>
+                          <w:r>
+                            <w:rPr>
+                              <w:b/>
+                              <w:bCs/>
+                              <w:color w:val="E97132" w:themeColor="accent2"/>
+                              <w:sz w:val="22"/>
+                              <w:szCs w:val="22"/>
+                              <w:lang w:val="en-GB"/>
+                            </w:rPr>
+                            <w:t xml:space="preserve">3.Model Planning &amp; </w:t>
+                          </w:r>
+                          <w:r>
+                            <w:rPr>
+                              <w:b/>
+                              <w:bCs/>
+                              <w:color w:val="E97132" w:themeColor="accent2"/>
+                              <w:sz w:val="22"/>
+                              <w:szCs w:val="22"/>
+                              <w:lang w:val="en-GB"/>
+                            </w:rPr>
+                            <w:t>B</w:t>
+                          </w:r>
+                          <w:r>
+                            <w:rPr>
+                              <w:b/>
+                              <w:bCs/>
+                              <w:color w:val="E97132" w:themeColor="accent2"/>
+                              <w:sz w:val="22"/>
+                              <w:szCs w:val="22"/>
+                              <w:lang w:val="en-GB"/>
+                            </w:rPr>
+                            <w:t>uilding (CA3)</w:t>
+                          </w:r>
+                        </w:p>
+                      </w:txbxContent>
+                    </v:textbox>
+                  </v:shape>
+                  <v:shape id="Text Box 7" o:spid="_x0000_s1038" type="#_x0000_t202" style="position:absolute;left:105;top:4545;width:15697;height:15375;visibility:visible;mso-wrap-style:square;v-text-anchor:top" o:gfxdata="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" filled="f" stroked="f" strokeweight=".5pt">
+                    <v:textbox>
+                      <w:txbxContent>
+                        <w:p>
+                          <w:pPr>
+                            <w:spacing w:line="240" w:lineRule="auto"/>
+                            <w:rPr>
+                              <w:b/>
+                              <w:bCs/>
+                              <w:sz w:val="20"/>
+                              <w:szCs w:val="20"/>
+                              <w:lang w:val="en-GB"/>
+                            </w:rPr>
+                          </w:pPr>
+                          <w:r>
+                            <w:rPr>
+                              <w:b/>
+                              <w:bCs/>
+                              <w:sz w:val="22"/>
+                              <w:szCs w:val="22"/>
+                              <w:lang w:val="en-GB"/>
+                            </w:rPr>
+                            <w:t>-</w:t>
+                          </w:r>
+                          <w:r>
+                            <w:rPr>
+                              <w:sz w:val="20"/>
+                              <w:szCs w:val="20"/>
+                              <w:lang w:val="en-GB"/>
+                            </w:rPr>
+                            <w:t xml:space="preserve">  </w:t>
+                          </w:r>
+                          <w:r>
+                            <w:rPr>
+                              <w:b/>
+                              <w:bCs/>
+                              <w:sz w:val="20"/>
+                              <w:szCs w:val="20"/>
+                              <w:lang w:val="en-GB"/>
+                            </w:rPr>
+                            <w:t>Train/Test</w:t>
+                          </w:r>
+                          <w:r>
+                            <w:rPr>
+                              <w:b/>
+                              <w:bCs/>
+                              <w:sz w:val="20"/>
+                              <w:szCs w:val="20"/>
+                              <w:lang w:val="en-GB"/>
+                            </w:rPr>
+                            <w:t xml:space="preserve"> Split (80/20)</w:t>
+                          </w:r>
+                        </w:p>
+                        <w:p>
+                          <w:pPr>
+                            <w:spacing w:line="240" w:lineRule="auto"/>
+                            <w:rPr>
+                              <w:b/>
+                              <w:bCs/>
+                              <w:sz w:val="20"/>
+                              <w:szCs w:val="20"/>
+                            </w:rPr>
+                          </w:pPr>
+                          <w:r>
+                            <w:rPr>
+                              <w:b/>
+                              <w:bCs/>
+                              <w:sz w:val="22"/>
+                              <w:szCs w:val="22"/>
+                              <w:lang w:val="en-GB"/>
+                            </w:rPr>
+                            <w:t>-</w:t>
+                          </w:r>
+                          <w:r>
+                            <w:rPr>
+                              <w:b/>
+                              <w:bCs/>
+                              <w:sz w:val="20"/>
+                              <w:szCs w:val="20"/>
+                              <w:lang w:val="en-GB"/>
+                            </w:rPr>
+                            <w:t xml:space="preserve"> </w:t>
+                          </w:r>
+                          <w:r>
+                            <w:rPr>
+                              <w:b/>
+                              <w:bCs/>
+                              <w:sz w:val="20"/>
+                              <w:szCs w:val="20"/>
+                              <w:lang w:val="en-GB"/>
+                            </w:rPr>
+                            <w:t>Baseline Model: Line</w:t>
+                          </w:r>
+                          <w:r>
+                            <w:rPr>
+                              <w:b/>
+                              <w:bCs/>
+                              <w:sz w:val="20"/>
+                              <w:szCs w:val="20"/>
+                              <w:lang w:val="en-GB"/>
+                            </w:rPr>
+                            <w:t>a</w:t>
+                          </w:r>
+                          <w:r>
+                            <w:rPr>
+                              <w:b/>
+                              <w:bCs/>
+                              <w:sz w:val="20"/>
+                              <w:szCs w:val="20"/>
+                              <w:lang w:val="en-GB"/>
+                            </w:rPr>
+                            <w:t>r</w:t>
+                          </w:r>
+                          <w:r>
+                            <w:rPr>
+                              <w:b/>
+                              <w:bCs/>
+                              <w:sz w:val="20"/>
+                              <w:szCs w:val="20"/>
+                              <w:lang w:val="en-GB"/>
+                            </w:rPr>
+                            <w:t xml:space="preserve"> Regression</w:t>
+                          </w:r>
+                        </w:p>
+                        <w:p>
+                          <w:pPr>
+                            <w:spacing w:line="240" w:lineRule="auto"/>
+                            <w:rPr>
+                              <w:b/>
+                              <w:bCs/>
+                              <w:sz w:val="20"/>
+                              <w:szCs w:val="20"/>
+                            </w:rPr>
+                          </w:pPr>
+                          <w:r>
+                            <w:rPr>
+                              <w:b/>
+                              <w:bCs/>
+                              <w:sz w:val="22"/>
+                              <w:szCs w:val="22"/>
+                              <w:lang w:val="en-GB"/>
+                            </w:rPr>
+                            <w:t>-</w:t>
+                          </w:r>
+                          <w:r>
+                            <w:rPr>
+                              <w:b/>
+                              <w:bCs/>
+                              <w:sz w:val="20"/>
+                              <w:szCs w:val="20"/>
+                              <w:lang w:val="en-GB"/>
+                            </w:rPr>
+                            <w:t xml:space="preserve"> En</w:t>
+                          </w:r>
+                          <w:r>
+                            <w:rPr>
+                              <w:b/>
+                              <w:bCs/>
+                              <w:sz w:val="20"/>
+                              <w:szCs w:val="20"/>
+                              <w:lang w:val="en-GB"/>
+                            </w:rPr>
+                            <w:t>semble</w:t>
+                          </w:r>
+                          <w:r>
+                            <w:rPr>
+                              <w:b/>
+                              <w:bCs/>
+                              <w:sz w:val="20"/>
+                              <w:szCs w:val="20"/>
+                              <w:lang w:val="en-GB"/>
+                            </w:rPr>
+                            <w:t xml:space="preserve"> Model: Random Forest</w:t>
+                          </w:r>
+                        </w:p>
+                        <w:p>
+                          <w:pPr>
+                            <w:spacing w:line="240" w:lineRule="auto"/>
+                            <w:rPr>
+                              <w:b/>
+                              <w:bCs/>
+                              <w:sz w:val="20"/>
+                              <w:szCs w:val="20"/>
+                            </w:rPr>
+                          </w:pPr>
+                          <w:r>
+                            <w:rPr>
+                              <w:b/>
+                              <w:bCs/>
+                              <w:sz w:val="22"/>
+                              <w:szCs w:val="22"/>
+                              <w:lang w:val="en-GB"/>
+                            </w:rPr>
+                            <w:t>-</w:t>
+                          </w:r>
+                          <w:r>
+                            <w:rPr>
+                              <w:b/>
+                              <w:bCs/>
+                              <w:sz w:val="20"/>
+                              <w:szCs w:val="20"/>
+                              <w:lang w:val="en-GB"/>
+                            </w:rPr>
+                            <w:t xml:space="preserve"> </w:t>
+                          </w:r>
+                          <w:r>
+                            <w:rPr>
+                              <w:b/>
+                              <w:bCs/>
+                              <w:sz w:val="20"/>
+                              <w:szCs w:val="20"/>
+                              <w:lang w:val="en-GB"/>
+                            </w:rPr>
+                            <w:t>Hy</w:t>
+                          </w:r>
+                          <w:r>
+                            <w:rPr>
+                              <w:b/>
+                              <w:bCs/>
+                              <w:sz w:val="20"/>
+                              <w:szCs w:val="20"/>
+                              <w:lang w:val="en-GB"/>
+                            </w:rPr>
+                            <w:t>perparameter tuning</w:t>
+                          </w:r>
+                        </w:p>
+                        <w:p/>
+                      </w:txbxContent>
+                    </v:textbox>
+                  </v:shape>
+                </v:group>
+                <v:group id="Group 11" o:spid="_x0000_s1039" style="position:absolute;left:55286;top:6765;width:15695;height:20700" coordsize="15592,20825" o:gfxdata="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">
+                  <v:roundrect id="Rectangle: Rounded Corners 1" o:spid="_x0000_s1040" style="position:absolute;width:15422;height:20825;visibility:visible;mso-wrap-style:square;v-text-anchor:middle" arcsize="10923f" o:gfxdata="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" fillcolor="#c1e4f5 [660]" strokecolor="#156082 [3204]" strokeweight="1.5pt">
+                    <v:stroke joinstyle="miter"/>
+                  </v:roundrect>
+                  <v:shape id="Text Box 3" o:spid="_x0000_s1041" type="#_x0000_t202" style="position:absolute;left:2007;top:369;width:12223;height:4648;visibility:visible;mso-wrap-style:square;v-text-anchor:top" o:gfxdata="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" filled="f" stroked="f" strokeweight=".5pt">
+                    <v:textbox>
+                      <w:txbxContent>
+                        <w:p>
+                          <w:pPr>
+                            <w:jc w:val="center"/>
+                            <w:rPr>
+                              <w:b/>
+                              <w:bCs/>
+                              <w:color w:val="156082" w:themeColor="accent1"/>
+                              <w:sz w:val="22"/>
+                              <w:szCs w:val="22"/>
+                              <w:lang w:val="en-GB"/>
+                            </w:rPr>
+                          </w:pPr>
+                          <w:r>
+                            <w:rPr>
+                              <w:b/>
+                              <w:bCs/>
+                              <w:color w:val="156082" w:themeColor="accent1"/>
+                              <w:sz w:val="22"/>
+                              <w:szCs w:val="22"/>
+                              <w:lang w:val="en-GB"/>
+                            </w:rPr>
+                            <w:t>4.Evaluation &amp; Communicatio</w:t>
+                          </w:r>
+                          <w:r>
+                            <w:rPr>
+                              <w:b/>
+                              <w:bCs/>
+                              <w:color w:val="156082" w:themeColor="accent1"/>
+                              <w:sz w:val="22"/>
+                              <w:szCs w:val="22"/>
+                              <w:lang w:val="en-GB"/>
+                            </w:rPr>
+                            <w:t>n</w:t>
+                          </w:r>
+                          <w:r>
+                            <w:rPr>
+                              <w:b/>
+                              <w:bCs/>
+                              <w:color w:val="156082" w:themeColor="accent1"/>
+                              <w:sz w:val="22"/>
+                              <w:szCs w:val="22"/>
+                              <w:lang w:val="en-GB"/>
+                            </w:rPr>
+                            <w:t>n</w:t>
+                          </w:r>
+                        </w:p>
+                      </w:txbxContent>
+                    </v:textbox>
+                  </v:shape>
+                  <v:shape id="Text Box 7" o:spid="_x0000_s1042" type="#_x0000_t202" style="position:absolute;left:422;top:5021;width:15170;height:15169;visibility:visible;mso-wrap-style:square;v-text-anchor:top" o:gfxdata="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" filled="f" stroked="f" strokeweight=".5pt">
+                    <v:textbox>
+                      <w:txbxContent>
+                        <w:p>
+                          <w:pPr>
+                            <w:spacing w:line="240" w:lineRule="auto"/>
+                            <w:rPr>
+                              <w:b/>
+                              <w:bCs/>
+                              <w:sz w:val="20"/>
+                              <w:szCs w:val="20"/>
+                              <w:lang w:val="en-GB"/>
+                            </w:rPr>
+                          </w:pPr>
+                          <w:r>
+                            <w:rPr>
+                              <w:b/>
+                              <w:bCs/>
+                              <w:sz w:val="22"/>
+                              <w:szCs w:val="22"/>
+                              <w:lang w:val="en-GB"/>
+                            </w:rPr>
+                            <w:t>-</w:t>
+                          </w:r>
+                          <w:r>
+                            <w:rPr>
+                              <w:sz w:val="20"/>
+                              <w:szCs w:val="20"/>
+                              <w:lang w:val="en-GB"/>
+                            </w:rPr>
+                            <w:t xml:space="preserve">  </w:t>
+                          </w:r>
+                          <w:r>
+                            <w:rPr>
+                              <w:b/>
+                              <w:bCs/>
+                              <w:sz w:val="20"/>
+                              <w:szCs w:val="20"/>
+                              <w:lang w:val="en-GB"/>
+                            </w:rPr>
+                            <w:t>Metrics</w:t>
+                          </w:r>
+                          <w:r>
+                            <w:rPr>
+                              <w:b/>
+                              <w:bCs/>
+                              <w:sz w:val="20"/>
+                              <w:szCs w:val="20"/>
+                              <w:lang w:val="en-GB"/>
+                            </w:rPr>
+                            <w:t>: MAE, RMSE, R2</w:t>
+                          </w:r>
+                        </w:p>
+                        <w:p>
+                          <w:pPr>
+                            <w:spacing w:line="240" w:lineRule="auto"/>
+                            <w:rPr>
+                              <w:b/>
+                              <w:bCs/>
+                              <w:sz w:val="20"/>
+                              <w:szCs w:val="20"/>
+                            </w:rPr>
+                          </w:pPr>
+                          <w:r>
+                            <w:rPr>
+                              <w:b/>
+                              <w:bCs/>
+                              <w:sz w:val="22"/>
+                              <w:szCs w:val="22"/>
+                              <w:lang w:val="en-GB"/>
+                            </w:rPr>
+                            <w:t>-</w:t>
+                          </w:r>
+                          <w:r>
+                            <w:rPr>
+                              <w:b/>
+                              <w:bCs/>
+                              <w:sz w:val="20"/>
+                              <w:szCs w:val="20"/>
+                              <w:lang w:val="en-GB"/>
+                            </w:rPr>
+                            <w:t xml:space="preserve"> </w:t>
+                          </w:r>
+                          <w:r>
+                            <w:rPr>
+                              <w:b/>
+                              <w:bCs/>
+                              <w:sz w:val="20"/>
+                              <w:szCs w:val="20"/>
+                              <w:lang w:val="en-GB"/>
+                            </w:rPr>
+                            <w:t>Feature Importance</w:t>
+                          </w:r>
+                          <w:r>
+                            <w:rPr>
+                              <w:b/>
+                              <w:bCs/>
+                              <w:sz w:val="20"/>
+                              <w:szCs w:val="20"/>
+                              <w:lang w:val="en-GB"/>
+                            </w:rPr>
+                            <w:t xml:space="preserve"> (Interpretability)</w:t>
+                          </w:r>
+                        </w:p>
+                        <w:p>
+                          <w:pPr>
+                            <w:spacing w:line="240" w:lineRule="auto"/>
+                            <w:rPr>
+                              <w:b/>
+                              <w:bCs/>
+                              <w:sz w:val="20"/>
+                              <w:szCs w:val="20"/>
+                            </w:rPr>
+                          </w:pPr>
+                          <w:r>
+                            <w:rPr>
+                              <w:b/>
+                              <w:bCs/>
+                              <w:sz w:val="22"/>
+                              <w:szCs w:val="22"/>
+                              <w:lang w:val="en-GB"/>
+                            </w:rPr>
+                            <w:t>-</w:t>
+                          </w:r>
+                          <w:r>
+                            <w:rPr>
+                              <w:b/>
+                              <w:bCs/>
+                              <w:sz w:val="20"/>
+                              <w:szCs w:val="20"/>
+                              <w:lang w:val="en-GB"/>
+                            </w:rPr>
+                            <w:t xml:space="preserve"> </w:t>
+                          </w:r>
+                          <w:r>
+                            <w:rPr>
+                              <w:b/>
+                              <w:bCs/>
+                              <w:sz w:val="20"/>
+                              <w:szCs w:val="20"/>
+                              <w:lang w:val="en-GB"/>
+                            </w:rPr>
+                            <w:t>SLA Risk Insi</w:t>
+                          </w:r>
+                          <w:r>
+                            <w:rPr>
+                              <w:b/>
+                              <w:bCs/>
+                              <w:sz w:val="20"/>
+                              <w:szCs w:val="20"/>
+                              <w:lang w:val="en-GB"/>
+                            </w:rPr>
+                            <w:t>ghts</w:t>
+                          </w:r>
+                        </w:p>
+                        <w:p>
+                          <w:pPr>
+                            <w:spacing w:line="240" w:lineRule="auto"/>
+                            <w:rPr>
+                              <w:b/>
+                              <w:bCs/>
+                              <w:sz w:val="20"/>
+                              <w:szCs w:val="20"/>
+                            </w:rPr>
+                          </w:pPr>
+                          <w:r>
+                            <w:rPr>
+                              <w:b/>
+                              <w:bCs/>
+                              <w:sz w:val="22"/>
+                              <w:szCs w:val="22"/>
+                              <w:lang w:val="en-GB"/>
+                            </w:rPr>
+                            <w:t>-</w:t>
+                          </w:r>
+                          <w:r>
+                            <w:rPr>
+                              <w:b/>
+                              <w:bCs/>
+                              <w:sz w:val="20"/>
+                              <w:szCs w:val="20"/>
+                              <w:lang w:val="en-GB"/>
+                            </w:rPr>
+                            <w:t xml:space="preserve"> </w:t>
+                          </w:r>
+                          <w:r>
+                            <w:rPr>
+                              <w:b/>
+                              <w:bCs/>
+                              <w:sz w:val="20"/>
+                              <w:szCs w:val="20"/>
+                              <w:lang w:val="en-GB"/>
+                            </w:rPr>
+                            <w:t>Final</w:t>
+                          </w:r>
+                          <w:r>
+                            <w:rPr>
+                              <w:b/>
+                              <w:bCs/>
+                              <w:sz w:val="20"/>
+                              <w:szCs w:val="20"/>
+                              <w:lang w:val="en-GB"/>
+                            </w:rPr>
+                            <w:t xml:space="preserve"> The</w:t>
+                          </w:r>
+                          <w:r>
+                            <w:rPr>
+                              <w:b/>
+                              <w:bCs/>
+                              <w:sz w:val="20"/>
+                              <w:szCs w:val="20"/>
+                              <w:lang w:val="en-GB"/>
+                            </w:rPr>
+                            <w:t>sis &amp; Report</w:t>
+                          </w:r>
+                        </w:p>
+                        <w:p/>
+                      </w:txbxContent>
+                    </v:textbox>
+                  </v:shape>
+                </v:group>
+                <v:shapetype id="_x0000_t13" coordsize="21600,21600" o:spt="13" adj="16200,5400" path="m@0,l@0@1,0@1,0@2@0@2@0,21600,21600,10800xe">
+                  <v:stroke joinstyle="miter"/>
+                  <v:formulas>
+                    <v:f eqn="val #0"/>
+                    <v:f eqn="val #1"/>
+                    <v:f eqn="sum height 0 #1"/>
+                    <v:f eqn="sum 10800 0 #1"/>
+                    <v:f eqn="sum width 0 #0"/>
+                    <v:f eqn="prod @4 @3 10800"/>
+                    <v:f eqn="sum width 0 @5"/>
+                  </v:formulas>
+                  <v:path o:connecttype="custom" o:connectlocs="@0,0;0,10800;@0,21600;21600,10800" o:connectangles="270,180,90,0" textboxrect="0,@1,@6,@2"/>
+                  <v:handles>
+                    <v:h position="#0,#1" xrange="0,21600" yrange="0,10800"/>
+                  </v:handles>
+                </v:shapetype>
+                <v:shape id="Arrow: Right 12" o:spid="_x0000_s1043" type="#_x0000_t13" style="position:absolute;left:16015;top:16681;width:2537;height:902;visibility:visible;mso-wrap-style:square;v-text-anchor:middle" o:gfxdata="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" adj="17759" fillcolor="#e97132 [3205]" strokecolor="#e97132 [3205]" strokeweight="1.5pt"/>
+                <v:shape id="Arrow: Right 12" o:spid="_x0000_s1044" type="#_x0000_t13" style="position:absolute;left:34250;top:16681;width:2537;height:902;visibility:visible;mso-wrap-style:square;v-text-anchor:middle" o:gfxdata="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" adj="17759" fillcolor="#e97132 [3205]" strokecolor="#e97132 [3205]" strokeweight="1.5pt"/>
+                <v:shape id="Arrow: Right 12" o:spid="_x0000_s1045" type="#_x0000_t13" style="position:absolute;left:52432;top:16998;width:2537;height:902;visibility:visible;mso-wrap-style:square;v-text-anchor:middle" o:gfxdata="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" adj="17759" fillcolor="#e97132 [3205]" strokecolor="#e97132 [3205]" strokeweight="1.5pt"/>
+                <v:roundrect id="Rectangle: Rounded Corners 14" o:spid="_x0000_s1046" style="position:absolute;left:739;top:30127;width:69717;height:5233;visibility:visible;mso-wrap-style:square;v-text-anchor:middle" arcsize="10923f" o:gfxdata="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" fillcolor="#def1fa" strokecolor="#156082 [3204]" strokeweight="1.5pt">
+                  <v:stroke joinstyle="miter"/>
+                </v:roundrect>
+                <v:shape id="Text Box 15" o:spid="_x0000_s1047" type="#_x0000_t202" style="position:absolute;left:2642;top:31026;width:66281;height:3382;visibility:visible;mso-wrap-style:square;v-text-anchor:top" o:gfxdata="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" filled="f" stroked="f" strokeweight=".5pt">
+                  <v:textbox>
+                    <w:txbxContent>
+                      <w:p>
+                        <w:pPr>
+                          <w:jc w:val="center"/>
+                          <w:rPr>
+                            <w:color w:val="0F4761" w:themeColor="accent1" w:themeShade="BF"/>
+                            <w:lang w:val="en-GB"/>
+                          </w:rPr>
+                        </w:pPr>
+                        <w:r>
+                          <w:rPr>
+                            <w:color w:val="0F4761" w:themeColor="accent1" w:themeShade="BF"/>
+                            <w:lang w:val="en-GB"/>
+                          </w:rPr>
+                          <w:t>Tools &amp; Technologies: Python</w:t>
+                        </w:r>
+                        <w:r>
+                          <w:rPr>
+                            <w:color w:val="0F4761" w:themeColor="accent1" w:themeShade="BF"/>
+                            <w:lang w:val="en-GB"/>
+                          </w:rPr>
+                          <w:t xml:space="preserve"> | Pandas &amp; NumPy | Mat</w:t>
+                        </w:r>
+                        <w:r>
+                          <w:rPr>
+                            <w:color w:val="0F4761" w:themeColor="accent1" w:themeShade="BF"/>
+                            <w:lang w:val="en-GB"/>
+                          </w:rPr>
+                          <w:t>plotlib &amp; Seaborn | Scikit-Learn |</w:t>
+                        </w:r>
+                        <w:r>
+                          <w:rPr>
+                            <w:color w:val="0F4761" w:themeColor="accent1" w:themeShade="BF"/>
+                            <w:lang w:val="en-GB"/>
+                          </w:rPr>
+                          <w:t xml:space="preserve"> GitHub</w:t>
+                        </w:r>
+                      </w:p>
+                    </w:txbxContent>
+                  </v:textbox>
+                </v:shape>
+                <v:shape id="Text Box 16" o:spid="_x0000_s1048" type="#_x0000_t202" style="position:absolute;left:11152;width:48045;height:3647;visibility:visible;mso-wrap-style:square;v-text-anchor:top" o:gfxdata="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" fillcolor="white [3201]" stroked="f" strokeweight=".5pt">
+                  <v:textbox>
+                    <w:txbxContent>
+                      <w:p>
+                        <w:pPr>
+                          <w:jc w:val="center"/>
+                          <w:rPr>
+                            <w:b/>
+                            <w:bCs/>
+                            <w:color w:val="0F4761" w:themeColor="accent1" w:themeShade="BF"/>
+                            <w:sz w:val="28"/>
+                            <w:szCs w:val="28"/>
+                            <w:lang w:val="en-GB"/>
+                          </w:rPr>
+                        </w:pPr>
+                        <w:r>
+                          <w:rPr>
+                            <w:b/>
+                            <w:bCs/>
+                            <w:color w:val="0F4761" w:themeColor="accent1" w:themeShade="BF"/>
+                            <w:sz w:val="28"/>
+                            <w:szCs w:val="28"/>
+                            <w:lang w:val="en-GB"/>
+                          </w:rPr>
+                          <w:t>High</w:t>
+                        </w:r>
+                        <w:r>
+                          <w:rPr>
+                            <w:b/>
+                            <w:bCs/>
+                            <w:color w:val="0F4761" w:themeColor="accent1" w:themeShade="BF"/>
+                            <w:sz w:val="28"/>
+                            <w:szCs w:val="28"/>
+                            <w:lang w:val="en-GB"/>
+                          </w:rPr>
+                          <w:t xml:space="preserve">-Level </w:t>
+                        </w:r>
+                        <w:r>
+                          <w:rPr>
+                            <w:b/>
+                            <w:bCs/>
+                            <w:color w:val="0F4761" w:themeColor="accent1" w:themeShade="BF"/>
+                            <w:sz w:val="28"/>
+                            <w:szCs w:val="28"/>
+                            <w:lang w:val="en-GB"/>
+                          </w:rPr>
+                          <w:t>Pro</w:t>
+                        </w:r>
+                        <w:r>
+                          <w:rPr>
+                            <w:b/>
+                            <w:bCs/>
+                            <w:color w:val="0F4761" w:themeColor="accent1" w:themeShade="BF"/>
+                            <w:sz w:val="28"/>
+                            <w:szCs w:val="28"/>
+                            <w:lang w:val="en-GB"/>
+                          </w:rPr>
+                          <w:t>ject Architecture &amp; Data Science</w:t>
+                        </w:r>
+                        <w:r>
+                          <w:rPr>
+                            <w:b/>
+                            <w:bCs/>
+                            <w:color w:val="0F4761" w:themeColor="accent1" w:themeShade="BF"/>
+                            <w:sz w:val="28"/>
+                            <w:szCs w:val="28"/>
+                            <w:lang w:val="en-GB"/>
+                          </w:rPr>
+                          <w:t xml:space="preserve"> Workflow</w:t>
+                        </w:r>
+                      </w:p>
+                    </w:txbxContent>
+                  </v:textbox>
+                </v:shape>
+              </v:group>
+            </w:pict>
+          </mc:Fallback>
+        </mc:AlternateContent>
+      </w:r>
+    </w:p>
+    <w:p>
+      <w:pPr>
+        <w:rPr>
+          <w:b/>
+          <w:bCs/>
+        </w:rPr>
+      </w:pPr>
+    </w:p>
+    <w:p/>
     <w:p/>
     <w:p>
       <w:pPr>
@@ -602,6 +3727,12 @@
       </w:pPr>
     </w:p>
     <w:sectPr>
+      <w:headerReference w:type="even" r:id="rId7"/>
+      <w:headerReference w:type="default" r:id="rId8"/>
+      <w:footerReference w:type="even" r:id="rId9"/>
+      <w:footerReference w:type="default" r:id="rId10"/>
+      <w:headerReference w:type="first" r:id="rId11"/>
+      <w:footerReference w:type="first" r:id="rId12"/>
       <w:pgSz w:w="11906" w:h="16838"/>
       <w:pgMar w:top="1440" w:right="1440" w:bottom="1440" w:left="1440" w:header="708" w:footer="708" w:gutter="0"/>
       <w:cols w:space="708"/>
@@ -611,6 +3742,116 @@
 </w:document>
 </file>
 
+<file path=word/endnotes.xml><?xml version="1.0" encoding="utf-8"?>
+<w:endnotes xmlns:wpc="http://schemas.microsoft.com/office/word/2010/wordprocessingCanvas" xmlns:cx="http://schemas.microsoft.com/office/drawing/2014/chartex" xmlns:cx1="http://schemas.microsoft.com/office/drawing/2015/9/8/chartex" xmlns:cx2="http://schemas.microsoft.com/office/drawing/2015/10/21/chartex" xmlns:cx3="http://schemas.microsoft.com/office/drawing/2016/5/9/chartex" xmlns:cx4="http://schemas.microsoft.com/office/drawing/2016/5/10/chartex" xmlns:cx5="http://schemas.microsoft.com/office/drawing/2016/5/11/chartex" xmlns:cx6="http://schemas.microsoft.com/office/drawing/2016/5/12/chartex" xmlns:cx7="http://schemas.microsoft.com/office/drawing/2016/5/13/chartex" xmlns:cx8="http://schemas.microsoft.com/office/drawing/2016/5/14/chartex" xmlns:mc="http://schemas.openxmlformats.org/markup-compatibility/2006" xmlns:aink="http://schemas.microsoft.com/office/drawing/2016/ink" xmlns:am3d="http://schemas.microsoft.com/office/drawing/2017/model3d" xmlns:o="urn:schemas-microsoft-com:office:office" xmlns:oel="http://schemas.microsoft.com/office/2019/extlst" xmlns:r="http://schemas.openxmlformats.org/officeDocument/2006/relationships" xmlns:m="http://schemas.openxmlformats.org/officeDocument/2006/math" xmlns:v="urn:schemas-microsoft-com:vml" xmlns:wp14="http://schemas.microsoft.com/office/word/2010/wordprocessingDrawing" xmlns:wp="http://schemas.openxmlformats.org/drawingml/2006/wordprocessingDrawing" xmlns:w10="urn:schemas-microsoft-com:office:word" xmlns:w="http://schemas.openxmlformats.org/wordprocessingml/2006/main" xmlns:w14="http://schemas.microsoft.com/office/word/2010/wordml" xmlns:w15="http://schemas.microsoft.com/office/word/2012/wordml" xmlns:w16cex="http://schemas.microsoft.com/office/word/2018/wordml/cex" xmlns:w16cid="http://schemas.microsoft.com/office/word/2016/wordml/cid" xmlns:w16="http://schemas.microsoft.com/office/word/2018/wordml" xmlns:w16du="http://schemas.microsoft.com/office/word/2023/wordml/word16du" xmlns:w16sdtdh="http://schemas.microsoft.com/office/word/2020/wordml/sdtdatahash" xmlns:w16sdtfl="http://schemas.microsoft.com/office/word/2024/wordml/sdtformatlock" xmlns:w16se="http://schemas.microsoft.com/office/word/2015/wordml/symex" xmlns:wpg="http://schemas.microsoft.com/office/word/2010/wordprocessingGroup" xmlns:wpi="http://schemas.microsoft.com/office/word/2010/wordprocessingInk" xmlns:wne="http://schemas.microsoft.com/office/word/2006/wordml" xmlns:wps="http://schemas.microsoft.com/office/word/2010/wordprocessingShape" mc:Ignorable="w14 w15 w16se w16cid w16 w16cex w16sdtdh w16sdtfl w16du wp14">
+  <w:endnote w:type="separator" w:id="-1">
+    <w:p>
+      <w:pPr>
+        <w:spacing w:after="0" w:line="240" w:lineRule="auto"/>
+      </w:pPr>
+      <w:r>
+        <w:separator/>
+      </w:r>
+    </w:p>
+  </w:endnote>
+  <w:endnote w:type="continuationSeparator" w:id="0">
+    <w:p>
+      <w:pPr>
+        <w:spacing w:after="0" w:line="240" w:lineRule="auto"/>
+      </w:pPr>
+      <w:r>
+        <w:continuationSeparator/>
+      </w:r>
+    </w:p>
+  </w:endnote>
+</w:endnotes>
+</file>
+
+<file path=word/footer1.xml><?xml version="1.0" encoding="utf-8"?>
+<w:ftr xmlns:wpc="http://schemas.microsoft.com/office/word/2010/wordprocessingCanvas" xmlns:cx="http://schemas.microsoft.com/office/drawing/2014/chartex" xmlns:cx1="http://schemas.microsoft.com/office/drawing/2015/9/8/chartex" xmlns:cx2="http://schemas.microsoft.com/office/drawing/2015/10/21/chartex" xmlns:cx3="http://schemas.microsoft.com/office/drawing/2016/5/9/chartex" xmlns:cx4="http://schemas.microsoft.com/office/drawing/2016/5/10/chartex" xmlns:cx5="http://schemas.microsoft.com/office/drawing/2016/5/11/chartex" xmlns:cx6="http://schemas.microsoft.com/office/drawing/2016/5/12/chartex" xmlns:cx7="http://schemas.microsoft.com/office/drawing/2016/5/13/chartex" xmlns:cx8="http://schemas.microsoft.com/office/drawing/2016/5/14/chartex" xmlns:mc="http://schemas.openxmlformats.org/markup-compatibility/2006" xmlns:aink="http://schemas.microsoft.com/office/drawing/2016/ink" xmlns:am3d="http://schemas.microsoft.com/office/drawing/2017/model3d" xmlns:o="urn:schemas-microsoft-com:office:office" xmlns:oel="http://schemas.microsoft.com/office/2019/extlst" xmlns:r="http://schemas.openxmlformats.org/officeDocument/2006/relationships" xmlns:m="http://schemas.openxmlformats.org/officeDocument/2006/math" xmlns:v="urn:schemas-microsoft-com:vml" xmlns:wp14="http://schemas.microsoft.com/office/word/2010/wordprocessingDrawing" xmlns:wp="http://schemas.openxmlformats.org/drawingml/2006/wordprocessingDrawing" xmlns:w10="urn:schemas-microsoft-com:office:word" xmlns:w="http://schemas.openxmlformats.org/wordprocessingml/2006/main" xmlns:w14="http://schemas.microsoft.com/office/word/2010/wordml" xmlns:w15="http://schemas.microsoft.com/office/word/2012/wordml" xmlns:w16cex="http://schemas.microsoft.com/office/word/2018/wordml/cex" xmlns:w16cid="http://schemas.microsoft.com/office/word/2016/wordml/cid" xmlns:w16="http://schemas.microsoft.com/office/word/2018/wordml" xmlns:w16du="http://schemas.microsoft.com/office/word/2023/wordml/word16du" xmlns:w16sdtdh="http://schemas.microsoft.com/office/word/2020/wordml/sdtdatahash" xmlns:w16sdtfl="http://schemas.microsoft.com/office/word/2024/wordml/sdtformatlock" xmlns:w16se="http://schemas.microsoft.com/office/word/2015/wordml/symex" xmlns:wpg="http://schemas.microsoft.com/office/word/2010/wordprocessingGroup" xmlns:wpi="http://schemas.microsoft.com/office/word/2010/wordprocessingInk" xmlns:wne="http://schemas.microsoft.com/office/word/2006/wordml" xmlns:wps="http://schemas.microsoft.com/office/word/2010/wordprocessingShape" mc:Ignorable="w14 w15 w16se w16cid w16 w16cex w16sdtdh w16sdtfl w16du wp14">
+  <w:p>
+    <w:pPr>
+      <w:pStyle w:val="Footer"/>
+    </w:pPr>
+  </w:p>
+</w:ftr>
+</file>
+
+<file path=word/footer2.xml><?xml version="1.0" encoding="utf-8"?>
+<w:ftr xmlns:wpc="http://schemas.microsoft.com/office/word/2010/wordprocessingCanvas" xmlns:cx="http://schemas.microsoft.com/office/drawing/2014/chartex" xmlns:cx1="http://schemas.microsoft.com/office/drawing/2015/9/8/chartex" xmlns:cx2="http://schemas.microsoft.com/office/drawing/2015/10/21/chartex" xmlns:cx3="http://schemas.microsoft.com/office/drawing/2016/5/9/chartex" xmlns:cx4="http://schemas.microsoft.com/office/drawing/2016/5/10/chartex" xmlns:cx5="http://schemas.microsoft.com/office/drawing/2016/5/11/chartex" xmlns:cx6="http://schemas.microsoft.com/office/drawing/2016/5/12/chartex" xmlns:cx7="http://schemas.microsoft.com/office/drawing/2016/5/13/chartex" xmlns:cx8="http://schemas.microsoft.com/office/drawing/2016/5/14/chartex" xmlns:mc="http://schemas.openxmlformats.org/markup-compatibility/2006" xmlns:aink="http://schemas.microsoft.com/office/drawing/2016/ink" xmlns:am3d="http://schemas.microsoft.com/office/drawing/2017/model3d" xmlns:o="urn:schemas-microsoft-com:office:office" xmlns:oel="http://schemas.microsoft.com/office/2019/extlst" xmlns:r="http://schemas.openxmlformats.org/officeDocument/2006/relationships" xmlns:m="http://schemas.openxmlformats.org/officeDocument/2006/math" xmlns:v="urn:schemas-microsoft-com:vml" xmlns:wp14="http://schemas.microsoft.com/office/word/2010/wordprocessingDrawing" xmlns:wp="http://schemas.openxmlformats.org/drawingml/2006/wordprocessingDrawing" xmlns:w10="urn:schemas-microsoft-com:office:word" xmlns:w="http://schemas.openxmlformats.org/wordprocessingml/2006/main" xmlns:w14="http://schemas.microsoft.com/office/word/2010/wordml" xmlns:w15="http://schemas.microsoft.com/office/word/2012/wordml" xmlns:w16cex="http://schemas.microsoft.com/office/word/2018/wordml/cex" xmlns:w16cid="http://schemas.microsoft.com/office/word/2016/wordml/cid" xmlns:w16="http://schemas.microsoft.com/office/word/2018/wordml" xmlns:w16du="http://schemas.microsoft.com/office/word/2023/wordml/word16du" xmlns:w16sdtdh="http://schemas.microsoft.com/office/word/2020/wordml/sdtdatahash" xmlns:w16sdtfl="http://schemas.microsoft.com/office/word/2024/wordml/sdtformatlock" xmlns:w16se="http://schemas.microsoft.com/office/word/2015/wordml/symex" xmlns:wpg="http://schemas.microsoft.com/office/word/2010/wordprocessingGroup" xmlns:wpi="http://schemas.microsoft.com/office/word/2010/wordprocessingInk" xmlns:wne="http://schemas.microsoft.com/office/word/2006/wordml" xmlns:wps="http://schemas.microsoft.com/office/word/2010/wordprocessingShape" mc:Ignorable="w14 w15 w16se w16cid w16 w16cex w16sdtdh w16sdtfl w16du wp14">
+  <w:p>
+    <w:pPr>
+      <w:pStyle w:val="Footer"/>
+    </w:pPr>
+  </w:p>
+</w:ftr>
+</file>
+
+<file path=word/footer3.xml><?xml version="1.0" encoding="utf-8"?>
+<w:ftr xmlns:wpc="http://schemas.microsoft.com/office/word/2010/wordprocessingCanvas" xmlns:cx="http://schemas.microsoft.com/office/drawing/2014/chartex" xmlns:cx1="http://schemas.microsoft.com/office/drawing/2015/9/8/chartex" xmlns:cx2="http://schemas.microsoft.com/office/drawing/2015/10/21/chartex" xmlns:cx3="http://schemas.microsoft.com/office/drawing/2016/5/9/chartex" xmlns:cx4="http://schemas.microsoft.com/office/drawing/2016/5/10/chartex" xmlns:cx5="http://schemas.microsoft.com/office/drawing/2016/5/11/chartex" xmlns:cx6="http://schemas.microsoft.com/office/drawing/2016/5/12/chartex" xmlns:cx7="http://schemas.microsoft.com/office/drawing/2016/5/13/chartex" xmlns:cx8="http://schemas.microsoft.com/office/drawing/2016/5/14/chartex" xmlns:mc="http://schemas.openxmlformats.org/markup-compatibility/2006" xmlns:aink="http://schemas.microsoft.com/office/drawing/2016/ink" xmlns:am3d="http://schemas.microsoft.com/office/drawing/2017/model3d" xmlns:o="urn:schemas-microsoft-com:office:office" xmlns:oel="http://schemas.microsoft.com/office/2019/extlst" xmlns:r="http://schemas.openxmlformats.org/officeDocument/2006/relationships" xmlns:m="http://schemas.openxmlformats.org/officeDocument/2006/math" xmlns:v="urn:schemas-microsoft-com:vml" xmlns:wp14="http://schemas.microsoft.com/office/word/2010/wordprocessingDrawing" xmlns:wp="http://schemas.openxmlformats.org/drawingml/2006/wordprocessingDrawing" xmlns:w10="urn:schemas-microsoft-com:office:word" xmlns:w="http://schemas.openxmlformats.org/wordprocessingml/2006/main" xmlns:w14="http://schemas.microsoft.com/office/word/2010/wordml" xmlns:w15="http://schemas.microsoft.com/office/word/2012/wordml" xmlns:w16cex="http://schemas.microsoft.com/office/word/2018/wordml/cex" xmlns:w16cid="http://schemas.microsoft.com/office/word/2016/wordml/cid" xmlns:w16="http://schemas.microsoft.com/office/word/2018/wordml" xmlns:w16du="http://schemas.microsoft.com/office/word/2023/wordml/word16du" xmlns:w16sdtdh="http://schemas.microsoft.com/office/word/2020/wordml/sdtdatahash" xmlns:w16sdtfl="http://schemas.microsoft.com/office/word/2024/wordml/sdtformatlock" xmlns:w16se="http://schemas.microsoft.com/office/word/2015/wordml/symex" xmlns:wpg="http://schemas.microsoft.com/office/word/2010/wordprocessingGroup" xmlns:wpi="http://schemas.microsoft.com/office/word/2010/wordprocessingInk" xmlns:wne="http://schemas.microsoft.com/office/word/2006/wordml" xmlns:wps="http://schemas.microsoft.com/office/word/2010/wordprocessingShape" mc:Ignorable="w14 w15 w16se w16cid w16 w16cex w16sdtdh w16sdtfl w16du wp14">
+  <w:p>
+    <w:pPr>
+      <w:pStyle w:val="Footer"/>
+    </w:pPr>
+  </w:p>
+</w:ftr>
+</file>
+
+<file path=word/footnotes.xml><?xml version="1.0" encoding="utf-8"?>
+<w:footnotes xmlns:wpc="http://schemas.microsoft.com/office/word/2010/wordprocessingCanvas" xmlns:cx="http://schemas.microsoft.com/office/drawing/2014/chartex" xmlns:cx1="http://schemas.microsoft.com/office/drawing/2015/9/8/chartex" xmlns:cx2="http://schemas.microsoft.com/office/drawing/2015/10/21/chartex" xmlns:cx3="http://schemas.microsoft.com/office/drawing/2016/5/9/chartex" xmlns:cx4="http://schemas.microsoft.com/office/drawing/2016/5/10/chartex" xmlns:cx5="http://schemas.microsoft.com/office/drawing/2016/5/11/chartex" xmlns:cx6="http://schemas.microsoft.com/office/drawing/2016/5/12/chartex" xmlns:cx7="http://schemas.microsoft.com/office/drawing/2016/5/13/chartex" xmlns:cx8="http://schemas.microsoft.com/office/drawing/2016/5/14/chartex" xmlns:mc="http://schemas.openxmlformats.org/markup-compatibility/2006" xmlns:aink="http://schemas.microsoft.com/office/drawing/2016/ink" xmlns:am3d="http://schemas.microsoft.com/office/drawing/2017/model3d" xmlns:o="urn:schemas-microsoft-com:office:office" xmlns:oel="http://schemas.microsoft.com/office/2019/extlst" xmlns:r="http://schemas.openxmlformats.org/officeDocument/2006/relationships" xmlns:m="http://schemas.openxmlformats.org/officeDocument/2006/math" xmlns:v="urn:schemas-microsoft-com:vml" xmlns:wp14="http://schemas.microsoft.com/office/word/2010/wordprocessingDrawing" xmlns:wp="http://schemas.openxmlformats.org/drawingml/2006/wordprocessingDrawing" xmlns:w10="urn:schemas-microsoft-com:office:word" xmlns:w="http://schemas.openxmlformats.org/wordprocessingml/2006/main" xmlns:w14="http://schemas.microsoft.com/office/word/2010/wordml" xmlns:w15="http://schemas.microsoft.com/office/word/2012/wordml" xmlns:w16cex="http://schemas.microsoft.com/office/word/2018/wordml/cex" xmlns:w16cid="http://schemas.microsoft.com/office/word/2016/wordml/cid" xmlns:w16="http://schemas.microsoft.com/office/word/2018/wordml" xmlns:w16du="http://schemas.microsoft.com/office/word/2023/wordml/word16du" xmlns:w16sdtdh="http://schemas.microsoft.com/office/word/2020/wordml/sdtdatahash" xmlns:w16sdtfl="http://schemas.microsoft.com/office/word/2024/wordml/sdtformatlock" xmlns:w16se="http://schemas.microsoft.com/office/word/2015/wordml/symex" xmlns:wpg="http://schemas.microsoft.com/office/word/2010/wordprocessingGroup" xmlns:wpi="http://schemas.microsoft.com/office/word/2010/wordprocessingInk" xmlns:wne="http://schemas.microsoft.com/office/word/2006/wordml" xmlns:wps="http://schemas.microsoft.com/office/word/2010/wordprocessingShape" mc:Ignorable="w14 w15 w16se w16cid w16 w16cex w16sdtdh w16sdtfl w16du wp14">
+  <w:footnote w:type="separator" w:id="-1">
+    <w:p>
+      <w:pPr>
+        <w:spacing w:after="0" w:line="240" w:lineRule="auto"/>
+      </w:pPr>
+      <w:r>
+        <w:separator/>
+      </w:r>
+    </w:p>
+  </w:footnote>
+  <w:footnote w:type="continuationSeparator" w:id="0">
+    <w:p>
+      <w:pPr>
+        <w:spacing w:after="0" w:line="240" w:lineRule="auto"/>
+      </w:pPr>
+      <w:r>
+        <w:continuationSeparator/>
+      </w:r>
+    </w:p>
+  </w:footnote>
+</w:footnotes>
+</file>
+
+<file path=word/header1.xml><?xml version="1.0" encoding="utf-8"?>
+<w:hdr xmlns:wpc="http://schemas.microsoft.com/office/word/2010/wordprocessingCanvas" xmlns:cx="http://schemas.microsoft.com/office/drawing/2014/chartex" xmlns:cx1="http://schemas.microsoft.com/office/drawing/2015/9/8/chartex" xmlns:cx2="http://schemas.microsoft.com/office/drawing/2015/10/21/chartex" xmlns:cx3="http://schemas.microsoft.com/office/drawing/2016/5/9/chartex" xmlns:cx4="http://schemas.microsoft.com/office/drawing/2016/5/10/chartex" xmlns:cx5="http://schemas.microsoft.com/office/drawing/2016/5/11/chartex" xmlns:cx6="http://schemas.microsoft.com/office/drawing/2016/5/12/chartex" xmlns:cx7="http://schemas.microsoft.com/office/drawing/2016/5/13/chartex" xmlns:cx8="http://schemas.microsoft.com/office/drawing/2016/5/14/chartex" xmlns:mc="http://schemas.openxmlformats.org/markup-compatibility/2006" xmlns:aink="http://schemas.microsoft.com/office/drawing/2016/ink" xmlns:am3d="http://schemas.microsoft.com/office/drawing/2017/model3d" xmlns:o="urn:schemas-microsoft-com:office:office" xmlns:oel="http://schemas.microsoft.com/office/2019/extlst" xmlns:r="http://schemas.openxmlformats.org/officeDocument/2006/relationships" xmlns:m="http://schemas.openxmlformats.org/officeDocument/2006/math" xmlns:v="urn:schemas-microsoft-com:vml" xmlns:wp14="http://schemas.microsoft.com/office/word/2010/wordprocessingDrawing" xmlns:wp="http://schemas.openxmlformats.org/drawingml/2006/wordprocessingDrawing" xmlns:w10="urn:schemas-microsoft-com:office:word" xmlns:w="http://schemas.openxmlformats.org/wordprocessingml/2006/main" xmlns:w14="http://schemas.microsoft.com/office/word/2010/wordml" xmlns:w15="http://schemas.microsoft.com/office/word/2012/wordml" xmlns:w16cex="http://schemas.microsoft.com/office/word/2018/wordml/cex" xmlns:w16cid="http://schemas.microsoft.com/office/word/2016/wordml/cid" xmlns:w16="http://schemas.microsoft.com/office/word/2018/wordml" xmlns:w16du="http://schemas.microsoft.com/office/word/2023/wordml/word16du" xmlns:w16sdtdh="http://schemas.microsoft.com/office/word/2020/wordml/sdtdatahash" xmlns:w16sdtfl="http://schemas.microsoft.com/office/word/2024/wordml/sdtformatlock" xmlns:w16se="http://schemas.microsoft.com/office/word/2015/wordml/symex" xmlns:wpg="http://schemas.microsoft.com/office/word/2010/wordprocessingGroup" xmlns:wpi="http://schemas.microsoft.com/office/word/2010/wordprocessingInk" xmlns:wne="http://schemas.microsoft.com/office/word/2006/wordml" xmlns:wps="http://schemas.microsoft.com/office/word/2010/wordprocessingShape" mc:Ignorable="w14 w15 w16se w16cid w16 w16cex w16sdtdh w16sdtfl w16du wp14">
+  <w:p>
+    <w:pPr>
+      <w:pStyle w:val="Header"/>
+    </w:pPr>
+  </w:p>
+</w:hdr>
+</file>
+
+<file path=word/header2.xml><?xml version="1.0" encoding="utf-8"?>
+<w:hdr xmlns:wpc="http://schemas.microsoft.com/office/word/2010/wordprocessingCanvas" xmlns:cx="http://schemas.microsoft.com/office/drawing/2014/chartex" xmlns:cx1="http://schemas.microsoft.com/office/drawing/2015/9/8/chartex" xmlns:cx2="http://schemas.microsoft.com/office/drawing/2015/10/21/chartex" xmlns:cx3="http://schemas.microsoft.com/office/drawing/2016/5/9/chartex" xmlns:cx4="http://schemas.microsoft.com/office/drawing/2016/5/10/chartex" xmlns:cx5="http://schemas.microsoft.com/office/drawing/2016/5/11/chartex" xmlns:cx6="http://schemas.microsoft.com/office/drawing/2016/5/12/chartex" xmlns:cx7="http://schemas.microsoft.com/office/drawing/2016/5/13/chartex" xmlns:cx8="http://schemas.microsoft.com/office/drawing/2016/5/14/chartex" xmlns:mc="http://schemas.openxmlformats.org/markup-compatibility/2006" xmlns:aink="http://schemas.microsoft.com/office/drawing/2016/ink" xmlns:am3d="http://schemas.microsoft.com/office/drawing/2017/model3d" xmlns:o="urn:schemas-microsoft-com:office:office" xmlns:oel="http://schemas.microsoft.com/office/2019/extlst" xmlns:r="http://schemas.openxmlformats.org/officeDocument/2006/relationships" xmlns:m="http://schemas.openxmlformats.org/officeDocument/2006/math" xmlns:v="urn:schemas-microsoft-com:vml" xmlns:wp14="http://schemas.microsoft.com/office/word/2010/wordprocessingDrawing" xmlns:wp="http://schemas.openxmlformats.org/drawingml/2006/wordprocessingDrawing" xmlns:w10="urn:schemas-microsoft-com:office:word" xmlns:w="http://schemas.openxmlformats.org/wordprocessingml/2006/main" xmlns:w14="http://schemas.microsoft.com/office/word/2010/wordml" xmlns:w15="http://schemas.microsoft.com/office/word/2012/wordml" xmlns:w16cex="http://schemas.microsoft.com/office/word/2018/wordml/cex" xmlns:w16cid="http://schemas.microsoft.com/office/word/2016/wordml/cid" xmlns:w16="http://schemas.microsoft.com/office/word/2018/wordml" xmlns:w16du="http://schemas.microsoft.com/office/word/2023/wordml/word16du" xmlns:w16sdtdh="http://schemas.microsoft.com/office/word/2020/wordml/sdtdatahash" xmlns:w16sdtfl="http://schemas.microsoft.com/office/word/2024/wordml/sdtformatlock" xmlns:w16se="http://schemas.microsoft.com/office/word/2015/wordml/symex" xmlns:wpg="http://schemas.microsoft.com/office/word/2010/wordprocessingGroup" xmlns:wpi="http://schemas.microsoft.com/office/word/2010/wordprocessingInk" xmlns:wne="http://schemas.microsoft.com/office/word/2006/wordml" xmlns:wps="http://schemas.microsoft.com/office/word/2010/wordprocessingShape" mc:Ignorable="w14 w15 w16se w16cid w16 w16cex w16sdtdh w16sdtfl w16du wp14">
+  <w:p>
+    <w:pPr>
+      <w:pStyle w:val="Header"/>
+    </w:pPr>
+  </w:p>
+</w:hdr>
+</file>
+
+<file path=word/header3.xml><?xml version="1.0" encoding="utf-8"?>
+<w:hdr xmlns:wpc="http://schemas.microsoft.com/office/word/2010/wordprocessingCanvas" xmlns:cx="http://schemas.microsoft.com/office/drawing/2014/chartex" xmlns:cx1="http://schemas.microsoft.com/office/drawing/2015/9/8/chartex" xmlns:cx2="http://schemas.microsoft.com/office/drawing/2015/10/21/chartex" xmlns:cx3="http://schemas.microsoft.com/office/drawing/2016/5/9/chartex" xmlns:cx4="http://schemas.microsoft.com/office/drawing/2016/5/10/chartex" xmlns:cx5="http://schemas.microsoft.com/office/drawing/2016/5/11/chartex" xmlns:cx6="http://schemas.microsoft.com/office/drawing/2016/5/12/chartex" xmlns:cx7="http://schemas.microsoft.com/office/drawing/2016/5/13/chartex" xmlns:cx8="http://schemas.microsoft.com/office/drawing/2016/5/14/chartex" xmlns:mc="http://schemas.openxmlformats.org/markup-compatibility/2006" xmlns:aink="http://schemas.microsoft.com/office/drawing/2016/ink" xmlns:am3d="http://schemas.microsoft.com/office/drawing/2017/model3d" xmlns:o="urn:schemas-microsoft-com:office:office" xmlns:oel="http://schemas.microsoft.com/office/2019/extlst" xmlns:r="http://schemas.openxmlformats.org/officeDocument/2006/relationships" xmlns:m="http://schemas.openxmlformats.org/officeDocument/2006/math" xmlns:v="urn:schemas-microsoft-com:vml" xmlns:wp14="http://schemas.microsoft.com/office/word/2010/wordprocessingDrawing" xmlns:wp="http://schemas.openxmlformats.org/drawingml/2006/wordprocessingDrawing" xmlns:w10="urn:schemas-microsoft-com:office:word" xmlns:w="http://schemas.openxmlformats.org/wordprocessingml/2006/main" xmlns:w14="http://schemas.microsoft.com/office/word/2010/wordml" xmlns:w15="http://schemas.microsoft.com/office/word/2012/wordml" xmlns:w16cex="http://schemas.microsoft.com/office/word/2018/wordml/cex" xmlns:w16cid="http://schemas.microsoft.com/office/word/2016/wordml/cid" xmlns:w16="http://schemas.microsoft.com/office/word/2018/wordml" xmlns:w16du="http://schemas.microsoft.com/office/word/2023/wordml/word16du" xmlns:w16sdtdh="http://schemas.microsoft.com/office/word/2020/wordml/sdtdatahash" xmlns:w16sdtfl="http://schemas.microsoft.com/office/word/2024/wordml/sdtformatlock" xmlns:w16se="http://schemas.microsoft.com/office/word/2015/wordml/symex" xmlns:wpg="http://schemas.microsoft.com/office/word/2010/wordprocessingGroup" xmlns:wpi="http://schemas.microsoft.com/office/word/2010/wordprocessingInk" xmlns:wne="http://schemas.microsoft.com/office/word/2006/wordml" xmlns:wps="http://schemas.microsoft.com/office/word/2010/wordprocessingShape" mc:Ignorable="w14 w15 w16se w16cid w16 w16cex w16sdtdh w16sdtfl w16du wp14">
+  <w:p>
+    <w:pPr>
+      <w:pStyle w:val="Header"/>
+    </w:pPr>
+  </w:p>
+</w:hdr>
+</file>
+
 <file path=word/numbering.xml><?xml version="1.0" encoding="utf-8"?>
 <w:numbering xmlns:wpc="http://schemas.microsoft.com/office/word/2010/wordprocessingCanvas" xmlns:cx="http://schemas.microsoft.com/office/drawing/2014/chartex" xmlns:cx1="http://schemas.microsoft.com/office/drawing/2015/9/8/chartex" xmlns:cx2="http://schemas.microsoft.com/office/drawing/2015/10/21/chartex" xmlns:cx3="http://schemas.microsoft.com/office/drawing/2016/5/9/chartex" xmlns:cx4="http://schemas.microsoft.com/office/drawing/2016/5/10/chartex" xmlns:cx5="http://schemas.microsoft.com/office/drawing/2016/5/11/chartex" xmlns:cx6="http://schemas.microsoft.com/office/drawing/2016/5/12/chartex" xmlns:cx7="http://schemas.microsoft.com/office/drawing/2016/5/13/chartex" xmlns:cx8="http://schemas.microsoft.com/office/drawing/2016/5/14/chartex" xmlns:mc="http://schemas.openxmlformats.org/markup-compatibility/2006" xmlns:aink="http://schemas.microsoft.com/office/drawing/2016/ink" xmlns:am3d="http://schemas.microsoft.com/office/drawing/2017/model3d" xmlns:o="urn:schemas-microsoft-com:office:office" xmlns:oel="http://schemas.microsoft.com/office/2019/extlst" xmlns:r="http://schemas.openxmlformats.org/officeDocument/2006/relationships" xmlns:m="http://schemas.openxmlformats.org/officeDocument/2006/math" xmlns:v="urn:schemas-microsoft-com:vml" xmlns:wp14="http://schemas.microsoft.com/office/word/2010/wordprocessingDrawing" xmlns:wp="http://schemas.openxmlformats.org/drawingml/2006/wordprocessingDrawing" xmlns:w10="urn:schemas-microsoft-com:office:word" xmlns:w="http://schemas.openxmlformats.org/wordprocessingml/2006/main" xmlns:w14="http://schemas.microsoft.com/office/word/2010/wordml" xmlns:w15="http://schemas.microsoft.com/office/word/2012/wordml" xmlns:w16cex="http://schemas.microsoft.com/office/word/2018/wordml/cex" xmlns:w16cid="http://schemas.microsoft.com/office/word/2016/wordml/cid" xmlns:w16="http://schemas.microsoft.com/office/word/2018/wordml" xmlns:w16du="http://schemas.microsoft.com/office/word/2023/wordml/word16du" xmlns:w16sdtdh="http://schemas.microsoft.com/office/word/2020/wordml/sdtdatahash" xmlns:w16sdtfl="http://schemas.microsoft.com/office/word/2024/wordml/sdtformatlock" xmlns:w16se="http://schemas.microsoft.com/office/word/2015/wordml/symex" xmlns:wpg="http://schemas.microsoft.com/office/word/2010/wordprocessingGroup" xmlns:wpi="http://schemas.microsoft.com/office/word/2010/wordprocessingInk" xmlns:wne="http://schemas.microsoft.com/office/word/2006/wordml" xmlns:wps="http://schemas.microsoft.com/office/word/2010/wordprocessingShape" mc:Ignorable="w14 w15 w16se w16cid w16 w16cex w16sdtdh w16sdtfl w16du wp14">
   <w:abstractNum w:abstractNumId="0" w15:restartNumberingAfterBreak="0">
@@ -763,6 +4004,119 @@
     </w:lvl>
   </w:abstractNum>
   <w:abstractNum w:abstractNumId="1" w15:restartNumberingAfterBreak="0">
+    <w:nsid w:val="1C6B6E88"/>
+    <w:multiLevelType w:val="multilevel"/>
+    <w:tmpl w:val="5E28C30C"/>
+    <w:lvl w:ilvl="0">
+      <w:start w:val="1"/>
+      <w:numFmt w:val="decimal"/>
+      <w:lvlText w:val="%1."/>
+      <w:lvlJc w:val="left"/>
+      <w:pPr>
+        <w:tabs>
+          <w:tab w:val="num" w:pos="720"/>
+        </w:tabs>
+        <w:ind w:left="720" w:hanging="360"/>
+      </w:pPr>
+    </w:lvl>
+    <w:lvl w:ilvl="1" w:tentative="1">
+      <w:start w:val="1"/>
+      <w:numFmt w:val="decimal"/>
+      <w:lvlText w:val="%2."/>
+      <w:lvlJc w:val="left"/>
+      <w:pPr>
+        <w:tabs>
+          <w:tab w:val="num" w:pos="1440"/>
+        </w:tabs>
+        <w:ind w:left="1440" w:hanging="360"/>
+      </w:pPr>
+    </w:lvl>
+    <w:lvl w:ilvl="2" w:tentative="1">
+      <w:start w:val="1"/>
+      <w:numFmt w:val="decimal"/>
+      <w:lvlText w:val="%3."/>
+      <w:lvlJc w:val="left"/>
+      <w:pPr>
+        <w:tabs>
+          <w:tab w:val="num" w:pos="2160"/>
+        </w:tabs>
+        <w:ind w:left="2160" w:hanging="360"/>
+      </w:pPr>
+    </w:lvl>
+    <w:lvl w:ilvl="3" w:tentative="1">
+      <w:start w:val="1"/>
+      <w:numFmt w:val="decimal"/>
+      <w:lvlText w:val="%4."/>
+      <w:lvlJc w:val="left"/>
+      <w:pPr>
+        <w:tabs>
+          <w:tab w:val="num" w:pos="2880"/>
+        </w:tabs>
+        <w:ind w:left="2880" w:hanging="360"/>
+      </w:pPr>
+    </w:lvl>
+    <w:lvl w:ilvl="4" w:tentative="1">
+      <w:start w:val="1"/>
+      <w:numFmt w:val="decimal"/>
+      <w:lvlText w:val="%5."/>
+      <w:lvlJc w:val="left"/>
+      <w:pPr>
+        <w:tabs>
+          <w:tab w:val="num" w:pos="3600"/>
+        </w:tabs>
+        <w:ind w:left="3600" w:hanging="360"/>
+      </w:pPr>
+    </w:lvl>
+    <w:lvl w:ilvl="5" w:tentative="1">
+      <w:start w:val="1"/>
+      <w:numFmt w:val="decimal"/>
+      <w:lvlText w:val="%6."/>
+      <w:lvlJc w:val="left"/>
+      <w:pPr>
+        <w:tabs>
+          <w:tab w:val="num" w:pos="4320"/>
+        </w:tabs>
+        <w:ind w:left="4320" w:hanging="360"/>
+      </w:pPr>
+    </w:lvl>
+    <w:lvl w:ilvl="6" w:tentative="1">
+      <w:start w:val="1"/>
+      <w:numFmt w:val="decimal"/>
+      <w:lvlText w:val="%7."/>
+      <w:lvlJc w:val="left"/>
+      <w:pPr>
+        <w:tabs>
+          <w:tab w:val="num" w:pos="5040"/>
+        </w:tabs>
+        <w:ind w:left="5040" w:hanging="360"/>
+      </w:pPr>
+    </w:lvl>
+    <w:lvl w:ilvl="7" w:tentative="1">
+      <w:start w:val="1"/>
+      <w:numFmt w:val="decimal"/>
+      <w:lvlText w:val="%8."/>
+      <w:lvlJc w:val="left"/>
+      <w:pPr>
+        <w:tabs>
+          <w:tab w:val="num" w:pos="5760"/>
+        </w:tabs>
+        <w:ind w:left="5760" w:hanging="360"/>
+      </w:pPr>
+    </w:lvl>
+    <w:lvl w:ilvl="8" w:tentative="1">
+      <w:start w:val="1"/>
+      <w:numFmt w:val="decimal"/>
+      <w:lvlText w:val="%9."/>
+      <w:lvlJc w:val="left"/>
+      <w:pPr>
+        <w:tabs>
+          <w:tab w:val="num" w:pos="6480"/>
+        </w:tabs>
+        <w:ind w:left="6480" w:hanging="360"/>
+      </w:pPr>
+    </w:lvl>
+  </w:abstractNum>
+  <w:abstractNum w:abstractNumId="2" w15:restartNumberingAfterBreak="0">
     <w:nsid w:val="29A9691F"/>
     <w:multiLevelType w:val="multilevel"/>
     <w:tmpl w:val="2CBED9BC"/>
@@ -911,7 +4265,7 @@
       </w:rPr>
     </w:lvl>
   </w:abstractNum>
-  <w:abstractNum w:abstractNumId="2" w15:restartNumberingAfterBreak="0">
+  <w:abstractNum w:abstractNumId="3" w15:restartNumberingAfterBreak="0">
     <w:nsid w:val="2AE42C38"/>
     <w:multiLevelType w:val="multilevel"/>
     <w:tmpl w:val="1E48F2E8"/>
@@ -1060,7 +4414,209 @@
       </w:rPr>
     </w:lvl>
   </w:abstractNum>
-  <w:abstractNum w:abstractNumId="3" w15:restartNumberingAfterBreak="0">
+  <w:abstractNum w:abstractNumId="4" w15:restartNumberingAfterBreak="0">
+    <w:nsid w:val="39A248D8"/>
+    <w:multiLevelType w:val="hybridMultilevel"/>
+    <w:tmpl w:val="DD661506"/>
+    <w:lvl w:ilvl="0" w:tplc="1809000F">
+      <w:start w:val="1"/>
+      <w:numFmt w:val="decimal"/>
+      <w:lvlText w:val="%1."/>
+      <w:lvlJc w:val="left"/>
+      <w:pPr>
+        <w:ind w:left="720" w:hanging="360"/>
+      </w:pPr>
+      <w:rPr>
+        <w:rFonts w:hint="default"/>
+      </w:rPr>
+    </w:lvl>
+    <w:lvl w:ilvl="1" w:tplc="18090019" w:tentative="1">
+      <w:start w:val="1"/>
+      <w:numFmt w:val="lowerLetter"/>
+      <w:lvlText w:val="%2."/>
+      <w:lvlJc w:val="left"/>
+      <w:pPr>
+        <w:ind w:left="1440" w:hanging="360"/>
+      </w:pPr>
+    </w:lvl>
+    <w:lvl w:ilvl="2" w:tplc="1809001B" w:tentative="1">
+      <w:start w:val="1"/>
+      <w:numFmt w:val="lowerRoman"/>
+      <w:lvlText w:val="%3."/>
+      <w:lvlJc w:val="right"/>
+      <w:pPr>
+        <w:ind w:left="2160" w:hanging="180"/>
+      </w:pPr>
+    </w:lvl>
+    <w:lvl w:ilvl="3" w:tplc="1809000F" w:tentative="1">
+      <w:start w:val="1"/>
+      <w:numFmt w:val="decimal"/>
+      <w:lvlText w:val="%4."/>
+      <w:lvlJc w:val="left"/>
+      <w:pPr>
+        <w:ind w:left="2880" w:hanging="360"/>
+      </w:pPr>
+    </w:lvl>
+    <w:lvl w:ilvl="4" w:tplc="18090019" w:tentative="1">
+      <w:start w:val="1"/>
+      <w:numFmt w:val="lowerLetter"/>
+      <w:lvlText w:val="%5."/>
+      <w:lvlJc w:val="left"/>
+      <w:pPr>
+        <w:ind w:left="3600" w:hanging="360"/>
+      </w:pPr>
+    </w:lvl>
+    <w:lvl w:ilvl="5" w:tplc="1809001B" w:tentative="1">
+      <w:start w:val="1"/>
+      <w:numFmt w:val="lowerRoman"/>
+      <w:lvlText w:val="%6."/>
+      <w:lvlJc w:val="right"/>
+      <w:pPr>
+        <w:ind w:left="4320" w:hanging="180"/>
+      </w:pPr>
+    </w:lvl>
+    <w:lvl w:ilvl="6" w:tplc="1809000F" w:tentative="1">
+      <w:start w:val="1"/>
+      <w:numFmt w:val="decimal"/>
+      <w:lvlText w:val="%7."/>
+      <w:lvlJc w:val="left"/>
+      <w:pPr>
+        <w:ind w:left="5040" w:hanging="360"/>
+      </w:pPr>
+    </w:lvl>
+    <w:lvl w:ilvl="7" w:tplc="18090019" w:tentative="1">
+      <w:start w:val="1"/>
+      <w:numFmt w:val="lowerLetter"/>
+      <w:lvlText w:val="%8."/>
+      <w:lvlJc w:val="left"/>
+      <w:pPr>
+        <w:ind w:left="5760" w:hanging="360"/>
+      </w:pPr>
+    </w:lvl>
+    <w:lvl w:ilvl="8" w:tplc="1809001B" w:tentative="1">
+      <w:start w:val="1"/>
+      <w:numFmt w:val="lowerRoman"/>
+      <w:lvlText w:val="%9."/>
+      <w:lvlJc w:val="right"/>
+      <w:pPr>
+        <w:ind w:left="6480" w:hanging="180"/>
+      </w:pPr>
+    </w:lvl>
+  </w:abstractNum>
+  <w:abstractNum w:abstractNumId="5" w15:restartNumberingAfterBreak="0">
+    <w:nsid w:val="39B92A76"/>
+    <w:multiLevelType w:val="hybridMultilevel"/>
+    <w:tmpl w:val="610216A4"/>
+    <w:lvl w:ilvl="0" w:tplc="18090001">
+      <w:start w:val="1"/>
+      <w:numFmt w:val="bullet"/>
+      <w:lvlText w:val=""/>
+      <w:lvlJc w:val="left"/>
+      <w:pPr>
+        <w:ind w:left="720" w:hanging="360"/>
+      </w:pPr>
+      <w:rPr>
+        <w:rFonts w:ascii="Symbol" w:hAnsi="Symbol" w:hint="default"/>
+      </w:rPr>
+    </w:lvl>
+    <w:lvl w:ilvl="1" w:tplc="18090003" w:tentative="1">
+      <w:start w:val="1"/>
+      <w:numFmt w:val="bullet"/>
+      <w:lvlText w:val="o"/>
+      <w:lvlJc w:val="left"/>
+      <w:pPr>
+        <w:ind w:left="1440" w:hanging="360"/>
+      </w:pPr>
+      <w:rPr>
+        <w:rFonts w:ascii="Courier New" w:hAnsi="Courier New" w:cs="Courier New" w:hint="default"/>
+      </w:rPr>
+    </w:lvl>
+    <w:lvl w:ilvl="2" w:tplc="18090005" w:tentative="1">
+      <w:start w:val="1"/>
+      <w:numFmt w:val="bullet"/>
+      <w:lvlText w:val=""/>
+      <w:lvlJc w:val="left"/>
+      <w:pPr>
+        <w:ind w:left="2160" w:hanging="360"/>
+      </w:pPr>
+      <w:rPr>
+        <w:rFonts w:ascii="Wingdings" w:hAnsi="Wingdings" w:hint="default"/>
+      </w:rPr>
+    </w:lvl>
+    <w:lvl w:ilvl="3" w:tplc="18090001" w:tentative="1">
+      <w:start w:val="1"/>
+      <w:numFmt w:val="bullet"/>
+      <w:lvlText w:val=""/>
+      <w:lvlJc w:val="left"/>
+      <w:pPr>
+        <w:ind w:left="2880" w:hanging="360"/>
+      </w:pPr>
+      <w:rPr>
+        <w:rFonts w:ascii="Symbol" w:hAnsi="Symbol" w:hint="default"/>
+      </w:rPr>
+    </w:lvl>
+    <w:lvl w:ilvl="4" w:tplc="18090003" w:tentative="1">
+      <w:start w:val="1"/>
+      <w:numFmt w:val="bullet"/>
+      <w:lvlText w:val="o"/>
+      <w:lvlJc w:val="left"/>
+      <w:pPr>
+        <w:ind w:left="3600" w:hanging="360"/>
+      </w:pPr>
+      <w:rPr>
+        <w:rFonts w:ascii="Courier New" w:hAnsi="Courier New" w:cs="Courier New" w:hint="default"/>
+      </w:rPr>
+    </w:lvl>
+    <w:lvl w:ilvl="5" w:tplc="18090005" w:tentative="1">
+      <w:start w:val="1"/>
+      <w:numFmt w:val="bullet"/>
+      <w:lvlText w:val=""/>
+      <w:lvlJc w:val="left"/>
+      <w:pPr>
+        <w:ind w:left="4320" w:hanging="360"/>
+      </w:pPr>
+      <w:rPr>
+        <w:rFonts w:ascii="Wingdings" w:hAnsi="Wingdings" w:hint="default"/>
+      </w:rPr>
+    </w:lvl>
+    <w:lvl w:ilvl="6" w:tplc="18090001" w:tentative="1">
+      <w:start w:val="1"/>
+      <w:numFmt w:val="bullet"/>
+      <w:lvlText w:val=""/>
+      <w:lvlJc w:val="left"/>
+      <w:pPr>
+        <w:ind w:left="5040" w:hanging="360"/>
+      </w:pPr>
+      <w:rPr>
+        <w:rFonts w:ascii="Symbol" w:hAnsi="Symbol" w:hint="default"/>
+      </w:rPr>
+    </w:lvl>
+    <w:lvl w:ilvl="7" w:tplc="18090003" w:tentative="1">
+      <w:start w:val="1"/>
+      <w:numFmt w:val="bullet"/>
+      <w:lvlText w:val="o"/>
+      <w:lvlJc w:val="left"/>
+      <w:pPr>
+        <w:ind w:left="5760" w:hanging="360"/>
+      </w:pPr>
+      <w:rPr>
+        <w:rFonts w:ascii="Courier New" w:hAnsi="Courier New" w:cs="Courier New" w:hint="default"/>
+      </w:rPr>
+    </w:lvl>
+    <w:lvl w:ilvl="8" w:tplc="18090005" w:tentative="1">
+      <w:start w:val="1"/>
+      <w:numFmt w:val="bullet"/>
+      <w:lvlText w:val=""/>
+      <w:lvlJc w:val="left"/>
+      <w:pPr>
+        <w:ind w:left="6480" w:hanging="360"/>
+      </w:pPr>
+      <w:rPr>
+        <w:rFonts w:ascii="Wingdings" w:hAnsi="Wingdings" w:hint="default"/>
+      </w:rPr>
+    </w:lvl>
+  </w:abstractNum>
+  <w:abstractNum w:abstractNumId="6" w15:restartNumberingAfterBreak="0">
     <w:nsid w:val="41A477C0"/>
     <w:multiLevelType w:val="multilevel"/>
     <w:tmpl w:val="A226F970"/>
@@ -1173,7 +4729,7 @@
       </w:pPr>
     </w:lvl>
   </w:abstractNum>
-  <w:abstractNum w:abstractNumId="4" w15:restartNumberingAfterBreak="0">
+  <w:abstractNum w:abstractNumId="7" w15:restartNumberingAfterBreak="0">
     <w:nsid w:val="53175136"/>
     <w:multiLevelType w:val="multilevel"/>
     <w:tmpl w:val="9E7EDC70"/>
@@ -1322,7 +4878,7 @@
       </w:rPr>
     </w:lvl>
   </w:abstractNum>
-  <w:abstractNum w:abstractNumId="5" w15:restartNumberingAfterBreak="0">
+  <w:abstractNum w:abstractNumId="8" w15:restartNumberingAfterBreak="0">
     <w:nsid w:val="5B4232EC"/>
     <w:multiLevelType w:val="multilevel"/>
     <w:tmpl w:val="A6349EA4"/>
@@ -1435,7 +4991,7 @@
       </w:pPr>
     </w:lvl>
   </w:abstractNum>
-  <w:abstractNum w:abstractNumId="6" w15:restartNumberingAfterBreak="0">
+  <w:abstractNum w:abstractNumId="9" w15:restartNumberingAfterBreak="0">
     <w:nsid w:val="656C3C3C"/>
     <w:multiLevelType w:val="multilevel"/>
     <w:tmpl w:val="033EB9B2"/>
@@ -1584,7 +5140,7 @@
       </w:rPr>
     </w:lvl>
   </w:abstractNum>
-  <w:abstractNum w:abstractNumId="7" w15:restartNumberingAfterBreak="0">
+  <w:abstractNum w:abstractNumId="10" w15:restartNumberingAfterBreak="0">
     <w:nsid w:val="7AA679AC"/>
     <w:multiLevelType w:val="multilevel"/>
     <w:tmpl w:val="33D861B8"/>
@@ -1733,7 +5289,7 @@
       </w:rPr>
     </w:lvl>
   </w:abstractNum>
-  <w:abstractNum w:abstractNumId="8" w15:restartNumberingAfterBreak="0">
+  <w:abstractNum w:abstractNumId="11" w15:restartNumberingAfterBreak="0">
     <w:nsid w:val="7D5F7C98"/>
     <w:multiLevelType w:val="multilevel"/>
     <w:tmpl w:val="685C1D94"/>
@@ -1882,32 +5438,133 @@
       </w:rPr>
     </w:lvl>
   </w:abstractNum>
+  <w:abstractNum w:abstractNumId="12" w15:restartNumberingAfterBreak="0">
+    <w:nsid w:val="7EC76F80"/>
+    <w:multiLevelType w:val="hybridMultilevel"/>
+    <w:tmpl w:val="3146ACB6"/>
+    <w:lvl w:ilvl="0" w:tplc="DE060BE8">
+      <w:start w:val="1"/>
+      <w:numFmt w:val="decimal"/>
+      <w:lvlText w:val="%1."/>
+      <w:lvlJc w:val="left"/>
+      <w:pPr>
+        <w:ind w:left="1080" w:hanging="360"/>
+      </w:pPr>
+      <w:rPr>
+        <w:rFonts w:hint="default"/>
+      </w:rPr>
+    </w:lvl>
+    <w:lvl w:ilvl="1" w:tplc="18090019" w:tentative="1">
+      <w:start w:val="1"/>
+      <w:numFmt w:val="lowerLetter"/>
+      <w:lvlText w:val="%2."/>
+      <w:lvlJc w:val="left"/>
+      <w:pPr>
+        <w:ind w:left="1800" w:hanging="360"/>
+      </w:pPr>
+    </w:lvl>
+    <w:lvl w:ilvl="2" w:tplc="1809001B" w:tentative="1">
+      <w:start w:val="1"/>
+      <w:numFmt w:val="lowerRoman"/>
+      <w:lvlText w:val="%3."/>
+      <w:lvlJc w:val="right"/>
+      <w:pPr>
+        <w:ind w:left="2520" w:hanging="180"/>
+      </w:pPr>
+    </w:lvl>
+    <w:lvl w:ilvl="3" w:tplc="1809000F" w:tentative="1">
+      <w:start w:val="1"/>
+      <w:numFmt w:val="decimal"/>
+      <w:lvlText w:val="%4."/>
+      <w:lvlJc w:val="left"/>
+      <w:pPr>
+        <w:ind w:left="3240" w:hanging="360"/>
+      </w:pPr>
+    </w:lvl>
+    <w:lvl w:ilvl="4" w:tplc="18090019" w:tentative="1">
+      <w:start w:val="1"/>
+      <w:numFmt w:val="lowerLetter"/>
+      <w:lvlText w:val="%5."/>
+      <w:lvlJc w:val="left"/>
+      <w:pPr>
+        <w:ind w:left="3960" w:hanging="360"/>
+      </w:pPr>
+    </w:lvl>
+    <w:lvl w:ilvl="5" w:tplc="1809001B" w:tentative="1">
+      <w:start w:val="1"/>
+      <w:numFmt w:val="lowerRoman"/>
+      <w:lvlText w:val="%6."/>
+      <w:lvlJc w:val="right"/>
+      <w:pPr>
+        <w:ind w:left="4680" w:hanging="180"/>
+      </w:pPr>
+    </w:lvl>
+    <w:lvl w:ilvl="6" w:tplc="1809000F" w:tentative="1">
+      <w:start w:val="1"/>
+      <w:numFmt w:val="decimal"/>
+      <w:lvlText w:val="%7."/>
+      <w:lvlJc w:val="left"/>
+      <w:pPr>
+        <w:ind w:left="5400" w:hanging="360"/>
+      </w:pPr>
+    </w:lvl>
+    <w:lvl w:ilvl="7" w:tplc="18090019" w:tentative="1">
+      <w:start w:val="1"/>
+      <w:numFmt w:val="lowerLetter"/>
+      <w:lvlText w:val="%8."/>
+      <w:lvlJc w:val="left"/>
+      <w:pPr>
+        <w:ind w:left="6120" w:hanging="360"/>
+      </w:pPr>
+    </w:lvl>
+    <w:lvl w:ilvl="8" w:tplc="1809001B" w:tentative="1">
+      <w:start w:val="1"/>
+      <w:numFmt w:val="lowerRoman"/>
+      <w:lvlText w:val="%9."/>
+      <w:lvlJc w:val="right"/>
+      <w:pPr>
+        <w:ind w:left="6840" w:hanging="180"/>
+      </w:pPr>
+    </w:lvl>
+  </w:abstractNum>
   <w:num w:numId="1" w16cid:durableId="1213882121">
-    <w:abstractNumId w:val="1"/>
+    <w:abstractNumId w:val="2"/>
   </w:num>
   <w:num w:numId="2" w16cid:durableId="1598636461">
     <w:abstractNumId w:val="0"/>
   </w:num>
   <w:num w:numId="3" w16cid:durableId="872964064">
-    <w:abstractNumId w:val="5"/>
+    <w:abstractNumId w:val="8"/>
   </w:num>
   <w:num w:numId="4" w16cid:durableId="1608266724">
+    <w:abstractNumId w:val="6"/>
+  </w:num>
+  <w:num w:numId="5" w16cid:durableId="783423473">
+    <w:abstractNumId w:val="10"/>
+  </w:num>
+  <w:num w:numId="6" w16cid:durableId="868566141">
+    <w:abstractNumId w:val="9"/>
+  </w:num>
+  <w:num w:numId="7" w16cid:durableId="1005132898">
     <w:abstractNumId w:val="3"/>
   </w:num>
-  <w:num w:numId="5" w16cid:durableId="783423473">
+  <w:num w:numId="8" w16cid:durableId="347365037">
+    <w:abstractNumId w:val="11"/>
+  </w:num>
+  <w:num w:numId="9" w16cid:durableId="940262862">
     <w:abstractNumId w:val="7"/>
   </w:num>
-  <w:num w:numId="6" w16cid:durableId="868566141">
-    <w:abstractNumId w:val="6"/>
+  <w:num w:numId="10" w16cid:durableId="347876689">
+    <w:abstractNumId w:val="1"/>
   </w:num>
-  <w:num w:numId="7" w16cid:durableId="1005132898">
-    <w:abstractNumId w:val="2"/>
+  <w:num w:numId="11" w16cid:durableId="280041942">
+    <w:abstractNumId w:val="4"/>
   </w:num>
-  <w:num w:numId="8" w16cid:durableId="347365037">
-    <w:abstractNumId w:val="8"/>
+  <w:num w:numId="12" w16cid:durableId="464278432">
+    <w:abstractNumId w:val="12"/>
   </w:num>
-  <w:num w:numId="9" w16cid:durableId="940262862">
-    <w:abstractNumId w:val="4"/>
+  <w:num w:numId="13" w16cid:durableId="2034375532">
+    <w:abstractNumId w:val="5"/>
   </w:num>
 </w:numbering>
 </file>
@@ -2312,6 +5969,7 @@
   <w:style w:type="paragraph" w:default="1" w:styleId="Normal">
     <w:name w:val="Normal"/>
     <w:qFormat/>
+    <w:rsid w:val="006C2DD5"/>
   </w:style>
   <w:style w:type="paragraph" w:styleId="Heading1">
     <w:name w:val="heading 1"/>
@@ -2515,6 +6173,7 @@
   <w:style w:type="character" w:default="1" w:styleId="DefaultParagraphFont">
     <w:name w:val="Default Paragraph Font"/>
     <w:uiPriority w:val="1"/>
+    <w:semiHidden/>
     <w:unhideWhenUsed/>
   </w:style>
   <w:style w:type="table" w:default="1" w:styleId="TableNormal">
@@ -2827,6 +6486,50 @@
       <w:color w:val="0F4761" w:themeColor="accent1" w:themeShade="BF"/>
       <w:spacing w:val="5"/>
     </w:rPr>
+  </w:style>
+  <w:style w:type="paragraph" w:styleId="Header">
+    <w:name w:val="header"/>
+    <w:basedOn w:val="Normal"/>
+    <w:link w:val="HeaderChar"/>
+    <w:uiPriority w:val="99"/>
+    <w:unhideWhenUsed/>
+    <w:rsid w:val="00305C6F"/>
+    <w:pPr>
+      <w:tabs>
+        <w:tab w:val="center" w:pos="4513"/>
+        <w:tab w:val="right" w:pos="9026"/>
+      </w:tabs>
+      <w:spacing w:after="0" w:line="240" w:lineRule="auto"/>
+    </w:pPr>
+  </w:style>
+  <w:style w:type="character" w:customStyle="1" w:styleId="HeaderChar">
+    <w:name w:val="Header Char"/>
+    <w:basedOn w:val="DefaultParagraphFont"/>
+    <w:link w:val="Header"/>
+    <w:uiPriority w:val="99"/>
+    <w:rsid w:val="00305C6F"/>
+  </w:style>
+  <w:style w:type="paragraph" w:styleId="Footer">
+    <w:name w:val="footer"/>
+    <w:basedOn w:val="Normal"/>
+    <w:link w:val="FooterChar"/>
+    <w:uiPriority w:val="99"/>
+    <w:unhideWhenUsed/>
+    <w:rsid w:val="00305C6F"/>
+    <w:pPr>
+      <w:tabs>
+        <w:tab w:val="center" w:pos="4513"/>
+        <w:tab w:val="right" w:pos="9026"/>
+      </w:tabs>
+      <w:spacing w:after="0" w:line="240" w:lineRule="auto"/>
+    </w:pPr>
+  </w:style>
+  <w:style w:type="character" w:customStyle="1" w:styleId="FooterChar">
+    <w:name w:val="Footer Char"/>
+    <w:basedOn w:val="DefaultParagraphFont"/>
+    <w:link w:val="Footer"/>
+    <w:uiPriority w:val="99"/>
+    <w:rsid w:val="00305C6F"/>
   </w:style>
 </w:styles>
 </file>

</xml_diff>

<commit_message>
Added Gantt chart, EU AI Act/GDPR/DSA compliance and Harvard References
</commit_message>
<xml_diff>
--- a/New Microsoft Word Document.docx
+++ b/New Microsoft Word Document.docx
@@ -178,20 +178,22 @@
       </w:r>
     </w:p>
     <w:p>
-      <w:r>
-        <w:t>Data analytics and predictive modelling can solve this problem</w:t>
-      </w:r>
-      <w:r>
-        <w:t xml:space="preserve"> </w:t>
-      </w:r>
-      <w:r>
-        <w:t>(Gerunov, 2022)</w:t>
-      </w:r>
-      <w:r>
-        <w:t xml:space="preserve">. By analysing historical records, a regression model can learn patterns between initial ticket features and final resolution time. When a new ticket arrives, the model will predict how long it will take, helping managers schedule staff and prevent SLA breaches. </w:t>
-      </w:r>
-    </w:p>
-    <w:p/>
+      <w:pPr>
+        <w:rPr>
+          <w:lang w:val="ru-RU"/>
+        </w:rPr>
+      </w:pPr>
+      <w:r>
+        <w:t>Data analytics and predictive modelling can solve this problem (Saputra et al., 2024). By analysing historical records, a regression model can learn patterns between initial ticket features and final resolution time. When a new ticket arrives, the model will predict how long it will take, helping managers schedule staff and prevent SLA breaches.</w:t>
+      </w:r>
+    </w:p>
+    <w:p>
+      <w:pPr>
+        <w:rPr>
+          <w:lang w:val="ru-RU"/>
+        </w:rPr>
+      </w:pPr>
+    </w:p>
     <w:p>
       <w:pPr>
         <w:rPr>
@@ -224,9 +226,21 @@
       </w:r>
     </w:p>
     <w:p>
+      <w:pPr>
+        <w:rPr>
+          <w:lang w:val="ru-RU"/>
+        </w:rPr>
+      </w:pPr>
       <w:r>
         <w:t xml:space="preserve">The overall aim of this project is to develop and evaluate a supervised machine learning regression model that predicts the total resolution time of IT support tickets using historical data. </w:t>
       </w:r>
+    </w:p>
+    <w:p>
+      <w:pPr>
+        <w:rPr>
+          <w:lang w:val="ru-RU"/>
+        </w:rPr>
+      </w:pPr>
     </w:p>
     <w:p>
       <w:r>
@@ -336,11 +350,17 @@
       </w:r>
     </w:p>
     <w:p>
+      <w:pPr>
+        <w:ind w:left="720"/>
+      </w:pPr>
+    </w:p>
+    <w:p>
       <w:r>
         <w:rPr>
           <w:b/>
           <w:bCs/>
         </w:rPr>
+        <w:lastRenderedPageBreak/>
         <w:t>Business Objective and Hypothesis:</w:t>
       </w:r>
       <w:r>
@@ -349,8 +369,7 @@
     </w:p>
     <w:p>
       <w:r>
-        <w:lastRenderedPageBreak/>
-        <w:t xml:space="preserve">The business objective is to help IT managers predict workload and reduce SLA breaches. Using a deductive research approach (Robson, 2003), this project will test one hypothesis: </w:t>
+        <w:t xml:space="preserve">The business objective is to help IT managers predict workload and reduce SLA breaches. Based on similar studies in IT support (Saputra et al., 2024), this project will test one main hypothesis: </w:t>
       </w:r>
     </w:p>
     <w:p>
@@ -424,7 +443,39 @@
         </w:numPr>
       </w:pPr>
       <w:r>
-        <w:t>Using initial ticket features known at creation time: issue_type, issue_priority, issue_proj, issue_contr_count, and started date.</w:t>
+        <w:t xml:space="preserve">Using initial ticket features known at creation time: </w:t>
+      </w:r>
+      <w:proofErr w:type="spellStart"/>
+      <w:r>
+        <w:t>issue_type</w:t>
+      </w:r>
+      <w:proofErr w:type="spellEnd"/>
+      <w:r>
+        <w:t xml:space="preserve">, </w:t>
+      </w:r>
+      <w:proofErr w:type="spellStart"/>
+      <w:r>
+        <w:t>issue_priority</w:t>
+      </w:r>
+      <w:proofErr w:type="spellEnd"/>
+      <w:r>
+        <w:t xml:space="preserve">, </w:t>
+      </w:r>
+      <w:proofErr w:type="spellStart"/>
+      <w:r>
+        <w:t>issue_proj</w:t>
+      </w:r>
+      <w:proofErr w:type="spellEnd"/>
+      <w:r>
+        <w:t xml:space="preserve">, </w:t>
+      </w:r>
+      <w:proofErr w:type="spellStart"/>
+      <w:r>
+        <w:t>issue_contr_count</w:t>
+      </w:r>
+      <w:proofErr w:type="spellEnd"/>
+      <w:r>
+        <w:t>, and started date.</w:t>
       </w:r>
     </w:p>
     <w:p>
@@ -435,7 +486,15 @@
         </w:numPr>
       </w:pPr>
       <w:r>
-        <w:t xml:space="preserve">Predicting the numeric target variable wf_total_time (total workflow resolution time). </w:t>
+        <w:t xml:space="preserve">Predicting the numeric target variable </w:t>
+      </w:r>
+      <w:proofErr w:type="spellStart"/>
+      <w:r>
+        <w:t>wf_total_time</w:t>
+      </w:r>
+      <w:proofErr w:type="spellEnd"/>
+      <w:r>
+        <w:t xml:space="preserve"> (total workflow resolution time). </w:t>
       </w:r>
     </w:p>
     <w:p>
@@ -477,7 +536,23 @@
         </w:numPr>
       </w:pPr>
       <w:r>
-        <w:t>Intermediate workflow timer columns (such as wf_in_progress or wf_waiting). Using them as inputs would cause data leakage because this data is unknown when a ticket first opens.</w:t>
+        <w:t xml:space="preserve">Intermediate workflow timer columns (such as </w:t>
+      </w:r>
+      <w:proofErr w:type="spellStart"/>
+      <w:r>
+        <w:t>wf_in_progress</w:t>
+      </w:r>
+      <w:proofErr w:type="spellEnd"/>
+      <w:r>
+        <w:t xml:space="preserve"> or </w:t>
+      </w:r>
+      <w:proofErr w:type="spellStart"/>
+      <w:r>
+        <w:t>wf_waiting</w:t>
+      </w:r>
+      <w:proofErr w:type="spellEnd"/>
+      <w:r>
+        <w:t>). Using them as inputs would cause data leakage because this data is unknown when a ticket first opens.</w:t>
       </w:r>
     </w:p>
     <w:p>
@@ -538,7 +613,10 @@
         <w:t>Discovery (CA1):</w:t>
       </w:r>
       <w:r>
-        <w:t xml:space="preserve"> I learn about the IT support problem, check my data file, and write my plan and hypothesis (Sumathi et al., 2022). </w:t>
+        <w:t xml:space="preserve"> </w:t>
+      </w:r>
+      <w:r>
+        <w:t>Understanding the IT support problem, checking data resources, and setting the hypothesis (Sumathi et al., 2022).</w:t>
       </w:r>
     </w:p>
     <w:p>
@@ -556,7 +634,18 @@
         <w:t>Data Preparation (Semester 1 - CA2):</w:t>
       </w:r>
       <w:r>
-        <w:t xml:space="preserve"> Raw data is messy. I will use Python in Jupyter Notebook to filter dates (2016–2023), fix missing values in issue_assignee, delete unfinished tickets, change text words into numbers, and apply feature scaling. </w:t>
+        <w:t xml:space="preserve"> </w:t>
+      </w:r>
+      <w:r>
+        <w:t xml:space="preserve">Using Python in Jupyter Notebook, I will clean the raw data. I will filter dates to keep 2016–2023 records, handle missing values in </w:t>
+      </w:r>
+      <w:proofErr w:type="spellStart"/>
+      <w:r>
+        <w:t>issue_assignee</w:t>
+      </w:r>
+      <w:proofErr w:type="spellEnd"/>
+      <w:r>
+        <w:t xml:space="preserve">, remove unfinished tickets, encode categorical variables into numbers, and apply feature scaling. </w:t>
       </w:r>
     </w:p>
     <w:p>
@@ -592,7 +681,7 @@
         <w:t>Model Building (Semester 2 - CA3):</w:t>
       </w:r>
       <w:r>
-        <w:t xml:space="preserve"> I will split my clean data into 80% for training and 20% for testing. I will start with a simple Linear Regression model, and then build a Random Forest Regressor, which finds harder patterns in ticket data (Gerunov, 2022; Saputra et al., 2024). </w:t>
+        <w:t xml:space="preserve"> I will split my clean data into 80% for training and 20% for testing. I will start with a simple Linear Regression model, and then build a Random Forest Regressor, which finds harder patterns in ticket data (Saputra et al., 2024). </w:t>
       </w:r>
     </w:p>
     <w:p>
@@ -687,39 +776,7 @@
         </w:rPr>
       </w:pPr>
       <w:r>
-        <w:t>I will use open-source software (Python, Jupyter Notebook, Pandas, Scikit-Learn, Matplotlib) instead of proprietary tools (MATLAB or SAS). Open-source tools are free, flexible, and have strong community support. I will also use GitHub for version</w:t>
-      </w:r>
-      <w:r>
-        <w:rPr>
-          <w:b/>
-          <w:bCs/>
-        </w:rPr>
-        <w:t xml:space="preserve"> </w:t>
-      </w:r>
-      <w:r>
-        <w:t>control.</w:t>
-      </w:r>
-      <w:r>
-        <w:rPr>
-          <w:b/>
-          <w:bCs/>
-        </w:rPr>
-        <w:t xml:space="preserve"> </w:t>
-      </w:r>
-    </w:p>
-    <w:p>
-      <w:pPr>
-        <w:rPr>
-          <w:b/>
-          <w:bCs/>
-        </w:rPr>
-      </w:pPr>
-      <w:r>
-        <w:rPr>
-          <w:b/>
-          <w:bCs/>
-        </w:rPr>
-        <w:t>High-Level Architectural Diagram:</w:t>
+        <w:t>I will use open-source software (Python, Jupyter Notebook, Pandas, Scikit-Learn, Matplotlib) instead of proprietary tools (MATLAB or SAS). Open-source tools are free, flexible, and have strong community support (Scikit-learn, 2024). I will also use GitHub for version control.</w:t>
       </w:r>
     </w:p>
     <w:p>
@@ -738,13 +795,13 @@
         <mc:AlternateContent>
           <mc:Choice Requires="wpg">
             <w:drawing>
-              <wp:anchor distT="0" distB="0" distL="114300" distR="114300" simplePos="0" relativeHeight="251687936" behindDoc="0" locked="0" layoutInCell="1" allowOverlap="1" wp14:anchorId="0DE2CCCE" wp14:editId="0EF8DB5A">
+              <wp:anchor distT="0" distB="0" distL="114300" distR="114300" simplePos="0" relativeHeight="251687936" behindDoc="0" locked="0" layoutInCell="1" allowOverlap="1" wp14:anchorId="0DE2CCCE" wp14:editId="5DFB6BD8">
                 <wp:simplePos x="0" y="0"/>
-                <wp:positionH relativeFrom="column">
-                  <wp:posOffset>-660694</wp:posOffset>
+                <wp:positionH relativeFrom="margin">
+                  <wp:align>center</wp:align>
                 </wp:positionH>
                 <wp:positionV relativeFrom="paragraph">
-                  <wp:posOffset>120063</wp:posOffset>
+                  <wp:posOffset>145969</wp:posOffset>
                 </wp:positionV>
                 <wp:extent cx="7098181" cy="3536032"/>
                 <wp:effectExtent l="0" t="0" r="7620" b="26670"/>
@@ -1872,8 +1929,8 @@
                           <wps:cNvSpPr txBox="1"/>
                           <wps:spPr>
                             <a:xfrm>
-                              <a:off x="200729" y="36927"/>
-                              <a:ext cx="1222292" cy="464820"/>
+                              <a:off x="142605" y="30017"/>
+                              <a:ext cx="1269915" cy="464820"/>
                             </a:xfrm>
                             <a:prstGeom prst="rect">
                               <a:avLst/>
@@ -1906,29 +1963,7 @@
                                     <w:szCs w:val="22"/>
                                     <w:lang w:val="en-GB"/>
                                   </w:rPr>
-                                  <w:t>4.Evaluation &amp; Communicatio</w:t>
-                                </w:r>
-                                <w:r>
-                                  <w:rPr>
-                                    <w:b/>
-                                    <w:bCs/>
-                                    <w:color w:val="156082" w:themeColor="accent1"/>
-                                    <w:sz w:val="22"/>
-                                    <w:szCs w:val="22"/>
-                                    <w:lang w:val="en-GB"/>
-                                  </w:rPr>
-                                  <w:t>n</w:t>
-                                </w:r>
-                                <w:r>
-                                  <w:rPr>
-                                    <w:b/>
-                                    <w:bCs/>
-                                    <w:color w:val="156082" w:themeColor="accent1"/>
-                                    <w:sz w:val="22"/>
-                                    <w:szCs w:val="22"/>
-                                    <w:lang w:val="en-GB"/>
-                                  </w:rPr>
-                                  <w:t>n</w:t>
+                                  <w:t>4.Evaluation &amp; Communication</w:t>
                                 </w:r>
                               </w:p>
                             </w:txbxContent>
@@ -2005,8 +2040,35 @@
                                     <w:szCs w:val="20"/>
                                     <w:lang w:val="en-GB"/>
                                   </w:rPr>
-                                  <w:t>: MAE, RMSE, R2</w:t>
+                                  <w:t xml:space="preserve">: MAE, RMSE, </w:t>
                                 </w:r>
+                                <m:oMath>
+                                  <m:sSup>
+                                    <m:sSupPr>
+                                      <m:ctrlPr>
+                                        <w:rPr>
+                                          <w:rFonts w:ascii="Cambria Math" w:hAnsi="Cambria Math"/>
+                                        </w:rPr>
+                                      </m:ctrlPr>
+                                    </m:sSupPr>
+                                    <m:e>
+                                      <m:r>
+                                        <w:rPr>
+                                          <w:rFonts w:ascii="Cambria Math" w:hAnsi="Cambria Math"/>
+                                        </w:rPr>
+                                        <m:t>R</m:t>
+                                      </m:r>
+                                    </m:e>
+                                    <m:sup>
+                                      <m:r>
+                                        <w:rPr>
+                                          <w:rFonts w:ascii="Cambria Math" w:hAnsi="Cambria Math"/>
+                                        </w:rPr>
+                                        <m:t>2</m:t>
+                                      </m:r>
+                                    </m:sup>
+                                  </m:sSup>
+                                </m:oMath>
                               </w:p>
                               <w:p>
                                 <w:pPr>
@@ -2523,7 +2585,7 @@
           </mc:Choice>
           <mc:Fallback>
             <w:pict>
-              <v:group w14:anchorId="0DE2CCCE" id="Group 17" o:spid="_x0000_s1026" style="position:absolute;margin-left:-52pt;margin-top:9.45pt;width:558.9pt;height:278.45pt;z-index:251687936" coordsize="70981,35360" o:gfxdata="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">
+              <v:group w14:anchorId="0DE2CCCE" id="Group 17" o:spid="_x0000_s1026" style="position:absolute;margin-left:0;margin-top:11.5pt;width:558.9pt;height:278.45pt;z-index:251687936;mso-position-horizontal:center;mso-position-horizontal-relative:margin" coordsize="70981,35360" o:gfxdata="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">
                 <v:group id="Group 8" o:spid="_x0000_s1027" style="position:absolute;top:6659;width:15803;height:20825" coordsize="13953,19024" o:gfxdata="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">
                   <v:roundrect id="Rectangle: Rounded Corners 1" o:spid="_x0000_s1028" style="position:absolute;width:13953;height:19024;visibility:visible;mso-wrap-style:square;v-text-anchor:middle" arcsize="10923f" o:gfxdata="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" fillcolor="#c1e4f5 [660]" strokecolor="#156082 [3204]" strokeweight="1.5pt">
                     <v:stroke joinstyle="miter"/>
@@ -3291,7 +3353,7 @@
                   <v:roundrect id="Rectangle: Rounded Corners 1" o:spid="_x0000_s1040" style="position:absolute;width:15422;height:20825;visibility:visible;mso-wrap-style:square;v-text-anchor:middle" arcsize="10923f" o:gfxdata="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" fillcolor="#c1e4f5 [660]" strokecolor="#156082 [3204]" strokeweight="1.5pt">
                     <v:stroke joinstyle="miter"/>
                   </v:roundrect>
-                  <v:shape id="Text Box 3" o:spid="_x0000_s1041" type="#_x0000_t202" style="position:absolute;left:2007;top:369;width:12223;height:4648;visibility:visible;mso-wrap-style:square;v-text-anchor:top" o:gfxdata="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" filled="f" stroked="f" strokeweight=".5pt">
+                  <v:shape id="Text Box 3" o:spid="_x0000_s1041" type="#_x0000_t202" style="position:absolute;left:1426;top:300;width:12699;height:4648;visibility:visible;mso-wrap-style:square;v-text-anchor:top" o:gfxdata="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" filled="f" stroked="f" strokeweight=".5pt">
                     <v:textbox>
                       <w:txbxContent>
                         <w:p>
@@ -3315,29 +3377,7 @@
                               <w:szCs w:val="22"/>
                               <w:lang w:val="en-GB"/>
                             </w:rPr>
-                            <w:t>4.Evaluation &amp; Communicatio</w:t>
-                          </w:r>
-                          <w:r>
-                            <w:rPr>
-                              <w:b/>
-                              <w:bCs/>
-                              <w:color w:val="156082" w:themeColor="accent1"/>
-                              <w:sz w:val="22"/>
-                              <w:szCs w:val="22"/>
-                              <w:lang w:val="en-GB"/>
-                            </w:rPr>
-                            <w:t>n</w:t>
-                          </w:r>
-                          <w:r>
-                            <w:rPr>
-                              <w:b/>
-                              <w:bCs/>
-                              <w:color w:val="156082" w:themeColor="accent1"/>
-                              <w:sz w:val="22"/>
-                              <w:szCs w:val="22"/>
-                              <w:lang w:val="en-GB"/>
-                            </w:rPr>
-                            <w:t>n</w:t>
+                            <w:t>4.Evaluation &amp; Communication</w:t>
                           </w:r>
                         </w:p>
                       </w:txbxContent>
@@ -3393,8 +3433,35 @@
                               <w:szCs w:val="20"/>
                               <w:lang w:val="en-GB"/>
                             </w:rPr>
-                            <w:t>: MAE, RMSE, R2</w:t>
+                            <w:t xml:space="preserve">: MAE, RMSE, </w:t>
                           </w:r>
+                          <m:oMath>
+                            <m:sSup>
+                              <m:sSupPr>
+                                <m:ctrlPr>
+                                  <w:rPr>
+                                    <w:rFonts w:ascii="Cambria Math" w:hAnsi="Cambria Math"/>
+                                  </w:rPr>
+                                </m:ctrlPr>
+                              </m:sSupPr>
+                              <m:e>
+                                <m:r>
+                                  <w:rPr>
+                                    <w:rFonts w:ascii="Cambria Math" w:hAnsi="Cambria Math"/>
+                                  </w:rPr>
+                                  <m:t>R</m:t>
+                                </m:r>
+                              </m:e>
+                              <m:sup>
+                                <m:r>
+                                  <w:rPr>
+                                    <w:rFonts w:ascii="Cambria Math" w:hAnsi="Cambria Math"/>
+                                  </w:rPr>
+                                  <m:t>2</m:t>
+                                </m:r>
+                              </m:sup>
+                            </m:sSup>
+                          </m:oMath>
                         </w:p>
                         <w:p>
                           <w:pPr>
@@ -3703,6 +3770,7 @@
                     </w:txbxContent>
                   </v:textbox>
                 </v:shape>
+                <w10:wrap anchorx="margin"/>
               </v:group>
             </w:pict>
           </mc:Fallback>
@@ -3717,6 +3785,14 @@
         </w:rPr>
       </w:pPr>
     </w:p>
+    <w:p>
+      <w:pPr>
+        <w:rPr>
+          <w:b/>
+          <w:bCs/>
+        </w:rPr>
+      </w:pPr>
+    </w:p>
     <w:p/>
     <w:p/>
     <w:p>
@@ -3726,13 +3802,780 @@
         </w:rPr>
       </w:pPr>
     </w:p>
+    <w:p>
+      <w:pPr>
+        <w:rPr>
+          <w:lang w:val="en-GB"/>
+        </w:rPr>
+      </w:pPr>
+    </w:p>
+    <w:p>
+      <w:pPr>
+        <w:rPr>
+          <w:lang w:val="en-GB"/>
+        </w:rPr>
+      </w:pPr>
+      <w:proofErr w:type="spellStart"/>
+      <w:r>
+        <w:rPr>
+          <w:lang w:val="en-GB"/>
+        </w:rPr>
+        <w:t>jhg</w:t>
+      </w:r>
+      <w:proofErr w:type="spellEnd"/>
+    </w:p>
+    <w:p>
+      <w:pPr>
+        <w:rPr>
+          <w:lang w:val="en-GB"/>
+        </w:rPr>
+      </w:pPr>
+    </w:p>
+    <w:p>
+      <w:r>
+        <w:lastRenderedPageBreak/>
+        <w:t>The diagram above shows the workflow: loading issues.csv (1), cleaning data and EDA in CA2 (2), training regression models in CA3 (3), and evaluating results (4).</w:t>
+      </w:r>
+    </w:p>
+    <w:p/>
+    <w:p>
+      <w:pPr>
+        <w:rPr>
+          <w:b/>
+          <w:bCs/>
+          <w:sz w:val="28"/>
+          <w:szCs w:val="28"/>
+        </w:rPr>
+      </w:pPr>
+      <w:r>
+        <w:rPr>
+          <w:b/>
+          <w:bCs/>
+          <w:sz w:val="28"/>
+          <w:szCs w:val="28"/>
+        </w:rPr>
+        <w:t>Data Sources</w:t>
+      </w:r>
+    </w:p>
+    <w:p>
+      <w:r>
+        <w:t xml:space="preserve">The project uses an open, anonymised IT issue-tracking dataset named issues.csv (Jira workflow logs). </w:t>
+      </w:r>
+    </w:p>
+    <w:p>
+      <w:pPr>
+        <w:numPr>
+          <w:ilvl w:val="0"/>
+          <w:numId w:val="14"/>
+        </w:numPr>
+      </w:pPr>
+      <w:r>
+        <w:rPr>
+          <w:b/>
+          <w:bCs/>
+        </w:rPr>
+        <w:t>Volume and Recency:</w:t>
+      </w:r>
+      <w:r>
+        <w:t xml:space="preserve"> The full file has 66,691 rows and 58 columns from 2007 to 2023. To follow the module rule requiring post-2015 data and at least 20,000 records, I will filter the data to keep records from 2016 to 2023 (26,379 records). </w:t>
+      </w:r>
+    </w:p>
+    <w:p>
+      <w:pPr>
+        <w:numPr>
+          <w:ilvl w:val="0"/>
+          <w:numId w:val="14"/>
+        </w:numPr>
+      </w:pPr>
+      <w:r>
+        <w:rPr>
+          <w:b/>
+          <w:bCs/>
+        </w:rPr>
+        <w:t>Selected Features:</w:t>
+      </w:r>
+      <w:r>
+        <w:t xml:space="preserve"> Most of the 58 columns are intermediate stage timers that will be dropped. I will keep 8 to 10 initial features: </w:t>
+      </w:r>
+      <w:proofErr w:type="spellStart"/>
+      <w:r>
+        <w:t>issue_proj</w:t>
+      </w:r>
+      <w:proofErr w:type="spellEnd"/>
+      <w:r>
+        <w:t xml:space="preserve">, </w:t>
+      </w:r>
+      <w:proofErr w:type="spellStart"/>
+      <w:r>
+        <w:t>issue_type</w:t>
+      </w:r>
+      <w:proofErr w:type="spellEnd"/>
+      <w:r>
+        <w:t xml:space="preserve">, </w:t>
+      </w:r>
+      <w:proofErr w:type="spellStart"/>
+      <w:r>
+        <w:t>issue_priority</w:t>
+      </w:r>
+      <w:proofErr w:type="spellEnd"/>
+      <w:r>
+        <w:t xml:space="preserve">, </w:t>
+      </w:r>
+      <w:proofErr w:type="spellStart"/>
+      <w:r>
+        <w:t>issue_reporter</w:t>
+      </w:r>
+      <w:proofErr w:type="spellEnd"/>
+      <w:r>
+        <w:t xml:space="preserve">, </w:t>
+      </w:r>
+      <w:proofErr w:type="spellStart"/>
+      <w:r>
+        <w:t>issue_assignee</w:t>
+      </w:r>
+      <w:proofErr w:type="spellEnd"/>
+      <w:r>
+        <w:t xml:space="preserve">, </w:t>
+      </w:r>
+      <w:proofErr w:type="spellStart"/>
+      <w:r>
+        <w:t>issue_contr_count</w:t>
+      </w:r>
+      <w:proofErr w:type="spellEnd"/>
+      <w:r>
+        <w:t xml:space="preserve">, </w:t>
+      </w:r>
+      <w:proofErr w:type="spellStart"/>
+      <w:r>
+        <w:t>issue_comments_count</w:t>
+      </w:r>
+      <w:proofErr w:type="spellEnd"/>
+      <w:r>
+        <w:t xml:space="preserve">, started, and the target variable </w:t>
+      </w:r>
+      <w:proofErr w:type="spellStart"/>
+      <w:r>
+        <w:t>wf_total_time</w:t>
+      </w:r>
+      <w:proofErr w:type="spellEnd"/>
+      <w:r>
+        <w:t xml:space="preserve">. </w:t>
+      </w:r>
+    </w:p>
+    <w:p>
+      <w:pPr>
+        <w:numPr>
+          <w:ilvl w:val="0"/>
+          <w:numId w:val="14"/>
+        </w:numPr>
+      </w:pPr>
+      <w:r>
+        <w:rPr>
+          <w:b/>
+          <w:bCs/>
+        </w:rPr>
+        <w:t>Permissions:</w:t>
+      </w:r>
+      <w:r>
+        <w:t xml:space="preserve"> This dataset is publicly available for academic research and is already anonymised.</w:t>
+      </w:r>
+    </w:p>
+    <w:p/>
+    <w:p>
+      <w:pPr>
+        <w:rPr>
+          <w:b/>
+          <w:bCs/>
+          <w:sz w:val="28"/>
+          <w:szCs w:val="28"/>
+        </w:rPr>
+      </w:pPr>
+      <w:r>
+        <w:rPr>
+          <w:b/>
+          <w:bCs/>
+          <w:sz w:val="28"/>
+          <w:szCs w:val="28"/>
+        </w:rPr>
+        <w:t>Expected Deliverables</w:t>
+      </w:r>
+    </w:p>
+    <w:p>
+      <w:r>
+        <w:t xml:space="preserve">By the end of Semester 2 (April 2027), the project will deliver: </w:t>
+      </w:r>
+    </w:p>
+    <w:p>
+      <w:pPr>
+        <w:numPr>
+          <w:ilvl w:val="0"/>
+          <w:numId w:val="15"/>
+        </w:numPr>
+      </w:pPr>
+      <w:r>
+        <w:rPr>
+          <w:b/>
+          <w:bCs/>
+        </w:rPr>
+        <w:t>Cleaned Dataset and EDA Report (CA2):</w:t>
+      </w:r>
+      <w:r>
+        <w:t xml:space="preserve"> A 2,000–2,500 word report and Python Jupyter Notebook showing data preparation and visual analysis. </w:t>
+      </w:r>
+    </w:p>
+    <w:p>
+      <w:pPr>
+        <w:numPr>
+          <w:ilvl w:val="0"/>
+          <w:numId w:val="15"/>
+        </w:numPr>
+      </w:pPr>
+      <w:r>
+        <w:rPr>
+          <w:b/>
+          <w:bCs/>
+        </w:rPr>
+        <w:t>Predictive Regression Models (CA3):</w:t>
+      </w:r>
+      <w:r>
+        <w:t xml:space="preserve"> A Jupyter Notebook with trained Linear Regression and Random Forest models. </w:t>
+      </w:r>
+    </w:p>
+    <w:p>
+      <w:pPr>
+        <w:numPr>
+          <w:ilvl w:val="0"/>
+          <w:numId w:val="15"/>
+        </w:numPr>
+      </w:pPr>
+      <w:r>
+        <w:rPr>
+          <w:b/>
+          <w:bCs/>
+        </w:rPr>
+        <w:t>Evaluation Charts:</w:t>
+      </w:r>
+      <w:r>
+        <w:t xml:space="preserve"> Visual comparisons of MAE, RMSE, and </w:t>
+      </w:r>
+      <m:oMath>
+        <m:sSup>
+          <m:sSupPr>
+            <m:ctrlPr>
+              <w:rPr>
+                <w:rFonts w:ascii="Cambria Math" w:hAnsi="Cambria Math"/>
+              </w:rPr>
+            </m:ctrlPr>
+          </m:sSupPr>
+          <m:e>
+            <m:r>
+              <w:rPr>
+                <w:rFonts w:ascii="Cambria Math" w:hAnsi="Cambria Math"/>
+              </w:rPr>
+              <m:t>R</m:t>
+            </m:r>
+          </m:e>
+          <m:sup>
+            <m:r>
+              <w:rPr>
+                <w:rFonts w:ascii="Cambria Math" w:hAnsi="Cambria Math"/>
+              </w:rPr>
+              <m:t>2</m:t>
+            </m:r>
+          </m:sup>
+        </m:sSup>
+      </m:oMath>
+      <w:r>
+        <w:t xml:space="preserve">, plus feature importance graphs for IT managers. </w:t>
+      </w:r>
+    </w:p>
+    <w:p>
+      <w:pPr>
+        <w:numPr>
+          <w:ilvl w:val="0"/>
+          <w:numId w:val="15"/>
+        </w:numPr>
+      </w:pPr>
+      <w:r>
+        <w:rPr>
+          <w:b/>
+          <w:bCs/>
+        </w:rPr>
+        <w:t>Final Thesis and Presentation (CA3):</w:t>
+      </w:r>
+      <w:r>
+        <w:t xml:space="preserve"> A 5,000-word final thesis, a GitHub repository, and a presentation with Q&amp;A. These outputs link model accuracy with business value, like fewer SLA breaches (ServiceNow, 2021).</w:t>
+      </w:r>
+    </w:p>
+    <w:p/>
+    <w:p>
+      <w:pPr>
+        <w:rPr>
+          <w:b/>
+          <w:bCs/>
+          <w:sz w:val="28"/>
+          <w:szCs w:val="28"/>
+        </w:rPr>
+      </w:pPr>
+      <w:r>
+        <w:rPr>
+          <w:b/>
+          <w:bCs/>
+          <w:sz w:val="28"/>
+          <w:szCs w:val="28"/>
+        </w:rPr>
+        <w:t>Project Timeline</w:t>
+      </w:r>
+    </w:p>
+    <w:p>
+      <w:r>
+        <w:t xml:space="preserve">The project runs across two semesters from October 2026 to May 2027. The Gantt chart below shows the main tasks in half-month steps: </w:t>
+      </w:r>
+    </w:p>
+    <w:p>
+      <w:pPr>
+        <w:numPr>
+          <w:ilvl w:val="0"/>
+          <w:numId w:val="16"/>
+        </w:numPr>
+      </w:pPr>
+      <w:r>
+        <w:rPr>
+          <w:b/>
+          <w:bCs/>
+        </w:rPr>
+        <w:t>Oct 2026:</w:t>
+      </w:r>
+      <w:r>
+        <w:t xml:space="preserve"> Problem definition and CA1 Proposal submission (25 October 2026). </w:t>
+      </w:r>
+    </w:p>
+    <w:p>
+      <w:pPr>
+        <w:numPr>
+          <w:ilvl w:val="0"/>
+          <w:numId w:val="16"/>
+        </w:numPr>
+      </w:pPr>
+      <w:r>
+        <w:rPr>
+          <w:b/>
+          <w:bCs/>
+        </w:rPr>
+        <w:lastRenderedPageBreak/>
+        <w:t>Nov – Dec 2026:</w:t>
+      </w:r>
+      <w:r>
+        <w:t xml:space="preserve"> Data cleaning, filtering (2016–2023), EDA charts, and CA2 submission. </w:t>
+      </w:r>
+    </w:p>
+    <w:p>
+      <w:pPr>
+        <w:numPr>
+          <w:ilvl w:val="0"/>
+          <w:numId w:val="16"/>
+        </w:numPr>
+      </w:pPr>
+      <w:r>
+        <w:rPr>
+          <w:b/>
+          <w:bCs/>
+        </w:rPr>
+        <w:t>Jan – Mar 2027:</w:t>
+      </w:r>
+      <w:r>
+        <w:t xml:space="preserve"> Feature engineering, training Linear Regression and Random Forest models, and tuning (CA3). </w:t>
+      </w:r>
+    </w:p>
+    <w:p>
+      <w:pPr>
+        <w:numPr>
+          <w:ilvl w:val="0"/>
+          <w:numId w:val="16"/>
+        </w:numPr>
+      </w:pPr>
+      <w:r>
+        <w:rPr>
+          <w:b/>
+          <w:bCs/>
+        </w:rPr>
+        <w:t>Mar – May 2027:</w:t>
+      </w:r>
+      <w:r>
+        <w:t xml:space="preserve"> Model evaluation, interpretability analysis, writing the 5,000-word thesis (April 2027), and final presentation (May 2027).</w:t>
+      </w:r>
+    </w:p>
+    <w:p/>
+    <w:p>
+      <w:r>
+        <w:rPr>
+          <w:noProof/>
+        </w:rPr>
+        <w:drawing>
+          <wp:inline distT="0" distB="0" distL="0" distR="0" wp14:anchorId="555A2B2C" wp14:editId="018CBDCC">
+            <wp:extent cx="5724525" cy="2859405"/>
+            <wp:effectExtent l="0" t="0" r="9525" b="0"/>
+            <wp:docPr id="69930755" name="Picture 21"/>
+            <wp:cNvGraphicFramePr>
+              <a:graphicFrameLocks xmlns:a="http://schemas.openxmlformats.org/drawingml/2006/main" noChangeAspect="1"/>
+            </wp:cNvGraphicFramePr>
+            <a:graphic xmlns:a="http://schemas.openxmlformats.org/drawingml/2006/main">
+              <a:graphicData uri="http://schemas.openxmlformats.org/drawingml/2006/picture">
+                <pic:pic xmlns:pic="http://schemas.openxmlformats.org/drawingml/2006/picture">
+                  <pic:nvPicPr>
+                    <pic:cNvPr id="0" name="Picture 1"/>
+                    <pic:cNvPicPr>
+                      <a:picLocks noChangeAspect="1" noChangeArrowheads="1"/>
+                    </pic:cNvPicPr>
+                  </pic:nvPicPr>
+                  <pic:blipFill>
+                    <a:blip r:embed="rId7" cstate="print">
+                      <a:extLst>
+                        <a:ext uri="{28A0092B-C50C-407E-A947-70E740481C1C}">
+                          <a14:useLocalDpi xmlns:a14="http://schemas.microsoft.com/office/drawing/2010/main" val="0"/>
+                        </a:ext>
+                      </a:extLst>
+                    </a:blip>
+                    <a:srcRect/>
+                    <a:stretch>
+                      <a:fillRect/>
+                    </a:stretch>
+                  </pic:blipFill>
+                  <pic:spPr bwMode="auto">
+                    <a:xfrm>
+                      <a:off x="0" y="0"/>
+                      <a:ext cx="5724525" cy="2859405"/>
+                    </a:xfrm>
+                    <a:prstGeom prst="rect">
+                      <a:avLst/>
+                    </a:prstGeom>
+                    <a:noFill/>
+                    <a:ln>
+                      <a:noFill/>
+                    </a:ln>
+                  </pic:spPr>
+                </pic:pic>
+              </a:graphicData>
+            </a:graphic>
+          </wp:inline>
+        </w:drawing>
+      </w:r>
+    </w:p>
+    <w:p/>
+    <w:p>
+      <w:pPr>
+        <w:rPr>
+          <w:b/>
+          <w:bCs/>
+          <w:sz w:val="28"/>
+          <w:szCs w:val="28"/>
+        </w:rPr>
+      </w:pPr>
+      <w:r>
+        <w:rPr>
+          <w:b/>
+          <w:bCs/>
+          <w:sz w:val="28"/>
+          <w:szCs w:val="28"/>
+        </w:rPr>
+        <w:t>Ethical and Legal Considerations</w:t>
+      </w:r>
+    </w:p>
+    <w:p>
+      <w:r>
+        <w:t xml:space="preserve">This project follows European Union IT governance and ethical rules: </w:t>
+      </w:r>
+    </w:p>
+    <w:p>
+      <w:pPr>
+        <w:numPr>
+          <w:ilvl w:val="0"/>
+          <w:numId w:val="17"/>
+        </w:numPr>
+      </w:pPr>
+      <w:r>
+        <w:rPr>
+          <w:b/>
+          <w:bCs/>
+        </w:rPr>
+        <w:t>General Data Protection Regulation (GDPR):</w:t>
+      </w:r>
+      <w:r>
+        <w:t xml:space="preserve"> GDPR protects personal data in the EU. I checked issues.csv carefully, and it has no Personally Identifiable Information (PII). User IDs are random codes like 4olg. Because this is an open, fully anonymised dataset where no person can be identified, I explicitly declare that GDPR does not apply to this project. </w:t>
+      </w:r>
+    </w:p>
+    <w:p>
+      <w:pPr>
+        <w:numPr>
+          <w:ilvl w:val="0"/>
+          <w:numId w:val="17"/>
+        </w:numPr>
+      </w:pPr>
+      <w:r>
+        <w:rPr>
+          <w:b/>
+          <w:bCs/>
+        </w:rPr>
+        <w:t>EU Artificial Intelligence Act (EU AI Act):</w:t>
+      </w:r>
+      <w:r>
+        <w:t xml:space="preserve"> </w:t>
+      </w:r>
+      <w:r>
+        <w:t xml:space="preserve">The EU AI Act groups AI systems by risk level (Future of Life Institute, 2024). My model only predicts internal IT ticket duration to help schedule staff. It does not affect human rights, health, or credit scoring. Therefore, under the EU AI Act, this project is a </w:t>
+      </w:r>
+      <w:r>
+        <w:rPr>
+          <w:b/>
+          <w:bCs/>
+        </w:rPr>
+        <w:t>Minimal / Low-Risk AI system</w:t>
+      </w:r>
+      <w:r>
+        <w:t xml:space="preserve"> (Future of Life Institute, 2024). I will ensure transparency by explaining how the model works.</w:t>
+      </w:r>
+    </w:p>
+    <w:p>
+      <w:pPr>
+        <w:numPr>
+          <w:ilvl w:val="0"/>
+          <w:numId w:val="17"/>
+        </w:numPr>
+      </w:pPr>
+      <w:r>
+        <w:lastRenderedPageBreak/>
+        <w:t xml:space="preserve"> </w:t>
+      </w:r>
+      <w:r>
+        <w:rPr>
+          <w:b/>
+          <w:bCs/>
+        </w:rPr>
+        <w:t>Digital Services Act (DSA):</w:t>
+      </w:r>
+      <w:r>
+        <w:t xml:space="preserve"> The DSA regulates public online platforms. Because this project is an offline analytical study in Jupyter Notebook and not an online platform, DSA rules do not apply. </w:t>
+      </w:r>
+    </w:p>
+    <w:p>
+      <w:pPr>
+        <w:numPr>
+          <w:ilvl w:val="0"/>
+          <w:numId w:val="17"/>
+        </w:numPr>
+      </w:pPr>
+      <w:r>
+        <w:rPr>
+          <w:b/>
+          <w:bCs/>
+        </w:rPr>
+        <w:t>Academic Integrity:</w:t>
+      </w:r>
+      <w:r>
+        <w:t xml:space="preserve"> I will submit the signed CCT Ethics Form and the separate AI Declaration file. All sources are cited using Harvard Referencing. </w:t>
+      </w:r>
+    </w:p>
+    <w:p>
+      <w:pPr>
+        <w:rPr>
+          <w:lang w:val="ru-RU"/>
+        </w:rPr>
+      </w:pPr>
+    </w:p>
+    <w:p>
+      <w:pPr>
+        <w:rPr>
+          <w:lang w:val="ru-RU"/>
+        </w:rPr>
+      </w:pPr>
+    </w:p>
+    <w:p>
+      <w:pPr>
+        <w:rPr>
+          <w:lang w:val="ru-RU"/>
+        </w:rPr>
+      </w:pPr>
+    </w:p>
+    <w:p>
+      <w:pPr>
+        <w:rPr>
+          <w:b/>
+          <w:bCs/>
+        </w:rPr>
+      </w:pPr>
+      <w:r>
+        <w:rPr>
+          <w:b/>
+          <w:bCs/>
+        </w:rPr>
+        <w:t>References</w:t>
+      </w:r>
+    </w:p>
+    <w:p>
+      <w:pPr>
+        <w:numPr>
+          <w:ilvl w:val="0"/>
+          <w:numId w:val="18"/>
+        </w:numPr>
+      </w:pPr>
+      <w:r>
+        <w:t xml:space="preserve">Future of Life Institute (2024) </w:t>
+      </w:r>
+      <w:r>
+        <w:rPr>
+          <w:i/>
+          <w:iCs/>
+        </w:rPr>
+        <w:t>The EU Artificial Intelligence Act: Up-to-date developments and analyses of the EU AI Act</w:t>
+      </w:r>
+      <w:r>
+        <w:t xml:space="preserve">. Available at: </w:t>
+      </w:r>
+      <w:hyperlink r:id="rId8" w:tgtFrame="_blank" w:history="1">
+        <w:r>
+          <w:rPr>
+            <w:rStyle w:val="Hyperlink"/>
+          </w:rPr>
+          <w:t>https://artificialintelligenceact.eu</w:t>
+        </w:r>
+      </w:hyperlink>
+      <w:r>
+        <w:t xml:space="preserve"> (Accessed: 20 October 2026). </w:t>
+      </w:r>
+    </w:p>
+    <w:p>
+      <w:pPr>
+        <w:numPr>
+          <w:ilvl w:val="0"/>
+          <w:numId w:val="18"/>
+        </w:numPr>
+      </w:pPr>
+      <w:r>
+        <w:t xml:space="preserve">Saputra, R., Waworuntu, A. and Setiawan, E. (2024) 'Performance Evaluation on Resolution Time Prediction Using Machine Learning Techniques', </w:t>
+      </w:r>
+      <w:r>
+        <w:rPr>
+          <w:i/>
+          <w:iCs/>
+        </w:rPr>
+        <w:t>International Journal on Informatics Visualization (JOIV)</w:t>
+      </w:r>
+      <w:r>
+        <w:t xml:space="preserve">, 8(1), pp. 112–119. Available at: </w:t>
+      </w:r>
+      <w:hyperlink r:id="rId9" w:tgtFrame="_blank" w:history="1">
+        <w:r>
+          <w:rPr>
+            <w:rStyle w:val="Hyperlink"/>
+          </w:rPr>
+          <w:t>https://joiv.org/index.php/joiv/article/view/2305</w:t>
+        </w:r>
+      </w:hyperlink>
+      <w:r>
+        <w:t xml:space="preserve"> (Accessed: 20 October 2026).</w:t>
+      </w:r>
+    </w:p>
+    <w:p>
+      <w:pPr>
+        <w:numPr>
+          <w:ilvl w:val="0"/>
+          <w:numId w:val="18"/>
+        </w:numPr>
+      </w:pPr>
+      <w:r>
+        <w:t xml:space="preserve">Scikit-learn (2024) </w:t>
+      </w:r>
+      <w:r>
+        <w:rPr>
+          <w:i/>
+          <w:iCs/>
+        </w:rPr>
+        <w:t>Supervised learning: User Guide</w:t>
+      </w:r>
+      <w:r>
+        <w:t xml:space="preserve">. Available at: </w:t>
+      </w:r>
+      <w:hyperlink r:id="rId10" w:tgtFrame="_blank" w:history="1">
+        <w:r>
+          <w:rPr>
+            <w:rStyle w:val="Hyperlink"/>
+          </w:rPr>
+          <w:t>https://scikit-learn.org/stable/supervised_learning.html</w:t>
+        </w:r>
+      </w:hyperlink>
+      <w:r>
+        <w:t xml:space="preserve"> (Accessed: 20 October 2026).</w:t>
+      </w:r>
+    </w:p>
+    <w:p>
+      <w:pPr>
+        <w:numPr>
+          <w:ilvl w:val="0"/>
+          <w:numId w:val="18"/>
+        </w:numPr>
+      </w:pPr>
+      <w:r>
+        <w:t xml:space="preserve">ServiceNow (2021) </w:t>
+      </w:r>
+      <w:r>
+        <w:rPr>
+          <w:i/>
+          <w:iCs/>
+        </w:rPr>
+        <w:t>Now on Now: Using AI to help predict and prevent Customer Support cases and improve time to relief</w:t>
+      </w:r>
+      <w:r>
+        <w:t xml:space="preserve">. Santa Clara: ServiceNow, Inc. </w:t>
+      </w:r>
+    </w:p>
+    <w:p>
+      <w:pPr>
+        <w:numPr>
+          <w:ilvl w:val="0"/>
+          <w:numId w:val="18"/>
+        </w:numPr>
+      </w:pPr>
+      <w:r>
+        <w:t xml:space="preserve">Sumathi, S. et al. (2022) </w:t>
+      </w:r>
+      <w:r>
+        <w:rPr>
+          <w:i/>
+          <w:iCs/>
+        </w:rPr>
+        <w:t>Data Analytics Life Cycle</w:t>
+      </w:r>
+      <w:r>
+        <w:t xml:space="preserve">. Cited in Ahmed, T. (2026) </w:t>
+      </w:r>
+      <w:r>
+        <w:rPr>
+          <w:i/>
+          <w:iCs/>
+        </w:rPr>
+        <w:t>Lesson 4: Data Analytics Life Cycle, Research, Citing and Referencing</w:t>
+      </w:r>
+      <w:r>
+        <w:t xml:space="preserve"> [Lecture slides]. Strategic Thinking, CCT College Dublin. </w:t>
+      </w:r>
+    </w:p>
+    <w:p>
+      <w:pPr>
+        <w:rPr>
+          <w:lang w:val="ru-RU"/>
+        </w:rPr>
+      </w:pPr>
+    </w:p>
+    <w:p/>
+    <w:p/>
+    <w:p/>
     <w:sectPr>
-      <w:headerReference w:type="even" r:id="rId7"/>
-      <w:headerReference w:type="default" r:id="rId8"/>
-      <w:footerReference w:type="even" r:id="rId9"/>
-      <w:footerReference w:type="default" r:id="rId10"/>
-      <w:headerReference w:type="first" r:id="rId11"/>
-      <w:footerReference w:type="first" r:id="rId12"/>
+      <w:headerReference w:type="even" r:id="rId11"/>
+      <w:headerReference w:type="default" r:id="rId12"/>
+      <w:footerReference w:type="even" r:id="rId13"/>
+      <w:footerReference w:type="default" r:id="rId14"/>
+      <w:headerReference w:type="first" r:id="rId15"/>
+      <w:footerReference w:type="first" r:id="rId16"/>
       <w:pgSz w:w="11906" w:h="16838"/>
       <w:pgMar w:top="1440" w:right="1440" w:bottom="1440" w:left="1440" w:header="708" w:footer="708" w:gutter="0"/>
       <w:cols w:space="708"/>
@@ -3855,6 +4698,155 @@
 <file path=word/numbering.xml><?xml version="1.0" encoding="utf-8"?>
 <w:numbering xmlns:wpc="http://schemas.microsoft.com/office/word/2010/wordprocessingCanvas" xmlns:cx="http://schemas.microsoft.com/office/drawing/2014/chartex" xmlns:cx1="http://schemas.microsoft.com/office/drawing/2015/9/8/chartex" xmlns:cx2="http://schemas.microsoft.com/office/drawing/2015/10/21/chartex" xmlns:cx3="http://schemas.microsoft.com/office/drawing/2016/5/9/chartex" xmlns:cx4="http://schemas.microsoft.com/office/drawing/2016/5/10/chartex" xmlns:cx5="http://schemas.microsoft.com/office/drawing/2016/5/11/chartex" xmlns:cx6="http://schemas.microsoft.com/office/drawing/2016/5/12/chartex" xmlns:cx7="http://schemas.microsoft.com/office/drawing/2016/5/13/chartex" xmlns:cx8="http://schemas.microsoft.com/office/drawing/2016/5/14/chartex" xmlns:mc="http://schemas.openxmlformats.org/markup-compatibility/2006" xmlns:aink="http://schemas.microsoft.com/office/drawing/2016/ink" xmlns:am3d="http://schemas.microsoft.com/office/drawing/2017/model3d" xmlns:o="urn:schemas-microsoft-com:office:office" xmlns:oel="http://schemas.microsoft.com/office/2019/extlst" xmlns:r="http://schemas.openxmlformats.org/officeDocument/2006/relationships" xmlns:m="http://schemas.openxmlformats.org/officeDocument/2006/math" xmlns:v="urn:schemas-microsoft-com:vml" xmlns:wp14="http://schemas.microsoft.com/office/word/2010/wordprocessingDrawing" xmlns:wp="http://schemas.openxmlformats.org/drawingml/2006/wordprocessingDrawing" xmlns:w10="urn:schemas-microsoft-com:office:word" xmlns:w="http://schemas.openxmlformats.org/wordprocessingml/2006/main" xmlns:w14="http://schemas.microsoft.com/office/word/2010/wordml" xmlns:w15="http://schemas.microsoft.com/office/word/2012/wordml" xmlns:w16cex="http://schemas.microsoft.com/office/word/2018/wordml/cex" xmlns:w16cid="http://schemas.microsoft.com/office/word/2016/wordml/cid" xmlns:w16="http://schemas.microsoft.com/office/word/2018/wordml" xmlns:w16du="http://schemas.microsoft.com/office/word/2023/wordml/word16du" xmlns:w16sdtdh="http://schemas.microsoft.com/office/word/2020/wordml/sdtdatahash" xmlns:w16sdtfl="http://schemas.microsoft.com/office/word/2024/wordml/sdtformatlock" xmlns:w16se="http://schemas.microsoft.com/office/word/2015/wordml/symex" xmlns:wpg="http://schemas.microsoft.com/office/word/2010/wordprocessingGroup" xmlns:wpi="http://schemas.microsoft.com/office/word/2010/wordprocessingInk" xmlns:wne="http://schemas.microsoft.com/office/word/2006/wordml" xmlns:wps="http://schemas.microsoft.com/office/word/2010/wordprocessingShape" mc:Ignorable="w14 w15 w16se w16cid w16 w16cex w16sdtdh w16sdtfl w16du wp14">
   <w:abstractNum w:abstractNumId="0" w15:restartNumberingAfterBreak="0">
+    <w:nsid w:val="02925BF3"/>
+    <w:multiLevelType w:val="multilevel"/>
+    <w:tmpl w:val="79CAAF16"/>
+    <w:lvl w:ilvl="0">
+      <w:start w:val="1"/>
+      <w:numFmt w:val="bullet"/>
+      <w:lvlText w:val=""/>
+      <w:lvlJc w:val="left"/>
+      <w:pPr>
+        <w:tabs>
+          <w:tab w:val="num" w:pos="720"/>
+        </w:tabs>
+        <w:ind w:left="720" w:hanging="360"/>
+      </w:pPr>
+      <w:rPr>
+        <w:rFonts w:ascii="Symbol" w:hAnsi="Symbol" w:hint="default"/>
+        <w:sz w:val="20"/>
+      </w:rPr>
+    </w:lvl>
+    <w:lvl w:ilvl="1" w:tentative="1">
+      <w:start w:val="1"/>
+      <w:numFmt w:val="bullet"/>
+      <w:lvlText w:val="o"/>
+      <w:lvlJc w:val="left"/>
+      <w:pPr>
+        <w:tabs>
+          <w:tab w:val="num" w:pos="1440"/>
+        </w:tabs>
+        <w:ind w:left="1440" w:hanging="360"/>
+      </w:pPr>
+      <w:rPr>
+        <w:rFonts w:ascii="Courier New" w:hAnsi="Courier New" w:hint="default"/>
+        <w:sz w:val="20"/>
+      </w:rPr>
+    </w:lvl>
+    <w:lvl w:ilvl="2" w:tentative="1">
+      <w:start w:val="1"/>
+      <w:numFmt w:val="bullet"/>
+      <w:lvlText w:val=""/>
+      <w:lvlJc w:val="left"/>
+      <w:pPr>
+        <w:tabs>
+          <w:tab w:val="num" w:pos="2160"/>
+        </w:tabs>
+        <w:ind w:left="2160" w:hanging="360"/>
+      </w:pPr>
+      <w:rPr>
+        <w:rFonts w:ascii="Wingdings" w:hAnsi="Wingdings" w:hint="default"/>
+        <w:sz w:val="20"/>
+      </w:rPr>
+    </w:lvl>
+    <w:lvl w:ilvl="3" w:tentative="1">
+      <w:start w:val="1"/>
+      <w:numFmt w:val="bullet"/>
+      <w:lvlText w:val=""/>
+      <w:lvlJc w:val="left"/>
+      <w:pPr>
+        <w:tabs>
+          <w:tab w:val="num" w:pos="2880"/>
+        </w:tabs>
+        <w:ind w:left="2880" w:hanging="360"/>
+      </w:pPr>
+      <w:rPr>
+        <w:rFonts w:ascii="Wingdings" w:hAnsi="Wingdings" w:hint="default"/>
+        <w:sz w:val="20"/>
+      </w:rPr>
+    </w:lvl>
+    <w:lvl w:ilvl="4" w:tentative="1">
+      <w:start w:val="1"/>
+      <w:numFmt w:val="bullet"/>
+      <w:lvlText w:val=""/>
+      <w:lvlJc w:val="left"/>
+      <w:pPr>
+        <w:tabs>
+          <w:tab w:val="num" w:pos="3600"/>
+        </w:tabs>
+        <w:ind w:left="3600" w:hanging="360"/>
+      </w:pPr>
+      <w:rPr>
+        <w:rFonts w:ascii="Wingdings" w:hAnsi="Wingdings" w:hint="default"/>
+        <w:sz w:val="20"/>
+      </w:rPr>
+    </w:lvl>
+    <w:lvl w:ilvl="5" w:tentative="1">
+      <w:start w:val="1"/>
+      <w:numFmt w:val="bullet"/>
+      <w:lvlText w:val=""/>
+      <w:lvlJc w:val="left"/>
+      <w:pPr>
+        <w:tabs>
+          <w:tab w:val="num" w:pos="4320"/>
+        </w:tabs>
+        <w:ind w:left="4320" w:hanging="360"/>
+      </w:pPr>
+      <w:rPr>
+        <w:rFonts w:ascii="Wingdings" w:hAnsi="Wingdings" w:hint="default"/>
+        <w:sz w:val="20"/>
+      </w:rPr>
+    </w:lvl>
+    <w:lvl w:ilvl="6" w:tentative="1">
+      <w:start w:val="1"/>
+      <w:numFmt w:val="bullet"/>
+      <w:lvlText w:val=""/>
+      <w:lvlJc w:val="left"/>
+      <w:pPr>
+        <w:tabs>
+          <w:tab w:val="num" w:pos="5040"/>
+        </w:tabs>
+        <w:ind w:left="5040" w:hanging="360"/>
+      </w:pPr>
+      <w:rPr>
+        <w:rFonts w:ascii="Wingdings" w:hAnsi="Wingdings" w:hint="default"/>
+        <w:sz w:val="20"/>
+      </w:rPr>
+    </w:lvl>
+    <w:lvl w:ilvl="7" w:tentative="1">
+      <w:start w:val="1"/>
+      <w:numFmt w:val="bullet"/>
+      <w:lvlText w:val=""/>
+      <w:lvlJc w:val="left"/>
+      <w:pPr>
+        <w:tabs>
+          <w:tab w:val="num" w:pos="5760"/>
+        </w:tabs>
+        <w:ind w:left="5760" w:hanging="360"/>
+      </w:pPr>
+      <w:rPr>
+        <w:rFonts w:ascii="Wingdings" w:hAnsi="Wingdings" w:hint="default"/>
+        <w:sz w:val="20"/>
+      </w:rPr>
+    </w:lvl>
+    <w:lvl w:ilvl="8" w:tentative="1">
+      <w:start w:val="1"/>
+      <w:numFmt w:val="bullet"/>
+      <w:lvlText w:val=""/>
+      <w:lvlJc w:val="left"/>
+      <w:pPr>
+        <w:tabs>
+          <w:tab w:val="num" w:pos="6480"/>
+        </w:tabs>
+        <w:ind w:left="6480" w:hanging="360"/>
+      </w:pPr>
+      <w:rPr>
+        <w:rFonts w:ascii="Wingdings" w:hAnsi="Wingdings" w:hint="default"/>
+        <w:sz w:val="20"/>
+      </w:rPr>
+    </w:lvl>
+  </w:abstractNum>
+  <w:abstractNum w:abstractNumId="1" w15:restartNumberingAfterBreak="0">
     <w:nsid w:val="09535846"/>
     <w:multiLevelType w:val="multilevel"/>
     <w:tmpl w:val="74F4163E"/>
@@ -4003,7 +4995,269 @@
       </w:rPr>
     </w:lvl>
   </w:abstractNum>
-  <w:abstractNum w:abstractNumId="1" w15:restartNumberingAfterBreak="0">
+  <w:abstractNum w:abstractNumId="2" w15:restartNumberingAfterBreak="0">
+    <w:nsid w:val="09716364"/>
+    <w:multiLevelType w:val="multilevel"/>
+    <w:tmpl w:val="92240730"/>
+    <w:lvl w:ilvl="0">
+      <w:start w:val="1"/>
+      <w:numFmt w:val="bullet"/>
+      <w:lvlText w:val=""/>
+      <w:lvlJc w:val="left"/>
+      <w:pPr>
+        <w:tabs>
+          <w:tab w:val="num" w:pos="720"/>
+        </w:tabs>
+        <w:ind w:left="720" w:hanging="360"/>
+      </w:pPr>
+      <w:rPr>
+        <w:rFonts w:ascii="Symbol" w:hAnsi="Symbol" w:hint="default"/>
+        <w:sz w:val="20"/>
+      </w:rPr>
+    </w:lvl>
+    <w:lvl w:ilvl="1" w:tentative="1">
+      <w:start w:val="1"/>
+      <w:numFmt w:val="bullet"/>
+      <w:lvlText w:val="o"/>
+      <w:lvlJc w:val="left"/>
+      <w:pPr>
+        <w:tabs>
+          <w:tab w:val="num" w:pos="1440"/>
+        </w:tabs>
+        <w:ind w:left="1440" w:hanging="360"/>
+      </w:pPr>
+      <w:rPr>
+        <w:rFonts w:ascii="Courier New" w:hAnsi="Courier New" w:hint="default"/>
+        <w:sz w:val="20"/>
+      </w:rPr>
+    </w:lvl>
+    <w:lvl w:ilvl="2" w:tentative="1">
+      <w:start w:val="1"/>
+      <w:numFmt w:val="bullet"/>
+      <w:lvlText w:val=""/>
+      <w:lvlJc w:val="left"/>
+      <w:pPr>
+        <w:tabs>
+          <w:tab w:val="num" w:pos="2160"/>
+        </w:tabs>
+        <w:ind w:left="2160" w:hanging="360"/>
+      </w:pPr>
+      <w:rPr>
+        <w:rFonts w:ascii="Wingdings" w:hAnsi="Wingdings" w:hint="default"/>
+        <w:sz w:val="20"/>
+      </w:rPr>
+    </w:lvl>
+    <w:lvl w:ilvl="3" w:tentative="1">
+      <w:start w:val="1"/>
+      <w:numFmt w:val="bullet"/>
+      <w:lvlText w:val=""/>
+      <w:lvlJc w:val="left"/>
+      <w:pPr>
+        <w:tabs>
+          <w:tab w:val="num" w:pos="2880"/>
+        </w:tabs>
+        <w:ind w:left="2880" w:hanging="360"/>
+      </w:pPr>
+      <w:rPr>
+        <w:rFonts w:ascii="Wingdings" w:hAnsi="Wingdings" w:hint="default"/>
+        <w:sz w:val="20"/>
+      </w:rPr>
+    </w:lvl>
+    <w:lvl w:ilvl="4" w:tentative="1">
+      <w:start w:val="1"/>
+      <w:numFmt w:val="bullet"/>
+      <w:lvlText w:val=""/>
+      <w:lvlJc w:val="left"/>
+      <w:pPr>
+        <w:tabs>
+          <w:tab w:val="num" w:pos="3600"/>
+        </w:tabs>
+        <w:ind w:left="3600" w:hanging="360"/>
+      </w:pPr>
+      <w:rPr>
+        <w:rFonts w:ascii="Wingdings" w:hAnsi="Wingdings" w:hint="default"/>
+        <w:sz w:val="20"/>
+      </w:rPr>
+    </w:lvl>
+    <w:lvl w:ilvl="5" w:tentative="1">
+      <w:start w:val="1"/>
+      <w:numFmt w:val="bullet"/>
+      <w:lvlText w:val=""/>
+      <w:lvlJc w:val="left"/>
+      <w:pPr>
+        <w:tabs>
+          <w:tab w:val="num" w:pos="4320"/>
+        </w:tabs>
+        <w:ind w:left="4320" w:hanging="360"/>
+      </w:pPr>
+      <w:rPr>
+        <w:rFonts w:ascii="Wingdings" w:hAnsi="Wingdings" w:hint="default"/>
+        <w:sz w:val="20"/>
+      </w:rPr>
+    </w:lvl>
+    <w:lvl w:ilvl="6" w:tentative="1">
+      <w:start w:val="1"/>
+      <w:numFmt w:val="bullet"/>
+      <w:lvlText w:val=""/>
+      <w:lvlJc w:val="left"/>
+      <w:pPr>
+        <w:tabs>
+          <w:tab w:val="num" w:pos="5040"/>
+        </w:tabs>
+        <w:ind w:left="5040" w:hanging="360"/>
+      </w:pPr>
+      <w:rPr>
+        <w:rFonts w:ascii="Wingdings" w:hAnsi="Wingdings" w:hint="default"/>
+        <w:sz w:val="20"/>
+      </w:rPr>
+    </w:lvl>
+    <w:lvl w:ilvl="7" w:tentative="1">
+      <w:start w:val="1"/>
+      <w:numFmt w:val="bullet"/>
+      <w:lvlText w:val=""/>
+      <w:lvlJc w:val="left"/>
+      <w:pPr>
+        <w:tabs>
+          <w:tab w:val="num" w:pos="5760"/>
+        </w:tabs>
+        <w:ind w:left="5760" w:hanging="360"/>
+      </w:pPr>
+      <w:rPr>
+        <w:rFonts w:ascii="Wingdings" w:hAnsi="Wingdings" w:hint="default"/>
+        <w:sz w:val="20"/>
+      </w:rPr>
+    </w:lvl>
+    <w:lvl w:ilvl="8" w:tentative="1">
+      <w:start w:val="1"/>
+      <w:numFmt w:val="bullet"/>
+      <w:lvlText w:val=""/>
+      <w:lvlJc w:val="left"/>
+      <w:pPr>
+        <w:tabs>
+          <w:tab w:val="num" w:pos="6480"/>
+        </w:tabs>
+        <w:ind w:left="6480" w:hanging="360"/>
+      </w:pPr>
+      <w:rPr>
+        <w:rFonts w:ascii="Wingdings" w:hAnsi="Wingdings" w:hint="default"/>
+        <w:sz w:val="20"/>
+      </w:rPr>
+    </w:lvl>
+  </w:abstractNum>
+  <w:abstractNum w:abstractNumId="3" w15:restartNumberingAfterBreak="0">
+    <w:nsid w:val="191B683D"/>
+    <w:multiLevelType w:val="multilevel"/>
+    <w:tmpl w:val="71809FB8"/>
+    <w:lvl w:ilvl="0">
+      <w:start w:val="1"/>
+      <w:numFmt w:val="decimal"/>
+      <w:lvlText w:val="%1."/>
+      <w:lvlJc w:val="left"/>
+      <w:pPr>
+        <w:tabs>
+          <w:tab w:val="num" w:pos="720"/>
+        </w:tabs>
+        <w:ind w:left="720" w:hanging="360"/>
+      </w:pPr>
+    </w:lvl>
+    <w:lvl w:ilvl="1" w:tentative="1">
+      <w:start w:val="1"/>
+      <w:numFmt w:val="decimal"/>
+      <w:lvlText w:val="%2."/>
+      <w:lvlJc w:val="left"/>
+      <w:pPr>
+        <w:tabs>
+          <w:tab w:val="num" w:pos="1440"/>
+        </w:tabs>
+        <w:ind w:left="1440" w:hanging="360"/>
+      </w:pPr>
+    </w:lvl>
+    <w:lvl w:ilvl="2" w:tentative="1">
+      <w:start w:val="1"/>
+      <w:numFmt w:val="decimal"/>
+      <w:lvlText w:val="%3."/>
+      <w:lvlJc w:val="left"/>
+      <w:pPr>
+        <w:tabs>
+          <w:tab w:val="num" w:pos="2160"/>
+        </w:tabs>
+        <w:ind w:left="2160" w:hanging="360"/>
+      </w:pPr>
+    </w:lvl>
+    <w:lvl w:ilvl="3" w:tentative="1">
+      <w:start w:val="1"/>
+      <w:numFmt w:val="decimal"/>
+      <w:lvlText w:val="%4."/>
+      <w:lvlJc w:val="left"/>
+      <w:pPr>
+        <w:tabs>
+          <w:tab w:val="num" w:pos="2880"/>
+        </w:tabs>
+        <w:ind w:left="2880" w:hanging="360"/>
+      </w:pPr>
+    </w:lvl>
+    <w:lvl w:ilvl="4" w:tentative="1">
+      <w:start w:val="1"/>
+      <w:numFmt w:val="decimal"/>
+      <w:lvlText w:val="%5."/>
+      <w:lvlJc w:val="left"/>
+      <w:pPr>
+        <w:tabs>
+          <w:tab w:val="num" w:pos="3600"/>
+        </w:tabs>
+        <w:ind w:left="3600" w:hanging="360"/>
+      </w:pPr>
+    </w:lvl>
+    <w:lvl w:ilvl="5" w:tentative="1">
+      <w:start w:val="1"/>
+      <w:numFmt w:val="decimal"/>
+      <w:lvlText w:val="%6."/>
+      <w:lvlJc w:val="left"/>
+      <w:pPr>
+        <w:tabs>
+          <w:tab w:val="num" w:pos="4320"/>
+        </w:tabs>
+        <w:ind w:left="4320" w:hanging="360"/>
+      </w:pPr>
+    </w:lvl>
+    <w:lvl w:ilvl="6" w:tentative="1">
+      <w:start w:val="1"/>
+      <w:numFmt w:val="decimal"/>
+      <w:lvlText w:val="%7."/>
+      <w:lvlJc w:val="left"/>
+      <w:pPr>
+        <w:tabs>
+          <w:tab w:val="num" w:pos="5040"/>
+        </w:tabs>
+        <w:ind w:left="5040" w:hanging="360"/>
+      </w:pPr>
+    </w:lvl>
+    <w:lvl w:ilvl="7" w:tentative="1">
+      <w:start w:val="1"/>
+      <w:numFmt w:val="decimal"/>
+      <w:lvlText w:val="%8."/>
+      <w:lvlJc w:val="left"/>
+      <w:pPr>
+        <w:tabs>
+          <w:tab w:val="num" w:pos="5760"/>
+        </w:tabs>
+        <w:ind w:left="5760" w:hanging="360"/>
+      </w:pPr>
+    </w:lvl>
+    <w:lvl w:ilvl="8" w:tentative="1">
+      <w:start w:val="1"/>
+      <w:numFmt w:val="decimal"/>
+      <w:lvlText w:val="%9."/>
+      <w:lvlJc w:val="left"/>
+      <w:pPr>
+        <w:tabs>
+          <w:tab w:val="num" w:pos="6480"/>
+        </w:tabs>
+        <w:ind w:left="6480" w:hanging="360"/>
+      </w:pPr>
+    </w:lvl>
+  </w:abstractNum>
+  <w:abstractNum w:abstractNumId="4" w15:restartNumberingAfterBreak="0">
     <w:nsid w:val="1C6B6E88"/>
     <w:multiLevelType w:val="multilevel"/>
     <w:tmpl w:val="5E28C30C"/>
@@ -4116,7 +5370,156 @@
       </w:pPr>
     </w:lvl>
   </w:abstractNum>
-  <w:abstractNum w:abstractNumId="2" w15:restartNumberingAfterBreak="0">
+  <w:abstractNum w:abstractNumId="5" w15:restartNumberingAfterBreak="0">
+    <w:nsid w:val="26F54020"/>
+    <w:multiLevelType w:val="multilevel"/>
+    <w:tmpl w:val="7BB68CE8"/>
+    <w:lvl w:ilvl="0">
+      <w:start w:val="1"/>
+      <w:numFmt w:val="bullet"/>
+      <w:lvlText w:val=""/>
+      <w:lvlJc w:val="left"/>
+      <w:pPr>
+        <w:tabs>
+          <w:tab w:val="num" w:pos="720"/>
+        </w:tabs>
+        <w:ind w:left="720" w:hanging="360"/>
+      </w:pPr>
+      <w:rPr>
+        <w:rFonts w:ascii="Symbol" w:hAnsi="Symbol" w:hint="default"/>
+        <w:sz w:val="20"/>
+      </w:rPr>
+    </w:lvl>
+    <w:lvl w:ilvl="1" w:tentative="1">
+      <w:start w:val="1"/>
+      <w:numFmt w:val="bullet"/>
+      <w:lvlText w:val="o"/>
+      <w:lvlJc w:val="left"/>
+      <w:pPr>
+        <w:tabs>
+          <w:tab w:val="num" w:pos="1440"/>
+        </w:tabs>
+        <w:ind w:left="1440" w:hanging="360"/>
+      </w:pPr>
+      <w:rPr>
+        <w:rFonts w:ascii="Courier New" w:hAnsi="Courier New" w:hint="default"/>
+        <w:sz w:val="20"/>
+      </w:rPr>
+    </w:lvl>
+    <w:lvl w:ilvl="2" w:tentative="1">
+      <w:start w:val="1"/>
+      <w:numFmt w:val="bullet"/>
+      <w:lvlText w:val=""/>
+      <w:lvlJc w:val="left"/>
+      <w:pPr>
+        <w:tabs>
+          <w:tab w:val="num" w:pos="2160"/>
+        </w:tabs>
+        <w:ind w:left="2160" w:hanging="360"/>
+      </w:pPr>
+      <w:rPr>
+        <w:rFonts w:ascii="Wingdings" w:hAnsi="Wingdings" w:hint="default"/>
+        <w:sz w:val="20"/>
+      </w:rPr>
+    </w:lvl>
+    <w:lvl w:ilvl="3" w:tentative="1">
+      <w:start w:val="1"/>
+      <w:numFmt w:val="bullet"/>
+      <w:lvlText w:val=""/>
+      <w:lvlJc w:val="left"/>
+      <w:pPr>
+        <w:tabs>
+          <w:tab w:val="num" w:pos="2880"/>
+        </w:tabs>
+        <w:ind w:left="2880" w:hanging="360"/>
+      </w:pPr>
+      <w:rPr>
+        <w:rFonts w:ascii="Wingdings" w:hAnsi="Wingdings" w:hint="default"/>
+        <w:sz w:val="20"/>
+      </w:rPr>
+    </w:lvl>
+    <w:lvl w:ilvl="4" w:tentative="1">
+      <w:start w:val="1"/>
+      <w:numFmt w:val="bullet"/>
+      <w:lvlText w:val=""/>
+      <w:lvlJc w:val="left"/>
+      <w:pPr>
+        <w:tabs>
+          <w:tab w:val="num" w:pos="3600"/>
+        </w:tabs>
+        <w:ind w:left="3600" w:hanging="360"/>
+      </w:pPr>
+      <w:rPr>
+        <w:rFonts w:ascii="Wingdings" w:hAnsi="Wingdings" w:hint="default"/>
+        <w:sz w:val="20"/>
+      </w:rPr>
+    </w:lvl>
+    <w:lvl w:ilvl="5" w:tentative="1">
+      <w:start w:val="1"/>
+      <w:numFmt w:val="bullet"/>
+      <w:lvlText w:val=""/>
+      <w:lvlJc w:val="left"/>
+      <w:pPr>
+        <w:tabs>
+          <w:tab w:val="num" w:pos="4320"/>
+        </w:tabs>
+        <w:ind w:left="4320" w:hanging="360"/>
+      </w:pPr>
+      <w:rPr>
+        <w:rFonts w:ascii="Wingdings" w:hAnsi="Wingdings" w:hint="default"/>
+        <w:sz w:val="20"/>
+      </w:rPr>
+    </w:lvl>
+    <w:lvl w:ilvl="6" w:tentative="1">
+      <w:start w:val="1"/>
+      <w:numFmt w:val="bullet"/>
+      <w:lvlText w:val=""/>
+      <w:lvlJc w:val="left"/>
+      <w:pPr>
+        <w:tabs>
+          <w:tab w:val="num" w:pos="5040"/>
+        </w:tabs>
+        <w:ind w:left="5040" w:hanging="360"/>
+      </w:pPr>
+      <w:rPr>
+        <w:rFonts w:ascii="Wingdings" w:hAnsi="Wingdings" w:hint="default"/>
+        <w:sz w:val="20"/>
+      </w:rPr>
+    </w:lvl>
+    <w:lvl w:ilvl="7" w:tentative="1">
+      <w:start w:val="1"/>
+      <w:numFmt w:val="bullet"/>
+      <w:lvlText w:val=""/>
+      <w:lvlJc w:val="left"/>
+      <w:pPr>
+        <w:tabs>
+          <w:tab w:val="num" w:pos="5760"/>
+        </w:tabs>
+        <w:ind w:left="5760" w:hanging="360"/>
+      </w:pPr>
+      <w:rPr>
+        <w:rFonts w:ascii="Wingdings" w:hAnsi="Wingdings" w:hint="default"/>
+        <w:sz w:val="20"/>
+      </w:rPr>
+    </w:lvl>
+    <w:lvl w:ilvl="8" w:tentative="1">
+      <w:start w:val="1"/>
+      <w:numFmt w:val="bullet"/>
+      <w:lvlText w:val=""/>
+      <w:lvlJc w:val="left"/>
+      <w:pPr>
+        <w:tabs>
+          <w:tab w:val="num" w:pos="6480"/>
+        </w:tabs>
+        <w:ind w:left="6480" w:hanging="360"/>
+      </w:pPr>
+      <w:rPr>
+        <w:rFonts w:ascii="Wingdings" w:hAnsi="Wingdings" w:hint="default"/>
+        <w:sz w:val="20"/>
+      </w:rPr>
+    </w:lvl>
+  </w:abstractNum>
+  <w:abstractNum w:abstractNumId="6" w15:restartNumberingAfterBreak="0">
     <w:nsid w:val="29A9691F"/>
     <w:multiLevelType w:val="multilevel"/>
     <w:tmpl w:val="2CBED9BC"/>
@@ -4265,7 +5668,7 @@
       </w:rPr>
     </w:lvl>
   </w:abstractNum>
-  <w:abstractNum w:abstractNumId="3" w15:restartNumberingAfterBreak="0">
+  <w:abstractNum w:abstractNumId="7" w15:restartNumberingAfterBreak="0">
     <w:nsid w:val="2AE42C38"/>
     <w:multiLevelType w:val="multilevel"/>
     <w:tmpl w:val="1E48F2E8"/>
@@ -4414,7 +5817,7 @@
       </w:rPr>
     </w:lvl>
   </w:abstractNum>
-  <w:abstractNum w:abstractNumId="4" w15:restartNumberingAfterBreak="0">
+  <w:abstractNum w:abstractNumId="8" w15:restartNumberingAfterBreak="0">
     <w:nsid w:val="39A248D8"/>
     <w:multiLevelType w:val="hybridMultilevel"/>
     <w:tmpl w:val="DD661506"/>
@@ -4503,7 +5906,7 @@
       </w:pPr>
     </w:lvl>
   </w:abstractNum>
-  <w:abstractNum w:abstractNumId="5" w15:restartNumberingAfterBreak="0">
+  <w:abstractNum w:abstractNumId="9" w15:restartNumberingAfterBreak="0">
     <w:nsid w:val="39B92A76"/>
     <w:multiLevelType w:val="hybridMultilevel"/>
     <w:tmpl w:val="610216A4"/>
@@ -4616,7 +6019,7 @@
       </w:rPr>
     </w:lvl>
   </w:abstractNum>
-  <w:abstractNum w:abstractNumId="6" w15:restartNumberingAfterBreak="0">
+  <w:abstractNum w:abstractNumId="10" w15:restartNumberingAfterBreak="0">
     <w:nsid w:val="41A477C0"/>
     <w:multiLevelType w:val="multilevel"/>
     <w:tmpl w:val="A226F970"/>
@@ -4729,7 +6132,120 @@
       </w:pPr>
     </w:lvl>
   </w:abstractNum>
-  <w:abstractNum w:abstractNumId="7" w15:restartNumberingAfterBreak="0">
+  <w:abstractNum w:abstractNumId="11" w15:restartNumberingAfterBreak="0">
+    <w:nsid w:val="4675326E"/>
+    <w:multiLevelType w:val="multilevel"/>
+    <w:tmpl w:val="CF3482A0"/>
+    <w:lvl w:ilvl="0">
+      <w:start w:val="1"/>
+      <w:numFmt w:val="decimal"/>
+      <w:lvlText w:val="%1."/>
+      <w:lvlJc w:val="left"/>
+      <w:pPr>
+        <w:tabs>
+          <w:tab w:val="num" w:pos="720"/>
+        </w:tabs>
+        <w:ind w:left="720" w:hanging="360"/>
+      </w:pPr>
+    </w:lvl>
+    <w:lvl w:ilvl="1" w:tentative="1">
+      <w:start w:val="1"/>
+      <w:numFmt w:val="decimal"/>
+      <w:lvlText w:val="%2."/>
+      <w:lvlJc w:val="left"/>
+      <w:pPr>
+        <w:tabs>
+          <w:tab w:val="num" w:pos="1440"/>
+        </w:tabs>
+        <w:ind w:left="1440" w:hanging="360"/>
+      </w:pPr>
+    </w:lvl>
+    <w:lvl w:ilvl="2" w:tentative="1">
+      <w:start w:val="1"/>
+      <w:numFmt w:val="decimal"/>
+      <w:lvlText w:val="%3."/>
+      <w:lvlJc w:val="left"/>
+      <w:pPr>
+        <w:tabs>
+          <w:tab w:val="num" w:pos="2160"/>
+        </w:tabs>
+        <w:ind w:left="2160" w:hanging="360"/>
+      </w:pPr>
+    </w:lvl>
+    <w:lvl w:ilvl="3" w:tentative="1">
+      <w:start w:val="1"/>
+      <w:numFmt w:val="decimal"/>
+      <w:lvlText w:val="%4."/>
+      <w:lvlJc w:val="left"/>
+      <w:pPr>
+        <w:tabs>
+          <w:tab w:val="num" w:pos="2880"/>
+        </w:tabs>
+        <w:ind w:left="2880" w:hanging="360"/>
+      </w:pPr>
+    </w:lvl>
+    <w:lvl w:ilvl="4" w:tentative="1">
+      <w:start w:val="1"/>
+      <w:numFmt w:val="decimal"/>
+      <w:lvlText w:val="%5."/>
+      <w:lvlJc w:val="left"/>
+      <w:pPr>
+        <w:tabs>
+          <w:tab w:val="num" w:pos="3600"/>
+        </w:tabs>
+        <w:ind w:left="3600" w:hanging="360"/>
+      </w:pPr>
+    </w:lvl>
+    <w:lvl w:ilvl="5" w:tentative="1">
+      <w:start w:val="1"/>
+      <w:numFmt w:val="decimal"/>
+      <w:lvlText w:val="%6."/>
+      <w:lvlJc w:val="left"/>
+      <w:pPr>
+        <w:tabs>
+          <w:tab w:val="num" w:pos="4320"/>
+        </w:tabs>
+        <w:ind w:left="4320" w:hanging="360"/>
+      </w:pPr>
+    </w:lvl>
+    <w:lvl w:ilvl="6" w:tentative="1">
+      <w:start w:val="1"/>
+      <w:numFmt w:val="decimal"/>
+      <w:lvlText w:val="%7."/>
+      <w:lvlJc w:val="left"/>
+      <w:pPr>
+        <w:tabs>
+          <w:tab w:val="num" w:pos="5040"/>
+        </w:tabs>
+        <w:ind w:left="5040" w:hanging="360"/>
+      </w:pPr>
+    </w:lvl>
+    <w:lvl w:ilvl="7" w:tentative="1">
+      <w:start w:val="1"/>
+      <w:numFmt w:val="decimal"/>
+      <w:lvlText w:val="%8."/>
+      <w:lvlJc w:val="left"/>
+      <w:pPr>
+        <w:tabs>
+          <w:tab w:val="num" w:pos="5760"/>
+        </w:tabs>
+        <w:ind w:left="5760" w:hanging="360"/>
+      </w:pPr>
+    </w:lvl>
+    <w:lvl w:ilvl="8" w:tentative="1">
+      <w:start w:val="1"/>
+      <w:numFmt w:val="decimal"/>
+      <w:lvlText w:val="%9."/>
+      <w:lvlJc w:val="left"/>
+      <w:pPr>
+        <w:tabs>
+          <w:tab w:val="num" w:pos="6480"/>
+        </w:tabs>
+        <w:ind w:left="6480" w:hanging="360"/>
+      </w:pPr>
+    </w:lvl>
+  </w:abstractNum>
+  <w:abstractNum w:abstractNumId="12" w15:restartNumberingAfterBreak="0">
     <w:nsid w:val="53175136"/>
     <w:multiLevelType w:val="multilevel"/>
     <w:tmpl w:val="9E7EDC70"/>
@@ -4878,7 +6394,7 @@
       </w:rPr>
     </w:lvl>
   </w:abstractNum>
-  <w:abstractNum w:abstractNumId="8" w15:restartNumberingAfterBreak="0">
+  <w:abstractNum w:abstractNumId="13" w15:restartNumberingAfterBreak="0">
     <w:nsid w:val="5B4232EC"/>
     <w:multiLevelType w:val="multilevel"/>
     <w:tmpl w:val="A6349EA4"/>
@@ -4991,7 +6507,7 @@
       </w:pPr>
     </w:lvl>
   </w:abstractNum>
-  <w:abstractNum w:abstractNumId="9" w15:restartNumberingAfterBreak="0">
+  <w:abstractNum w:abstractNumId="14" w15:restartNumberingAfterBreak="0">
     <w:nsid w:val="656C3C3C"/>
     <w:multiLevelType w:val="multilevel"/>
     <w:tmpl w:val="033EB9B2"/>
@@ -5140,7 +6656,7 @@
       </w:rPr>
     </w:lvl>
   </w:abstractNum>
-  <w:abstractNum w:abstractNumId="10" w15:restartNumberingAfterBreak="0">
+  <w:abstractNum w:abstractNumId="15" w15:restartNumberingAfterBreak="0">
     <w:nsid w:val="7AA679AC"/>
     <w:multiLevelType w:val="multilevel"/>
     <w:tmpl w:val="33D861B8"/>
@@ -5289,7 +6805,7 @@
       </w:rPr>
     </w:lvl>
   </w:abstractNum>
-  <w:abstractNum w:abstractNumId="11" w15:restartNumberingAfterBreak="0">
+  <w:abstractNum w:abstractNumId="16" w15:restartNumberingAfterBreak="0">
     <w:nsid w:val="7D5F7C98"/>
     <w:multiLevelType w:val="multilevel"/>
     <w:tmpl w:val="685C1D94"/>
@@ -5438,7 +6954,7 @@
       </w:rPr>
     </w:lvl>
   </w:abstractNum>
-  <w:abstractNum w:abstractNumId="12" w15:restartNumberingAfterBreak="0">
+  <w:abstractNum w:abstractNumId="17" w15:restartNumberingAfterBreak="0">
     <w:nsid w:val="7EC76F80"/>
     <w:multiLevelType w:val="hybridMultilevel"/>
     <w:tmpl w:val="3146ACB6"/>
@@ -5528,43 +7044,58 @@
     </w:lvl>
   </w:abstractNum>
   <w:num w:numId="1" w16cid:durableId="1213882121">
+    <w:abstractNumId w:val="6"/>
+  </w:num>
+  <w:num w:numId="2" w16cid:durableId="1598636461">
+    <w:abstractNumId w:val="1"/>
+  </w:num>
+  <w:num w:numId="3" w16cid:durableId="872964064">
+    <w:abstractNumId w:val="13"/>
+  </w:num>
+  <w:num w:numId="4" w16cid:durableId="1608266724">
+    <w:abstractNumId w:val="10"/>
+  </w:num>
+  <w:num w:numId="5" w16cid:durableId="783423473">
+    <w:abstractNumId w:val="15"/>
+  </w:num>
+  <w:num w:numId="6" w16cid:durableId="868566141">
+    <w:abstractNumId w:val="14"/>
+  </w:num>
+  <w:num w:numId="7" w16cid:durableId="1005132898">
+    <w:abstractNumId w:val="7"/>
+  </w:num>
+  <w:num w:numId="8" w16cid:durableId="347365037">
+    <w:abstractNumId w:val="16"/>
+  </w:num>
+  <w:num w:numId="9" w16cid:durableId="940262862">
+    <w:abstractNumId w:val="12"/>
+  </w:num>
+  <w:num w:numId="10" w16cid:durableId="347876689">
+    <w:abstractNumId w:val="4"/>
+  </w:num>
+  <w:num w:numId="11" w16cid:durableId="280041942">
+    <w:abstractNumId w:val="8"/>
+  </w:num>
+  <w:num w:numId="12" w16cid:durableId="464278432">
+    <w:abstractNumId w:val="17"/>
+  </w:num>
+  <w:num w:numId="13" w16cid:durableId="2034375532">
+    <w:abstractNumId w:val="9"/>
+  </w:num>
+  <w:num w:numId="14" w16cid:durableId="42873681">
+    <w:abstractNumId w:val="5"/>
+  </w:num>
+  <w:num w:numId="15" w16cid:durableId="2060550043">
+    <w:abstractNumId w:val="3"/>
+  </w:num>
+  <w:num w:numId="16" w16cid:durableId="259340351">
     <w:abstractNumId w:val="2"/>
   </w:num>
-  <w:num w:numId="2" w16cid:durableId="1598636461">
-    <w:abstractNumId w:val="0"/>
-  </w:num>
-  <w:num w:numId="3" w16cid:durableId="872964064">
-    <w:abstractNumId w:val="8"/>
-  </w:num>
-  <w:num w:numId="4" w16cid:durableId="1608266724">
-    <w:abstractNumId w:val="6"/>
-  </w:num>
-  <w:num w:numId="5" w16cid:durableId="783423473">
-    <w:abstractNumId w:val="10"/>
-  </w:num>
-  <w:num w:numId="6" w16cid:durableId="868566141">
-    <w:abstractNumId w:val="9"/>
-  </w:num>
-  <w:num w:numId="7" w16cid:durableId="1005132898">
-    <w:abstractNumId w:val="3"/>
-  </w:num>
-  <w:num w:numId="8" w16cid:durableId="347365037">
+  <w:num w:numId="17" w16cid:durableId="1525678916">
     <w:abstractNumId w:val="11"/>
   </w:num>
-  <w:num w:numId="9" w16cid:durableId="940262862">
-    <w:abstractNumId w:val="7"/>
-  </w:num>
-  <w:num w:numId="10" w16cid:durableId="347876689">
-    <w:abstractNumId w:val="1"/>
-  </w:num>
-  <w:num w:numId="11" w16cid:durableId="280041942">
-    <w:abstractNumId w:val="4"/>
-  </w:num>
-  <w:num w:numId="12" w16cid:durableId="464278432">
-    <w:abstractNumId w:val="12"/>
-  </w:num>
-  <w:num w:numId="13" w16cid:durableId="2034375532">
-    <w:abstractNumId w:val="5"/>
+  <w:num w:numId="18" w16cid:durableId="1034842277">
+    <w:abstractNumId w:val="0"/>
   </w:num>
 </w:numbering>
 </file>
@@ -6173,7 +7704,6 @@
   <w:style w:type="character" w:default="1" w:styleId="DefaultParagraphFont">
     <w:name w:val="Default Paragraph Font"/>
     <w:uiPriority w:val="1"/>
-    <w:semiHidden/>
     <w:unhideWhenUsed/>
   </w:style>
   <w:style w:type="table" w:default="1" w:styleId="TableNormal">
@@ -6531,6 +8061,29 @@
     <w:uiPriority w:val="99"/>
     <w:rsid w:val="00305C6F"/>
   </w:style>
+  <w:style w:type="character" w:styleId="Hyperlink">
+    <w:name w:val="Hyperlink"/>
+    <w:basedOn w:val="DefaultParagraphFont"/>
+    <w:uiPriority w:val="99"/>
+    <w:unhideWhenUsed/>
+    <w:rsid w:val="00BA5469"/>
+    <w:rPr>
+      <w:color w:val="467886" w:themeColor="hyperlink"/>
+      <w:u w:val="single"/>
+    </w:rPr>
+  </w:style>
+  <w:style w:type="character" w:styleId="UnresolvedMention">
+    <w:name w:val="Unresolved Mention"/>
+    <w:basedOn w:val="DefaultParagraphFont"/>
+    <w:uiPriority w:val="99"/>
+    <w:semiHidden/>
+    <w:unhideWhenUsed/>
+    <w:rsid w:val="00BA5469"/>
+    <w:rPr>
+      <w:color w:val="605E5C"/>
+      <w:shd w:val="clear" w:color="auto" w:fill="E1DFDD"/>
+    </w:rPr>
+  </w:style>
 </w:styles>
 </file>
 

</xml_diff>